<commit_message>
Dodal kodo za Cone graf
</commit_message>
<xml_diff>
--- a/Fšfebr2026_odrasli.docx
+++ b/Fšfebr2026_odrasli.docx
@@ -696,6 +696,55 @@
         </w:drawing>
       </w:r>
     </w:p>
+    <w:p>
+      <w:r>
+        <w:br w:type="page"/>
+      </w:r>
+    </w:p>
+    <w:p>
+      <w:pPr>
+        <w:pStyle w:val="Heading2"/>
+      </w:pPr>
+      <w:r>
+        <w:t>Delež mejnih in tveganih rezultatov po testih</w:t>
+      </w:r>
+    </w:p>
+    <w:p>
+      <w:r>
+        <w:drawing>
+          <wp:inline xmlns:a="http://schemas.openxmlformats.org/drawingml/2006/main" xmlns:pic="http://schemas.openxmlformats.org/drawingml/2006/picture">
+            <wp:extent cx="5486400" cy="2743200"/>
+            <wp:docPr id="2" name="Picture 2"/>
+            <wp:cNvGraphicFramePr>
+              <a:graphicFrameLocks noChangeAspect="1"/>
+            </wp:cNvGraphicFramePr>
+            <a:graphic>
+              <a:graphicData uri="http://schemas.openxmlformats.org/drawingml/2006/picture">
+                <pic:pic>
+                  <pic:nvPicPr>
+                    <pic:cNvPr id="0" name="graf_cone.png"/>
+                    <pic:cNvPicPr/>
+                  </pic:nvPicPr>
+                  <pic:blipFill>
+                    <a:blip r:embed="rId10"/>
+                    <a:stretch>
+                      <a:fillRect/>
+                    </a:stretch>
+                  </pic:blipFill>
+                  <pic:spPr>
+                    <a:xfrm>
+                      <a:off x="0" y="0"/>
+                      <a:ext cx="5486400" cy="2743200"/>
+                    </a:xfrm>
+                    <a:prstGeom prst="rect"/>
+                  </pic:spPr>
+                </pic:pic>
+              </a:graphicData>
+            </a:graphic>
+          </wp:inline>
+        </w:drawing>
+      </w:r>
+    </w:p>
     <w:sectPr>
       <w:pgSz w:w="12240" w:h="15840"/>
       <w:pgMar w:top="1440" w:right="1800" w:bottom="1440" w:left="1800" w:header="720" w:footer="720" w:gutter="0"/>

</xml_diff>

<commit_message>
Dodal število moških, število žensk in povprečno starost na 1. stran, razvrstil vrstice v tabelah in stolpce v grafu glede na dogovorjen vrstni red.
</commit_message>
<xml_diff>
--- a/Fšfebr2026_odrasli.docx
+++ b/Fšfebr2026_odrasli.docx
@@ -52,7 +52,27 @@
     </w:p>
     <w:p>
       <w:r>
-        <w:t>Število udeležencev ZV: 18</w:t>
+        <w:t>Število udeležencev ZV: 30</w:t>
+      </w:r>
+    </w:p>
+    <w:p>
+      <w:r>
+        <w:t>Kraj meritev: Gortanova 22, 1000 Ljubljana</w:t>
+      </w:r>
+    </w:p>
+    <w:p>
+      <w:r>
+        <w:t>Povprečna starost: 49,9</w:t>
+      </w:r>
+    </w:p>
+    <w:p>
+      <w:r>
+        <w:t>Število moških: 9</w:t>
+      </w:r>
+    </w:p>
+    <w:p>
+      <w:r>
+        <w:t>Število žensk: 21</w:t>
       </w:r>
     </w:p>
     <w:p/>
@@ -151,49 +171,49 @@
               <w:jc w:val="left"/>
             </w:pPr>
             <w:r>
-              <w:t>6-minutni test hoje</w:t>
-            </w:r>
-          </w:p>
-        </w:tc>
-        <w:tc>
-          <w:tcPr>
-            <w:tcW w:type="dxa" w:w="1728"/>
-          </w:tcPr>
-          <w:p>
-            <w:pPr>
-              <w:keepLines/>
-              <w:jc w:val="center"/>
-            </w:pPr>
-            <w:r>
-              <w:t>36.9</w:t>
-            </w:r>
-          </w:p>
-        </w:tc>
-        <w:tc>
-          <w:tcPr>
-            <w:tcW w:type="dxa" w:w="1728"/>
-          </w:tcPr>
-          <w:p>
-            <w:pPr>
-              <w:keepLines/>
-              <w:jc w:val="center"/>
-            </w:pPr>
-            <w:r>
-              <w:t>43.5</w:t>
-            </w:r>
-          </w:p>
-        </w:tc>
-        <w:tc>
-          <w:tcPr>
-            <w:tcW w:type="dxa" w:w="1728"/>
-          </w:tcPr>
-          <w:p>
-            <w:pPr>
-              <w:keepLines/>
-              <w:jc w:val="center"/>
-            </w:pPr>
-            <w:r>
-              <w:t>44.2</w:t>
+              <w:t>Telesna višina</w:t>
+            </w:r>
+          </w:p>
+        </w:tc>
+        <w:tc>
+          <w:tcPr>
+            <w:tcW w:type="dxa" w:w="1728"/>
+          </w:tcPr>
+          <w:p>
+            <w:pPr>
+              <w:keepLines/>
+              <w:jc w:val="center"/>
+            </w:pPr>
+            <w:r>
+              <w:t>55.8</w:t>
+            </w:r>
+          </w:p>
+        </w:tc>
+        <w:tc>
+          <w:tcPr>
+            <w:tcW w:type="dxa" w:w="1728"/>
+          </w:tcPr>
+          <w:p>
+            <w:pPr>
+              <w:keepLines/>
+              <w:jc w:val="center"/>
+            </w:pPr>
+            <w:r>
+              <w:t>59.7</w:t>
+            </w:r>
+          </w:p>
+        </w:tc>
+        <w:tc>
+          <w:tcPr>
+            <w:tcW w:type="dxa" w:w="1728"/>
+          </w:tcPr>
+          <w:p>
+            <w:pPr>
+              <w:keepLines/>
+              <w:jc w:val="center"/>
+            </w:pPr>
+            <w:r>
+              <w:t>60.0</w:t>
             </w:r>
           </w:p>
         </w:tc>
@@ -209,49 +229,49 @@
               <w:jc w:val="left"/>
             </w:pPr>
             <w:r>
-              <w:t>Dotikanje plošč z roko</w:t>
-            </w:r>
-          </w:p>
-        </w:tc>
-        <w:tc>
-          <w:tcPr>
-            <w:tcW w:type="dxa" w:w="1728"/>
-          </w:tcPr>
-          <w:p>
-            <w:pPr>
-              <w:keepLines/>
-              <w:jc w:val="center"/>
-            </w:pPr>
-            <w:r>
-              <w:t>58.2</w:t>
-            </w:r>
-          </w:p>
-        </w:tc>
-        <w:tc>
-          <w:tcPr>
-            <w:tcW w:type="dxa" w:w="1728"/>
-          </w:tcPr>
-          <w:p>
-            <w:pPr>
-              <w:keepLines/>
-              <w:jc w:val="center"/>
-            </w:pPr>
-            <w:r>
-              <w:t>66.7</w:t>
-            </w:r>
-          </w:p>
-        </w:tc>
-        <w:tc>
-          <w:tcPr>
-            <w:tcW w:type="dxa" w:w="1728"/>
-          </w:tcPr>
-          <w:p>
-            <w:pPr>
-              <w:keepLines/>
-              <w:jc w:val="center"/>
-            </w:pPr>
-            <w:r>
-              <w:t>66.6</w:t>
+              <w:t>Telesna masa</w:t>
+            </w:r>
+          </w:p>
+        </w:tc>
+        <w:tc>
+          <w:tcPr>
+            <w:tcW w:type="dxa" w:w="1728"/>
+          </w:tcPr>
+          <w:p>
+            <w:pPr>
+              <w:keepLines/>
+              <w:jc w:val="center"/>
+            </w:pPr>
+            <w:r>
+              <w:t>56.9</w:t>
+            </w:r>
+          </w:p>
+        </w:tc>
+        <w:tc>
+          <w:tcPr>
+            <w:tcW w:type="dxa" w:w="1728"/>
+          </w:tcPr>
+          <w:p>
+            <w:pPr>
+              <w:keepLines/>
+              <w:jc w:val="center"/>
+            </w:pPr>
+            <w:r>
+              <w:t>46.4</w:t>
+            </w:r>
+          </w:p>
+        </w:tc>
+        <w:tc>
+          <w:tcPr>
+            <w:tcW w:type="dxa" w:w="1728"/>
+          </w:tcPr>
+          <w:p>
+            <w:pPr>
+              <w:keepLines/>
+              <w:jc w:val="center"/>
+            </w:pPr>
+            <w:r>
+              <w:t>48.1</w:t>
             </w:r>
           </w:p>
         </w:tc>
@@ -325,49 +345,49 @@
               <w:jc w:val="left"/>
             </w:pPr>
             <w:r>
-              <w:t>Navpični skok</w:t>
-            </w:r>
-          </w:p>
-        </w:tc>
-        <w:tc>
-          <w:tcPr>
-            <w:tcW w:type="dxa" w:w="1728"/>
-          </w:tcPr>
-          <w:p>
-            <w:pPr>
-              <w:keepLines/>
-              <w:jc w:val="center"/>
-            </w:pPr>
-            <w:r>
-              <w:t>36.6</w:t>
-            </w:r>
-          </w:p>
-        </w:tc>
-        <w:tc>
-          <w:tcPr>
-            <w:tcW w:type="dxa" w:w="1728"/>
-          </w:tcPr>
-          <w:p>
-            <w:pPr>
-              <w:keepLines/>
-              <w:jc w:val="center"/>
-            </w:pPr>
-            <w:r>
-              <w:t>53.7</w:t>
-            </w:r>
-          </w:p>
-        </w:tc>
-        <w:tc>
-          <w:tcPr>
-            <w:tcW w:type="dxa" w:w="1728"/>
-          </w:tcPr>
-          <w:p>
-            <w:pPr>
-              <w:keepLines/>
-              <w:jc w:val="center"/>
-            </w:pPr>
-            <w:r>
-              <w:t>53.9</w:t>
+              <w:t>Obseg pasu</w:t>
+            </w:r>
+          </w:p>
+        </w:tc>
+        <w:tc>
+          <w:tcPr>
+            <w:tcW w:type="dxa" w:w="1728"/>
+          </w:tcPr>
+          <w:p>
+            <w:pPr>
+              <w:keepLines/>
+              <w:jc w:val="center"/>
+            </w:pPr>
+            <w:r>
+              <w:t>45.5</w:t>
+            </w:r>
+          </w:p>
+        </w:tc>
+        <w:tc>
+          <w:tcPr>
+            <w:tcW w:type="dxa" w:w="1728"/>
+          </w:tcPr>
+          <w:p>
+            <w:pPr>
+              <w:keepLines/>
+              <w:jc w:val="center"/>
+            </w:pPr>
+            <w:r>
+              <w:t>32.2</w:t>
+            </w:r>
+          </w:p>
+        </w:tc>
+        <w:tc>
+          <w:tcPr>
+            <w:tcW w:type="dxa" w:w="1728"/>
+          </w:tcPr>
+          <w:p>
+            <w:pPr>
+              <w:keepLines/>
+              <w:jc w:val="center"/>
+            </w:pPr>
+            <w:r>
+              <w:t>33.6</w:t>
             </w:r>
           </w:p>
         </w:tc>
@@ -383,49 +403,49 @@
               <w:jc w:val="left"/>
             </w:pPr>
             <w:r>
-              <w:t>Obseg pasu</w:t>
-            </w:r>
-          </w:p>
-        </w:tc>
-        <w:tc>
-          <w:tcPr>
-            <w:tcW w:type="dxa" w:w="1728"/>
-          </w:tcPr>
-          <w:p>
-            <w:pPr>
-              <w:keepLines/>
-              <w:jc w:val="center"/>
-            </w:pPr>
-            <w:r>
-              <w:t>45.5</w:t>
-            </w:r>
-          </w:p>
-        </w:tc>
-        <w:tc>
-          <w:tcPr>
-            <w:tcW w:type="dxa" w:w="1728"/>
-          </w:tcPr>
-          <w:p>
-            <w:pPr>
-              <w:keepLines/>
-              <w:jc w:val="center"/>
-            </w:pPr>
-            <w:r>
-              <w:t>32.2</w:t>
-            </w:r>
-          </w:p>
-        </w:tc>
-        <w:tc>
-          <w:tcPr>
-            <w:tcW w:type="dxa" w:w="1728"/>
-          </w:tcPr>
-          <w:p>
-            <w:pPr>
-              <w:keepLines/>
-              <w:jc w:val="center"/>
-            </w:pPr>
-            <w:r>
-              <w:t>33.6</w:t>
+              <w:t>Dotikanje plošč z roko</w:t>
+            </w:r>
+          </w:p>
+        </w:tc>
+        <w:tc>
+          <w:tcPr>
+            <w:tcW w:type="dxa" w:w="1728"/>
+          </w:tcPr>
+          <w:p>
+            <w:pPr>
+              <w:keepLines/>
+              <w:jc w:val="center"/>
+            </w:pPr>
+            <w:r>
+              <w:t>58.2</w:t>
+            </w:r>
+          </w:p>
+        </w:tc>
+        <w:tc>
+          <w:tcPr>
+            <w:tcW w:type="dxa" w:w="1728"/>
+          </w:tcPr>
+          <w:p>
+            <w:pPr>
+              <w:keepLines/>
+              <w:jc w:val="center"/>
+            </w:pPr>
+            <w:r>
+              <w:t>66.7</w:t>
+            </w:r>
+          </w:p>
+        </w:tc>
+        <w:tc>
+          <w:tcPr>
+            <w:tcW w:type="dxa" w:w="1728"/>
+          </w:tcPr>
+          <w:p>
+            <w:pPr>
+              <w:keepLines/>
+              <w:jc w:val="center"/>
+            </w:pPr>
+            <w:r>
+              <w:t>66.6</w:t>
             </w:r>
           </w:p>
         </w:tc>
@@ -441,49 +461,49 @@
               <w:jc w:val="left"/>
             </w:pPr>
             <w:r>
-              <w:t>Predklon sede</w:t>
-            </w:r>
-          </w:p>
-        </w:tc>
-        <w:tc>
-          <w:tcPr>
-            <w:tcW w:type="dxa" w:w="1728"/>
-          </w:tcPr>
-          <w:p>
-            <w:pPr>
-              <w:keepLines/>
-              <w:jc w:val="center"/>
-            </w:pPr>
-            <w:r>
-              <w:t>32.4</w:t>
-            </w:r>
-          </w:p>
-        </w:tc>
-        <w:tc>
-          <w:tcPr>
-            <w:tcW w:type="dxa" w:w="1728"/>
-          </w:tcPr>
-          <w:p>
-            <w:pPr>
-              <w:keepLines/>
-              <w:jc w:val="center"/>
-            </w:pPr>
-            <w:r>
-              <w:t>43.4</w:t>
-            </w:r>
-          </w:p>
-        </w:tc>
-        <w:tc>
-          <w:tcPr>
-            <w:tcW w:type="dxa" w:w="1728"/>
-          </w:tcPr>
-          <w:p>
-            <w:pPr>
-              <w:keepLines/>
-              <w:jc w:val="center"/>
-            </w:pPr>
-            <w:r>
-              <w:t>42.1</w:t>
+              <w:t>Navpični skok</w:t>
+            </w:r>
+          </w:p>
+        </w:tc>
+        <w:tc>
+          <w:tcPr>
+            <w:tcW w:type="dxa" w:w="1728"/>
+          </w:tcPr>
+          <w:p>
+            <w:pPr>
+              <w:keepLines/>
+              <w:jc w:val="center"/>
+            </w:pPr>
+            <w:r>
+              <w:t>36.6</w:t>
+            </w:r>
+          </w:p>
+        </w:tc>
+        <w:tc>
+          <w:tcPr>
+            <w:tcW w:type="dxa" w:w="1728"/>
+          </w:tcPr>
+          <w:p>
+            <w:pPr>
+              <w:keepLines/>
+              <w:jc w:val="center"/>
+            </w:pPr>
+            <w:r>
+              <w:t>53.7</w:t>
+            </w:r>
+          </w:p>
+        </w:tc>
+        <w:tc>
+          <w:tcPr>
+            <w:tcW w:type="dxa" w:w="1728"/>
+          </w:tcPr>
+          <w:p>
+            <w:pPr>
+              <w:keepLines/>
+              <w:jc w:val="center"/>
+            </w:pPr>
+            <w:r>
+              <w:t>53.9</w:t>
             </w:r>
           </w:p>
         </w:tc>
@@ -499,49 +519,49 @@
               <w:jc w:val="left"/>
             </w:pPr>
             <w:r>
-              <w:t>Stisk pesti</w:t>
-            </w:r>
-          </w:p>
-        </w:tc>
-        <w:tc>
-          <w:tcPr>
-            <w:tcW w:type="dxa" w:w="1728"/>
-          </w:tcPr>
-          <w:p>
-            <w:pPr>
-              <w:keepLines/>
-              <w:jc w:val="center"/>
-            </w:pPr>
-            <w:r>
-              <w:t>47.1</w:t>
-            </w:r>
-          </w:p>
-        </w:tc>
-        <w:tc>
-          <w:tcPr>
-            <w:tcW w:type="dxa" w:w="1728"/>
-          </w:tcPr>
-          <w:p>
-            <w:pPr>
-              <w:keepLines/>
-              <w:jc w:val="center"/>
-            </w:pPr>
-            <w:r>
-              <w:t>47.6</w:t>
-            </w:r>
-          </w:p>
-        </w:tc>
-        <w:tc>
-          <w:tcPr>
-            <w:tcW w:type="dxa" w:w="1728"/>
-          </w:tcPr>
-          <w:p>
-            <w:pPr>
-              <w:keepLines/>
-              <w:jc w:val="center"/>
-            </w:pPr>
-            <w:r>
-              <w:t>49.4</w:t>
+              <w:t>Tek v osmici</w:t>
+            </w:r>
+          </w:p>
+        </w:tc>
+        <w:tc>
+          <w:tcPr>
+            <w:tcW w:type="dxa" w:w="1728"/>
+          </w:tcPr>
+          <w:p>
+            <w:pPr>
+              <w:keepLines/>
+              <w:jc w:val="center"/>
+            </w:pPr>
+            <w:r>
+              <w:t>34.2</w:t>
+            </w:r>
+          </w:p>
+        </w:tc>
+        <w:tc>
+          <w:tcPr>
+            <w:tcW w:type="dxa" w:w="1728"/>
+          </w:tcPr>
+          <w:p>
+            <w:pPr>
+              <w:keepLines/>
+              <w:jc w:val="center"/>
+            </w:pPr>
+            <w:r>
+              <w:t>51.0</w:t>
+            </w:r>
+          </w:p>
+        </w:tc>
+        <w:tc>
+          <w:tcPr>
+            <w:tcW w:type="dxa" w:w="1728"/>
+          </w:tcPr>
+          <w:p>
+            <w:pPr>
+              <w:keepLines/>
+              <w:jc w:val="center"/>
+            </w:pPr>
+            <w:r>
+              <w:t>50.3</w:t>
             </w:r>
           </w:p>
         </w:tc>
@@ -557,49 +577,49 @@
               <w:jc w:val="left"/>
             </w:pPr>
             <w:r>
-              <w:t>Tek na 600 m</w:t>
-            </w:r>
-          </w:p>
-        </w:tc>
-        <w:tc>
-          <w:tcPr>
-            <w:tcW w:type="dxa" w:w="1728"/>
-          </w:tcPr>
-          <w:p>
-            <w:pPr>
-              <w:keepLines/>
-              <w:jc w:val="center"/>
-            </w:pPr>
-            <w:r>
-              <w:t>19.4</w:t>
-            </w:r>
-          </w:p>
-        </w:tc>
-        <w:tc>
-          <w:tcPr>
-            <w:tcW w:type="dxa" w:w="1728"/>
-          </w:tcPr>
-          <w:p>
-            <w:pPr>
-              <w:keepLines/>
-              <w:jc w:val="center"/>
-            </w:pPr>
-            <w:r>
-              <w:t>45.9</w:t>
-            </w:r>
-          </w:p>
-        </w:tc>
-        <w:tc>
-          <w:tcPr>
-            <w:tcW w:type="dxa" w:w="1728"/>
-          </w:tcPr>
-          <w:p>
-            <w:pPr>
-              <w:keepLines/>
-              <w:jc w:val="center"/>
-            </w:pPr>
-            <w:r>
-              <w:t>45.5</w:t>
+              <w:t>Upogibanje trupa</w:t>
+            </w:r>
+          </w:p>
+        </w:tc>
+        <w:tc>
+          <w:tcPr>
+            <w:tcW w:type="dxa" w:w="1728"/>
+          </w:tcPr>
+          <w:p>
+            <w:pPr>
+              <w:keepLines/>
+              <w:jc w:val="center"/>
+            </w:pPr>
+            <w:r>
+              <w:t>60.0</w:t>
+            </w:r>
+          </w:p>
+        </w:tc>
+        <w:tc>
+          <w:tcPr>
+            <w:tcW w:type="dxa" w:w="1728"/>
+          </w:tcPr>
+          <w:p>
+            <w:pPr>
+              <w:keepLines/>
+              <w:jc w:val="center"/>
+            </w:pPr>
+            <w:r>
+              <w:t>78.6</w:t>
+            </w:r>
+          </w:p>
+        </w:tc>
+        <w:tc>
+          <w:tcPr>
+            <w:tcW w:type="dxa" w:w="1728"/>
+          </w:tcPr>
+          <w:p>
+            <w:pPr>
+              <w:keepLines/>
+              <w:jc w:val="center"/>
+            </w:pPr>
+            <w:r>
+              <w:t>79.4</w:t>
             </w:r>
           </w:p>
         </w:tc>
@@ -615,49 +635,49 @@
               <w:jc w:val="left"/>
             </w:pPr>
             <w:r>
-              <w:t>Tek v osmici</w:t>
-            </w:r>
-          </w:p>
-        </w:tc>
-        <w:tc>
-          <w:tcPr>
-            <w:tcW w:type="dxa" w:w="1728"/>
-          </w:tcPr>
-          <w:p>
-            <w:pPr>
-              <w:keepLines/>
-              <w:jc w:val="center"/>
-            </w:pPr>
-            <w:r>
-              <w:t>34.2</w:t>
-            </w:r>
-          </w:p>
-        </w:tc>
-        <w:tc>
-          <w:tcPr>
-            <w:tcW w:type="dxa" w:w="1728"/>
-          </w:tcPr>
-          <w:p>
-            <w:pPr>
-              <w:keepLines/>
-              <w:jc w:val="center"/>
-            </w:pPr>
-            <w:r>
-              <w:t>51.0</w:t>
-            </w:r>
-          </w:p>
-        </w:tc>
-        <w:tc>
-          <w:tcPr>
-            <w:tcW w:type="dxa" w:w="1728"/>
-          </w:tcPr>
-          <w:p>
-            <w:pPr>
-              <w:keepLines/>
-              <w:jc w:val="center"/>
-            </w:pPr>
-            <w:r>
-              <w:t>50.3</w:t>
+              <w:t>Predklon sede</w:t>
+            </w:r>
+          </w:p>
+        </w:tc>
+        <w:tc>
+          <w:tcPr>
+            <w:tcW w:type="dxa" w:w="1728"/>
+          </w:tcPr>
+          <w:p>
+            <w:pPr>
+              <w:keepLines/>
+              <w:jc w:val="center"/>
+            </w:pPr>
+            <w:r>
+              <w:t>32.4</w:t>
+            </w:r>
+          </w:p>
+        </w:tc>
+        <w:tc>
+          <w:tcPr>
+            <w:tcW w:type="dxa" w:w="1728"/>
+          </w:tcPr>
+          <w:p>
+            <w:pPr>
+              <w:keepLines/>
+              <w:jc w:val="center"/>
+            </w:pPr>
+            <w:r>
+              <w:t>43.4</w:t>
+            </w:r>
+          </w:p>
+        </w:tc>
+        <w:tc>
+          <w:tcPr>
+            <w:tcW w:type="dxa" w:w="1728"/>
+          </w:tcPr>
+          <w:p>
+            <w:pPr>
+              <w:keepLines/>
+              <w:jc w:val="center"/>
+            </w:pPr>
+            <w:r>
+              <w:t>42.1</w:t>
             </w:r>
           </w:p>
         </w:tc>
@@ -673,49 +693,49 @@
               <w:jc w:val="left"/>
             </w:pPr>
             <w:r>
-              <w:t>Telesna masa</w:t>
-            </w:r>
-          </w:p>
-        </w:tc>
-        <w:tc>
-          <w:tcPr>
-            <w:tcW w:type="dxa" w:w="1728"/>
-          </w:tcPr>
-          <w:p>
-            <w:pPr>
-              <w:keepLines/>
-              <w:jc w:val="center"/>
-            </w:pPr>
-            <w:r>
-              <w:t>56.9</w:t>
-            </w:r>
-          </w:p>
-        </w:tc>
-        <w:tc>
-          <w:tcPr>
-            <w:tcW w:type="dxa" w:w="1728"/>
-          </w:tcPr>
-          <w:p>
-            <w:pPr>
-              <w:keepLines/>
-              <w:jc w:val="center"/>
-            </w:pPr>
-            <w:r>
-              <w:t>46.4</w:t>
-            </w:r>
-          </w:p>
-        </w:tc>
-        <w:tc>
-          <w:tcPr>
-            <w:tcW w:type="dxa" w:w="1728"/>
-          </w:tcPr>
-          <w:p>
-            <w:pPr>
-              <w:keepLines/>
-              <w:jc w:val="center"/>
-            </w:pPr>
-            <w:r>
-              <w:t>48.1</w:t>
+              <w:t>Vesa v zgibi</w:t>
+            </w:r>
+          </w:p>
+        </w:tc>
+        <w:tc>
+          <w:tcPr>
+            <w:tcW w:type="dxa" w:w="1728"/>
+          </w:tcPr>
+          <w:p>
+            <w:pPr>
+              <w:keepLines/>
+              <w:jc w:val="center"/>
+            </w:pPr>
+            <w:r>
+              <w:t>26.7</w:t>
+            </w:r>
+          </w:p>
+        </w:tc>
+        <w:tc>
+          <w:tcPr>
+            <w:tcW w:type="dxa" w:w="1728"/>
+          </w:tcPr>
+          <w:p>
+            <w:pPr>
+              <w:keepLines/>
+              <w:jc w:val="center"/>
+            </w:pPr>
+            <w:r>
+              <w:t>55.3</w:t>
+            </w:r>
+          </w:p>
+        </w:tc>
+        <w:tc>
+          <w:tcPr>
+            <w:tcW w:type="dxa" w:w="1728"/>
+          </w:tcPr>
+          <w:p>
+            <w:pPr>
+              <w:keepLines/>
+              <w:jc w:val="center"/>
+            </w:pPr>
+            <w:r>
+              <w:t>54.9</w:t>
             </w:r>
           </w:p>
         </w:tc>
@@ -731,49 +751,49 @@
               <w:jc w:val="left"/>
             </w:pPr>
             <w:r>
-              <w:t>Telesna višina</w:t>
-            </w:r>
-          </w:p>
-        </w:tc>
-        <w:tc>
-          <w:tcPr>
-            <w:tcW w:type="dxa" w:w="1728"/>
-          </w:tcPr>
-          <w:p>
-            <w:pPr>
-              <w:keepLines/>
-              <w:jc w:val="center"/>
-            </w:pPr>
-            <w:r>
-              <w:t>55.8</w:t>
-            </w:r>
-          </w:p>
-        </w:tc>
-        <w:tc>
-          <w:tcPr>
-            <w:tcW w:type="dxa" w:w="1728"/>
-          </w:tcPr>
-          <w:p>
-            <w:pPr>
-              <w:keepLines/>
-              <w:jc w:val="center"/>
-            </w:pPr>
-            <w:r>
-              <w:t>59.7</w:t>
-            </w:r>
-          </w:p>
-        </w:tc>
-        <w:tc>
-          <w:tcPr>
-            <w:tcW w:type="dxa" w:w="1728"/>
-          </w:tcPr>
-          <w:p>
-            <w:pPr>
-              <w:keepLines/>
-              <w:jc w:val="center"/>
-            </w:pPr>
-            <w:r>
-              <w:t>60.0</w:t>
+              <w:t>Stisk pesti</w:t>
+            </w:r>
+          </w:p>
+        </w:tc>
+        <w:tc>
+          <w:tcPr>
+            <w:tcW w:type="dxa" w:w="1728"/>
+          </w:tcPr>
+          <w:p>
+            <w:pPr>
+              <w:keepLines/>
+              <w:jc w:val="center"/>
+            </w:pPr>
+            <w:r>
+              <w:t>47.1</w:t>
+            </w:r>
+          </w:p>
+        </w:tc>
+        <w:tc>
+          <w:tcPr>
+            <w:tcW w:type="dxa" w:w="1728"/>
+          </w:tcPr>
+          <w:p>
+            <w:pPr>
+              <w:keepLines/>
+              <w:jc w:val="center"/>
+            </w:pPr>
+            <w:r>
+              <w:t>47.6</w:t>
+            </w:r>
+          </w:p>
+        </w:tc>
+        <w:tc>
+          <w:tcPr>
+            <w:tcW w:type="dxa" w:w="1728"/>
+          </w:tcPr>
+          <w:p>
+            <w:pPr>
+              <w:keepLines/>
+              <w:jc w:val="center"/>
+            </w:pPr>
+            <w:r>
+              <w:t>49.4</w:t>
             </w:r>
           </w:p>
         </w:tc>
@@ -789,49 +809,49 @@
               <w:jc w:val="left"/>
             </w:pPr>
             <w:r>
-              <w:t>Upogibanje trupa</w:t>
-            </w:r>
-          </w:p>
-        </w:tc>
-        <w:tc>
-          <w:tcPr>
-            <w:tcW w:type="dxa" w:w="1728"/>
-          </w:tcPr>
-          <w:p>
-            <w:pPr>
-              <w:keepLines/>
-              <w:jc w:val="center"/>
-            </w:pPr>
-            <w:r>
-              <w:t>60.0</w:t>
-            </w:r>
-          </w:p>
-        </w:tc>
-        <w:tc>
-          <w:tcPr>
-            <w:tcW w:type="dxa" w:w="1728"/>
-          </w:tcPr>
-          <w:p>
-            <w:pPr>
-              <w:keepLines/>
-              <w:jc w:val="center"/>
-            </w:pPr>
-            <w:r>
-              <w:t>78.6</w:t>
-            </w:r>
-          </w:p>
-        </w:tc>
-        <w:tc>
-          <w:tcPr>
-            <w:tcW w:type="dxa" w:w="1728"/>
-          </w:tcPr>
-          <w:p>
-            <w:pPr>
-              <w:keepLines/>
-              <w:jc w:val="center"/>
-            </w:pPr>
-            <w:r>
-              <w:t>79.4</w:t>
+              <w:t>Tek na 600 m</w:t>
+            </w:r>
+          </w:p>
+        </w:tc>
+        <w:tc>
+          <w:tcPr>
+            <w:tcW w:type="dxa" w:w="1728"/>
+          </w:tcPr>
+          <w:p>
+            <w:pPr>
+              <w:keepLines/>
+              <w:jc w:val="center"/>
+            </w:pPr>
+            <w:r>
+              <w:t>19.4</w:t>
+            </w:r>
+          </w:p>
+        </w:tc>
+        <w:tc>
+          <w:tcPr>
+            <w:tcW w:type="dxa" w:w="1728"/>
+          </w:tcPr>
+          <w:p>
+            <w:pPr>
+              <w:keepLines/>
+              <w:jc w:val="center"/>
+            </w:pPr>
+            <w:r>
+              <w:t>45.9</w:t>
+            </w:r>
+          </w:p>
+        </w:tc>
+        <w:tc>
+          <w:tcPr>
+            <w:tcW w:type="dxa" w:w="1728"/>
+          </w:tcPr>
+          <w:p>
+            <w:pPr>
+              <w:keepLines/>
+              <w:jc w:val="center"/>
+            </w:pPr>
+            <w:r>
+              <w:t>45.5</w:t>
             </w:r>
           </w:p>
         </w:tc>
@@ -847,49 +867,49 @@
               <w:jc w:val="left"/>
             </w:pPr>
             <w:r>
-              <w:t>Vesa v zgibi</w:t>
-            </w:r>
-          </w:p>
-        </w:tc>
-        <w:tc>
-          <w:tcPr>
-            <w:tcW w:type="dxa" w:w="1728"/>
-          </w:tcPr>
-          <w:p>
-            <w:pPr>
-              <w:keepLines/>
-              <w:jc w:val="center"/>
-            </w:pPr>
-            <w:r>
-              <w:t>26.7</w:t>
-            </w:r>
-          </w:p>
-        </w:tc>
-        <w:tc>
-          <w:tcPr>
-            <w:tcW w:type="dxa" w:w="1728"/>
-          </w:tcPr>
-          <w:p>
-            <w:pPr>
-              <w:keepLines/>
-              <w:jc w:val="center"/>
-            </w:pPr>
-            <w:r>
-              <w:t>55.3</w:t>
-            </w:r>
-          </w:p>
-        </w:tc>
-        <w:tc>
-          <w:tcPr>
-            <w:tcW w:type="dxa" w:w="1728"/>
-          </w:tcPr>
-          <w:p>
-            <w:pPr>
-              <w:keepLines/>
-              <w:jc w:val="center"/>
-            </w:pPr>
-            <w:r>
-              <w:t>54.9</w:t>
+              <w:t>6-minutni test hoje</w:t>
+            </w:r>
+          </w:p>
+        </w:tc>
+        <w:tc>
+          <w:tcPr>
+            <w:tcW w:type="dxa" w:w="1728"/>
+          </w:tcPr>
+          <w:p>
+            <w:pPr>
+              <w:keepLines/>
+              <w:jc w:val="center"/>
+            </w:pPr>
+            <w:r>
+              <w:t>36.9</w:t>
+            </w:r>
+          </w:p>
+        </w:tc>
+        <w:tc>
+          <w:tcPr>
+            <w:tcW w:type="dxa" w:w="1728"/>
+          </w:tcPr>
+          <w:p>
+            <w:pPr>
+              <w:keepLines/>
+              <w:jc w:val="center"/>
+            </w:pPr>
+            <w:r>
+              <w:t>43.5</w:t>
+            </w:r>
+          </w:p>
+        </w:tc>
+        <w:tc>
+          <w:tcPr>
+            <w:tcW w:type="dxa" w:w="1728"/>
+          </w:tcPr>
+          <w:p>
+            <w:pPr>
+              <w:keepLines/>
+              <w:jc w:val="center"/>
+            </w:pPr>
+            <w:r>
+              <w:t>44.2</w:t>
             </w:r>
           </w:p>
         </w:tc>
@@ -1119,85 +1139,85 @@
               <w:jc w:val="left"/>
             </w:pPr>
             <w:r>
-              <w:t>6-minutni test hoje</w:t>
-            </w:r>
-          </w:p>
-        </w:tc>
-        <w:tc>
-          <w:tcPr>
-            <w:tcW w:type="dxa" w:w="1289"/>
-          </w:tcPr>
-          <w:p>
-            <w:pPr>
-              <w:jc w:val="center"/>
-            </w:pPr>
-            <w:r>
-              <w:t>20.0</w:t>
-            </w:r>
-          </w:p>
-        </w:tc>
-        <w:tc>
-          <w:tcPr>
-            <w:tcW w:type="dxa" w:w="1289"/>
-          </w:tcPr>
-          <w:p>
-            <w:pPr>
-              <w:jc w:val="center"/>
-            </w:pPr>
-            <w:r>
-              <w:t>26.7</w:t>
-            </w:r>
-          </w:p>
-        </w:tc>
-        <w:tc>
-          <w:tcPr>
-            <w:tcW w:type="dxa" w:w="1289"/>
-          </w:tcPr>
-          <w:p>
-            <w:pPr>
-              <w:jc w:val="center"/>
-            </w:pPr>
-            <w:r>
-              <w:t>24.9</w:t>
-            </w:r>
-          </w:p>
-        </w:tc>
-        <w:tc>
-          <w:tcPr>
-            <w:tcW w:type="dxa" w:w="1289"/>
-          </w:tcPr>
-          <w:p>
-            <w:pPr>
-              <w:jc w:val="center"/>
-            </w:pPr>
-            <w:r>
-              <w:t>20.3</w:t>
-            </w:r>
-          </w:p>
-        </w:tc>
-        <w:tc>
-          <w:tcPr>
-            <w:tcW w:type="dxa" w:w="1289"/>
-          </w:tcPr>
-          <w:p>
-            <w:pPr>
-              <w:jc w:val="center"/>
-            </w:pPr>
-            <w:r>
-              <w:t>24.8</w:t>
-            </w:r>
-          </w:p>
-        </w:tc>
-        <w:tc>
-          <w:tcPr>
-            <w:tcW w:type="dxa" w:w="1289"/>
-          </w:tcPr>
-          <w:p>
-            <w:pPr>
-              <w:jc w:val="center"/>
-            </w:pPr>
-            <w:r>
-              <w:t>19.3</w:t>
+              <w:t>Indeks telesne mase</w:t>
+            </w:r>
+          </w:p>
+        </w:tc>
+        <w:tc>
+          <w:tcPr>
+            <w:tcW w:type="dxa" w:w="1289"/>
+          </w:tcPr>
+          <w:p>
+            <w:pPr>
+              <w:jc w:val="center"/>
+            </w:pPr>
+            <w:r>
+              <w:t>23.3</w:t>
+            </w:r>
+          </w:p>
+        </w:tc>
+        <w:tc>
+          <w:tcPr>
+            <w:tcW w:type="dxa" w:w="1289"/>
+          </w:tcPr>
+          <w:p>
+            <w:pPr>
+              <w:jc w:val="center"/>
+            </w:pPr>
+            <w:r>
+              <w:t>36.7</w:t>
+            </w:r>
+          </w:p>
+        </w:tc>
+        <w:tc>
+          <w:tcPr>
+            <w:tcW w:type="dxa" w:w="1289"/>
+          </w:tcPr>
+          <w:p>
+            <w:pPr>
+              <w:jc w:val="center"/>
+            </w:pPr>
+            <w:r>
+              <w:t>31.6</w:t>
+            </w:r>
+          </w:p>
+        </w:tc>
+        <w:tc>
+          <w:tcPr>
+            <w:tcW w:type="dxa" w:w="1289"/>
+          </w:tcPr>
+          <w:p>
+            <w:pPr>
+              <w:jc w:val="center"/>
+            </w:pPr>
+            <w:r>
+              <w:t>23.3</w:t>
+            </w:r>
+          </w:p>
+        </w:tc>
+        <w:tc>
+          <w:tcPr>
+            <w:tcW w:type="dxa" w:w="1289"/>
+          </w:tcPr>
+          <w:p>
+            <w:pPr>
+              <w:jc w:val="center"/>
+            </w:pPr>
+            <w:r>
+              <w:t>32.0</w:t>
+            </w:r>
+          </w:p>
+        </w:tc>
+        <w:tc>
+          <w:tcPr>
+            <w:tcW w:type="dxa" w:w="1289"/>
+          </w:tcPr>
+          <w:p>
+            <w:pPr>
+              <w:jc w:val="center"/>
+            </w:pPr>
+            <w:r>
+              <w:t>22.0</w:t>
             </w:r>
           </w:p>
         </w:tc>
@@ -1212,85 +1232,85 @@
               <w:jc w:val="left"/>
             </w:pPr>
             <w:r>
-              <w:t>Dotikanje plošč z roko</w:t>
-            </w:r>
-          </w:p>
-        </w:tc>
-        <w:tc>
-          <w:tcPr>
-            <w:tcW w:type="dxa" w:w="1289"/>
-          </w:tcPr>
-          <w:p>
-            <w:pPr>
-              <w:jc w:val="center"/>
-            </w:pPr>
-            <w:r>
-              <w:t>6.7</w:t>
-            </w:r>
-          </w:p>
-        </w:tc>
-        <w:tc>
-          <w:tcPr>
-            <w:tcW w:type="dxa" w:w="1289"/>
-          </w:tcPr>
-          <w:p>
-            <w:pPr>
-              <w:jc w:val="center"/>
-            </w:pPr>
-            <w:r>
-              <w:t>16.7</w:t>
-            </w:r>
-          </w:p>
-        </w:tc>
-        <w:tc>
-          <w:tcPr>
-            <w:tcW w:type="dxa" w:w="1289"/>
-          </w:tcPr>
-          <w:p>
-            <w:pPr>
-              <w:jc w:val="center"/>
-            </w:pPr>
-            <w:r>
-              <w:t>3.8</w:t>
-            </w:r>
-          </w:p>
-        </w:tc>
-        <w:tc>
-          <w:tcPr>
-            <w:tcW w:type="dxa" w:w="1289"/>
-          </w:tcPr>
-          <w:p>
-            <w:pPr>
-              <w:jc w:val="center"/>
-            </w:pPr>
-            <w:r>
-              <w:t>8.6</w:t>
-            </w:r>
-          </w:p>
-        </w:tc>
-        <w:tc>
-          <w:tcPr>
-            <w:tcW w:type="dxa" w:w="1289"/>
-          </w:tcPr>
-          <w:p>
-            <w:pPr>
-              <w:jc w:val="center"/>
-            </w:pPr>
-            <w:r>
-              <w:t>3.1</w:t>
-            </w:r>
-          </w:p>
-        </w:tc>
-        <w:tc>
-          <w:tcPr>
-            <w:tcW w:type="dxa" w:w="1289"/>
-          </w:tcPr>
-          <w:p>
-            <w:pPr>
-              <w:jc w:val="center"/>
-            </w:pPr>
-            <w:r>
-              <w:t>8.5</w:t>
+              <w:t>Obseg pasu</w:t>
+            </w:r>
+          </w:p>
+        </w:tc>
+        <w:tc>
+          <w:tcPr>
+            <w:tcW w:type="dxa" w:w="1289"/>
+          </w:tcPr>
+          <w:p>
+            <w:pPr>
+              <w:jc w:val="center"/>
+            </w:pPr>
+            <w:r>
+              <w:t>33.3</w:t>
+            </w:r>
+          </w:p>
+        </w:tc>
+        <w:tc>
+          <w:tcPr>
+            <w:tcW w:type="dxa" w:w="1289"/>
+          </w:tcPr>
+          <w:p>
+            <w:pPr>
+              <w:jc w:val="center"/>
+            </w:pPr>
+            <w:r>
+              <w:t>26.7</w:t>
+            </w:r>
+          </w:p>
+        </w:tc>
+        <w:tc>
+          <w:tcPr>
+            <w:tcW w:type="dxa" w:w="1289"/>
+          </w:tcPr>
+          <w:p>
+            <w:pPr>
+              <w:jc w:val="center"/>
+            </w:pPr>
+            <w:r>
+              <w:t>50.1</w:t>
+            </w:r>
+          </w:p>
+        </w:tc>
+        <w:tc>
+          <w:tcPr>
+            <w:tcW w:type="dxa" w:w="1289"/>
+          </w:tcPr>
+          <w:p>
+            <w:pPr>
+              <w:jc w:val="center"/>
+            </w:pPr>
+            <w:r>
+              <w:t>12.1</w:t>
+            </w:r>
+          </w:p>
+        </w:tc>
+        <w:tc>
+          <w:tcPr>
+            <w:tcW w:type="dxa" w:w="1289"/>
+          </w:tcPr>
+          <w:p>
+            <w:pPr>
+              <w:jc w:val="center"/>
+            </w:pPr>
+            <w:r>
+              <w:t>50.1</w:t>
+            </w:r>
+          </w:p>
+        </w:tc>
+        <w:tc>
+          <w:tcPr>
+            <w:tcW w:type="dxa" w:w="1289"/>
+          </w:tcPr>
+          <w:p>
+            <w:pPr>
+              <w:jc w:val="center"/>
+            </w:pPr>
+            <w:r>
+              <w:t>12.3</w:t>
             </w:r>
           </w:p>
         </w:tc>
@@ -1305,85 +1325,85 @@
               <w:jc w:val="left"/>
             </w:pPr>
             <w:r>
-              <w:t>Indeks telesne mase</w:t>
-            </w:r>
-          </w:p>
-        </w:tc>
-        <w:tc>
-          <w:tcPr>
-            <w:tcW w:type="dxa" w:w="1289"/>
-          </w:tcPr>
-          <w:p>
-            <w:pPr>
-              <w:jc w:val="center"/>
-            </w:pPr>
-            <w:r>
-              <w:t>23.3</w:t>
-            </w:r>
-          </w:p>
-        </w:tc>
-        <w:tc>
-          <w:tcPr>
-            <w:tcW w:type="dxa" w:w="1289"/>
-          </w:tcPr>
-          <w:p>
-            <w:pPr>
-              <w:jc w:val="center"/>
-            </w:pPr>
-            <w:r>
-              <w:t>36.7</w:t>
-            </w:r>
-          </w:p>
-        </w:tc>
-        <w:tc>
-          <w:tcPr>
-            <w:tcW w:type="dxa" w:w="1289"/>
-          </w:tcPr>
-          <w:p>
-            <w:pPr>
-              <w:jc w:val="center"/>
-            </w:pPr>
-            <w:r>
-              <w:t>31.6</w:t>
-            </w:r>
-          </w:p>
-        </w:tc>
-        <w:tc>
-          <w:tcPr>
-            <w:tcW w:type="dxa" w:w="1289"/>
-          </w:tcPr>
-          <w:p>
-            <w:pPr>
-              <w:jc w:val="center"/>
-            </w:pPr>
-            <w:r>
-              <w:t>23.3</w:t>
-            </w:r>
-          </w:p>
-        </w:tc>
-        <w:tc>
-          <w:tcPr>
-            <w:tcW w:type="dxa" w:w="1289"/>
-          </w:tcPr>
-          <w:p>
-            <w:pPr>
-              <w:jc w:val="center"/>
-            </w:pPr>
-            <w:r>
-              <w:t>32.0</w:t>
-            </w:r>
-          </w:p>
-        </w:tc>
-        <w:tc>
-          <w:tcPr>
-            <w:tcW w:type="dxa" w:w="1289"/>
-          </w:tcPr>
-          <w:p>
-            <w:pPr>
-              <w:jc w:val="center"/>
-            </w:pPr>
-            <w:r>
-              <w:t>22.0</w:t>
+              <w:t>Dotikanje plošč z roko</w:t>
+            </w:r>
+          </w:p>
+        </w:tc>
+        <w:tc>
+          <w:tcPr>
+            <w:tcW w:type="dxa" w:w="1289"/>
+          </w:tcPr>
+          <w:p>
+            <w:pPr>
+              <w:jc w:val="center"/>
+            </w:pPr>
+            <w:r>
+              <w:t>6.7</w:t>
+            </w:r>
+          </w:p>
+        </w:tc>
+        <w:tc>
+          <w:tcPr>
+            <w:tcW w:type="dxa" w:w="1289"/>
+          </w:tcPr>
+          <w:p>
+            <w:pPr>
+              <w:jc w:val="center"/>
+            </w:pPr>
+            <w:r>
+              <w:t>16.7</w:t>
+            </w:r>
+          </w:p>
+        </w:tc>
+        <w:tc>
+          <w:tcPr>
+            <w:tcW w:type="dxa" w:w="1289"/>
+          </w:tcPr>
+          <w:p>
+            <w:pPr>
+              <w:jc w:val="center"/>
+            </w:pPr>
+            <w:r>
+              <w:t>3.8</w:t>
+            </w:r>
+          </w:p>
+        </w:tc>
+        <w:tc>
+          <w:tcPr>
+            <w:tcW w:type="dxa" w:w="1289"/>
+          </w:tcPr>
+          <w:p>
+            <w:pPr>
+              <w:jc w:val="center"/>
+            </w:pPr>
+            <w:r>
+              <w:t>8.6</w:t>
+            </w:r>
+          </w:p>
+        </w:tc>
+        <w:tc>
+          <w:tcPr>
+            <w:tcW w:type="dxa" w:w="1289"/>
+          </w:tcPr>
+          <w:p>
+            <w:pPr>
+              <w:jc w:val="center"/>
+            </w:pPr>
+            <w:r>
+              <w:t>3.1</w:t>
+            </w:r>
+          </w:p>
+        </w:tc>
+        <w:tc>
+          <w:tcPr>
+            <w:tcW w:type="dxa" w:w="1289"/>
+          </w:tcPr>
+          <w:p>
+            <w:pPr>
+              <w:jc w:val="center"/>
+            </w:pPr>
+            <w:r>
+              <w:t>8.5</w:t>
             </w:r>
           </w:p>
         </w:tc>
@@ -1491,85 +1511,85 @@
               <w:jc w:val="left"/>
             </w:pPr>
             <w:r>
-              <w:t>Obseg pasu</w:t>
-            </w:r>
-          </w:p>
-        </w:tc>
-        <w:tc>
-          <w:tcPr>
-            <w:tcW w:type="dxa" w:w="1289"/>
-          </w:tcPr>
-          <w:p>
-            <w:pPr>
-              <w:jc w:val="center"/>
-            </w:pPr>
-            <w:r>
-              <w:t>33.3</w:t>
-            </w:r>
-          </w:p>
-        </w:tc>
-        <w:tc>
-          <w:tcPr>
-            <w:tcW w:type="dxa" w:w="1289"/>
-          </w:tcPr>
-          <w:p>
-            <w:pPr>
-              <w:jc w:val="center"/>
-            </w:pPr>
-            <w:r>
-              <w:t>26.7</w:t>
-            </w:r>
-          </w:p>
-        </w:tc>
-        <w:tc>
-          <w:tcPr>
-            <w:tcW w:type="dxa" w:w="1289"/>
-          </w:tcPr>
-          <w:p>
-            <w:pPr>
-              <w:jc w:val="center"/>
-            </w:pPr>
-            <w:r>
-              <w:t>50.1</w:t>
-            </w:r>
-          </w:p>
-        </w:tc>
-        <w:tc>
-          <w:tcPr>
-            <w:tcW w:type="dxa" w:w="1289"/>
-          </w:tcPr>
-          <w:p>
-            <w:pPr>
-              <w:jc w:val="center"/>
-            </w:pPr>
-            <w:r>
-              <w:t>12.1</w:t>
-            </w:r>
-          </w:p>
-        </w:tc>
-        <w:tc>
-          <w:tcPr>
-            <w:tcW w:type="dxa" w:w="1289"/>
-          </w:tcPr>
-          <w:p>
-            <w:pPr>
-              <w:jc w:val="center"/>
-            </w:pPr>
-            <w:r>
-              <w:t>50.1</w:t>
-            </w:r>
-          </w:p>
-        </w:tc>
-        <w:tc>
-          <w:tcPr>
-            <w:tcW w:type="dxa" w:w="1289"/>
-          </w:tcPr>
-          <w:p>
-            <w:pPr>
-              <w:jc w:val="center"/>
-            </w:pPr>
-            <w:r>
-              <w:t>12.3</w:t>
+              <w:t>Tek v osmici</w:t>
+            </w:r>
+          </w:p>
+        </w:tc>
+        <w:tc>
+          <w:tcPr>
+            <w:tcW w:type="dxa" w:w="1289"/>
+          </w:tcPr>
+          <w:p>
+            <w:pPr>
+              <w:jc w:val="center"/>
+            </w:pPr>
+            <w:r>
+              <w:t>6.9</w:t>
+            </w:r>
+          </w:p>
+        </w:tc>
+        <w:tc>
+          <w:tcPr>
+            <w:tcW w:type="dxa" w:w="1289"/>
+          </w:tcPr>
+          <w:p>
+            <w:pPr>
+              <w:jc w:val="center"/>
+            </w:pPr>
+            <w:r>
+              <w:t>58.6</w:t>
+            </w:r>
+          </w:p>
+        </w:tc>
+        <w:tc>
+          <w:tcPr>
+            <w:tcW w:type="dxa" w:w="1289"/>
+          </w:tcPr>
+          <w:p>
+            <w:pPr>
+              <w:jc w:val="center"/>
+            </w:pPr>
+            <w:r>
+              <w:t>43.3</w:t>
+            </w:r>
+          </w:p>
+        </w:tc>
+        <w:tc>
+          <w:tcPr>
+            <w:tcW w:type="dxa" w:w="1289"/>
+          </w:tcPr>
+          <w:p>
+            <w:pPr>
+              <w:jc w:val="center"/>
+            </w:pPr>
+            <w:r>
+              <w:t>10.9</w:t>
+            </w:r>
+          </w:p>
+        </w:tc>
+        <w:tc>
+          <w:tcPr>
+            <w:tcW w:type="dxa" w:w="1289"/>
+          </w:tcPr>
+          <w:p>
+            <w:pPr>
+              <w:jc w:val="center"/>
+            </w:pPr>
+            <w:r>
+              <w:t>42.6</w:t>
+            </w:r>
+          </w:p>
+        </w:tc>
+        <w:tc>
+          <w:tcPr>
+            <w:tcW w:type="dxa" w:w="1289"/>
+          </w:tcPr>
+          <w:p>
+            <w:pPr>
+              <w:jc w:val="center"/>
+            </w:pPr>
+            <w:r>
+              <w:t>9.7</w:t>
             </w:r>
           </w:p>
         </w:tc>
@@ -1584,85 +1604,85 @@
               <w:jc w:val="left"/>
             </w:pPr>
             <w:r>
-              <w:t>Predklon sede</w:t>
-            </w:r>
-          </w:p>
-        </w:tc>
-        <w:tc>
-          <w:tcPr>
-            <w:tcW w:type="dxa" w:w="1289"/>
-          </w:tcPr>
-          <w:p>
-            <w:pPr>
-              <w:jc w:val="center"/>
-            </w:pPr>
-            <w:r>
-              <w:t>13.3</w:t>
-            </w:r>
-          </w:p>
-        </w:tc>
-        <w:tc>
-          <w:tcPr>
-            <w:tcW w:type="dxa" w:w="1289"/>
-          </w:tcPr>
-          <w:p>
-            <w:pPr>
-              <w:jc w:val="center"/>
-            </w:pPr>
-            <w:r>
-              <w:t>53.3</w:t>
-            </w:r>
-          </w:p>
-        </w:tc>
-        <w:tc>
-          <w:tcPr>
-            <w:tcW w:type="dxa" w:w="1289"/>
-          </w:tcPr>
-          <w:p>
-            <w:pPr>
-              <w:jc w:val="center"/>
-            </w:pPr>
-            <w:r>
-              <w:t>15.9</w:t>
-            </w:r>
-          </w:p>
-        </w:tc>
-        <w:tc>
-          <w:tcPr>
-            <w:tcW w:type="dxa" w:w="1289"/>
-          </w:tcPr>
-          <w:p>
-            <w:pPr>
-              <w:jc w:val="center"/>
-            </w:pPr>
-            <w:r>
-              <w:t>29.1</w:t>
-            </w:r>
-          </w:p>
-        </w:tc>
-        <w:tc>
-          <w:tcPr>
-            <w:tcW w:type="dxa" w:w="1289"/>
-          </w:tcPr>
-          <w:p>
-            <w:pPr>
-              <w:jc w:val="center"/>
-            </w:pPr>
-            <w:r>
-              <w:t>17.2</w:t>
-            </w:r>
-          </w:p>
-        </w:tc>
-        <w:tc>
-          <w:tcPr>
-            <w:tcW w:type="dxa" w:w="1289"/>
-          </w:tcPr>
-          <w:p>
-            <w:pPr>
-              <w:jc w:val="center"/>
-            </w:pPr>
-            <w:r>
-              <w:t>28.1</w:t>
+              <w:t>Upogibanje trupa</w:t>
+            </w:r>
+          </w:p>
+        </w:tc>
+        <w:tc>
+          <w:tcPr>
+            <w:tcW w:type="dxa" w:w="1289"/>
+          </w:tcPr>
+          <w:p>
+            <w:pPr>
+              <w:jc w:val="center"/>
+            </w:pPr>
+            <w:r>
+              <w:t>7.4</w:t>
+            </w:r>
+          </w:p>
+        </w:tc>
+        <w:tc>
+          <w:tcPr>
+            <w:tcW w:type="dxa" w:w="1289"/>
+          </w:tcPr>
+          <w:p>
+            <w:pPr>
+              <w:jc w:val="center"/>
+            </w:pPr>
+            <w:r>
+              <w:t>11.1</w:t>
+            </w:r>
+          </w:p>
+        </w:tc>
+        <w:tc>
+          <w:tcPr>
+            <w:tcW w:type="dxa" w:w="1289"/>
+          </w:tcPr>
+          <w:p>
+            <w:pPr>
+              <w:jc w:val="center"/>
+            </w:pPr>
+            <w:r>
+              <w:t>5.5</w:t>
+            </w:r>
+          </w:p>
+        </w:tc>
+        <w:tc>
+          <w:tcPr>
+            <w:tcW w:type="dxa" w:w="1289"/>
+          </w:tcPr>
+          <w:p>
+            <w:pPr>
+              <w:jc w:val="center"/>
+            </w:pPr>
+            <w:r>
+              <w:t>3.6</w:t>
+            </w:r>
+          </w:p>
+        </w:tc>
+        <w:tc>
+          <w:tcPr>
+            <w:tcW w:type="dxa" w:w="1289"/>
+          </w:tcPr>
+          <w:p>
+            <w:pPr>
+              <w:jc w:val="center"/>
+            </w:pPr>
+            <w:r>
+              <w:t>4.8</w:t>
+            </w:r>
+          </w:p>
+        </w:tc>
+        <w:tc>
+          <w:tcPr>
+            <w:tcW w:type="dxa" w:w="1289"/>
+          </w:tcPr>
+          <w:p>
+            <w:pPr>
+              <w:jc w:val="center"/>
+            </w:pPr>
+            <w:r>
+              <w:t>3.2</w:t>
             </w:r>
           </w:p>
         </w:tc>
@@ -1677,20 +1697,7 @@
               <w:jc w:val="left"/>
             </w:pPr>
             <w:r>
-              <w:t>Stisk pesti</w:t>
-            </w:r>
-          </w:p>
-        </w:tc>
-        <w:tc>
-          <w:tcPr>
-            <w:tcW w:type="dxa" w:w="1289"/>
-          </w:tcPr>
-          <w:p>
-            <w:pPr>
-              <w:jc w:val="center"/>
-            </w:pPr>
-            <w:r>
-              <w:t>10.0</w:t>
+              <w:t>Predklon sede</w:t>
             </w:r>
           </w:p>
         </w:tc>
@@ -1716,46 +1723,59 @@
               <w:jc w:val="center"/>
             </w:pPr>
             <w:r>
-              <w:t>2.7</w:t>
-            </w:r>
-          </w:p>
-        </w:tc>
-        <w:tc>
-          <w:tcPr>
-            <w:tcW w:type="dxa" w:w="1289"/>
-          </w:tcPr>
-          <w:p>
-            <w:pPr>
-              <w:jc w:val="center"/>
-            </w:pPr>
-            <w:r>
-              <w:t>5.5</w:t>
-            </w:r>
-          </w:p>
-        </w:tc>
-        <w:tc>
-          <w:tcPr>
-            <w:tcW w:type="dxa" w:w="1289"/>
-          </w:tcPr>
-          <w:p>
-            <w:pPr>
-              <w:jc w:val="center"/>
-            </w:pPr>
-            <w:r>
-              <w:t>2.1</w:t>
-            </w:r>
-          </w:p>
-        </w:tc>
-        <w:tc>
-          <w:tcPr>
-            <w:tcW w:type="dxa" w:w="1289"/>
-          </w:tcPr>
-          <w:p>
-            <w:pPr>
-              <w:jc w:val="center"/>
-            </w:pPr>
-            <w:r>
-              <w:t>4.9</w:t>
+              <w:t>53.3</w:t>
+            </w:r>
+          </w:p>
+        </w:tc>
+        <w:tc>
+          <w:tcPr>
+            <w:tcW w:type="dxa" w:w="1289"/>
+          </w:tcPr>
+          <w:p>
+            <w:pPr>
+              <w:jc w:val="center"/>
+            </w:pPr>
+            <w:r>
+              <w:t>15.9</w:t>
+            </w:r>
+          </w:p>
+        </w:tc>
+        <w:tc>
+          <w:tcPr>
+            <w:tcW w:type="dxa" w:w="1289"/>
+          </w:tcPr>
+          <w:p>
+            <w:pPr>
+              <w:jc w:val="center"/>
+            </w:pPr>
+            <w:r>
+              <w:t>29.1</w:t>
+            </w:r>
+          </w:p>
+        </w:tc>
+        <w:tc>
+          <w:tcPr>
+            <w:tcW w:type="dxa" w:w="1289"/>
+          </w:tcPr>
+          <w:p>
+            <w:pPr>
+              <w:jc w:val="center"/>
+            </w:pPr>
+            <w:r>
+              <w:t>17.2</w:t>
+            </w:r>
+          </w:p>
+        </w:tc>
+        <w:tc>
+          <w:tcPr>
+            <w:tcW w:type="dxa" w:w="1289"/>
+          </w:tcPr>
+          <w:p>
+            <w:pPr>
+              <w:jc w:val="center"/>
+            </w:pPr>
+            <w:r>
+              <w:t>28.1</w:t>
             </w:r>
           </w:p>
         </w:tc>
@@ -1770,85 +1790,85 @@
               <w:jc w:val="left"/>
             </w:pPr>
             <w:r>
-              <w:t>Tek na 600 m</w:t>
-            </w:r>
-          </w:p>
-        </w:tc>
-        <w:tc>
-          <w:tcPr>
-            <w:tcW w:type="dxa" w:w="1289"/>
-          </w:tcPr>
-          <w:p>
-            <w:pPr>
-              <w:jc w:val="center"/>
-            </w:pPr>
-            <w:r>
-              <w:t>15.4</w:t>
-            </w:r>
-          </w:p>
-        </w:tc>
-        <w:tc>
-          <w:tcPr>
-            <w:tcW w:type="dxa" w:w="1289"/>
-          </w:tcPr>
-          <w:p>
-            <w:pPr>
-              <w:jc w:val="center"/>
-            </w:pPr>
-            <w:r>
-              <w:t>69.2</w:t>
-            </w:r>
-          </w:p>
-        </w:tc>
-        <w:tc>
-          <w:tcPr>
-            <w:tcW w:type="dxa" w:w="1289"/>
-          </w:tcPr>
-          <w:p>
-            <w:pPr>
-              <w:jc w:val="center"/>
-            </w:pPr>
-            <w:r>
-              <w:t>59.1</w:t>
-            </w:r>
-          </w:p>
-        </w:tc>
-        <w:tc>
-          <w:tcPr>
-            <w:tcW w:type="dxa" w:w="1289"/>
-          </w:tcPr>
-          <w:p>
-            <w:pPr>
-              <w:jc w:val="center"/>
-            </w:pPr>
-            <w:r>
-              <w:t>13.9</w:t>
-            </w:r>
-          </w:p>
-        </w:tc>
-        <w:tc>
-          <w:tcPr>
-            <w:tcW w:type="dxa" w:w="1289"/>
-          </w:tcPr>
-          <w:p>
-            <w:pPr>
-              <w:jc w:val="center"/>
-            </w:pPr>
-            <w:r>
-              <w:t>58.2</w:t>
-            </w:r>
-          </w:p>
-        </w:tc>
-        <w:tc>
-          <w:tcPr>
-            <w:tcW w:type="dxa" w:w="1289"/>
-          </w:tcPr>
-          <w:p>
-            <w:pPr>
-              <w:jc w:val="center"/>
-            </w:pPr>
-            <w:r>
-              <w:t>14.4</w:t>
+              <w:t>Vesa v zgibi</w:t>
+            </w:r>
+          </w:p>
+        </w:tc>
+        <w:tc>
+          <w:tcPr>
+            <w:tcW w:type="dxa" w:w="1289"/>
+          </w:tcPr>
+          <w:p>
+            <w:pPr>
+              <w:jc w:val="center"/>
+            </w:pPr>
+            <w:r>
+              <w:t>37.5</w:t>
+            </w:r>
+          </w:p>
+        </w:tc>
+        <w:tc>
+          <w:tcPr>
+            <w:tcW w:type="dxa" w:w="1289"/>
+          </w:tcPr>
+          <w:p>
+            <w:pPr>
+              <w:jc w:val="center"/>
+            </w:pPr>
+            <w:r>
+              <w:t>33.3</w:t>
+            </w:r>
+          </w:p>
+        </w:tc>
+        <w:tc>
+          <w:tcPr>
+            <w:tcW w:type="dxa" w:w="1289"/>
+          </w:tcPr>
+          <w:p>
+            <w:pPr>
+              <w:jc w:val="center"/>
+            </w:pPr>
+            <w:r>
+              <w:t>7.4</w:t>
+            </w:r>
+          </w:p>
+        </w:tc>
+        <w:tc>
+          <w:tcPr>
+            <w:tcW w:type="dxa" w:w="1289"/>
+          </w:tcPr>
+          <w:p>
+            <w:pPr>
+              <w:jc w:val="center"/>
+            </w:pPr>
+            <w:r>
+              <w:t>12.0</w:t>
+            </w:r>
+          </w:p>
+        </w:tc>
+        <w:tc>
+          <w:tcPr>
+            <w:tcW w:type="dxa" w:w="1289"/>
+          </w:tcPr>
+          <w:p>
+            <w:pPr>
+              <w:jc w:val="center"/>
+            </w:pPr>
+            <w:r>
+              <w:t>8.0</w:t>
+            </w:r>
+          </w:p>
+        </w:tc>
+        <w:tc>
+          <w:tcPr>
+            <w:tcW w:type="dxa" w:w="1289"/>
+          </w:tcPr>
+          <w:p>
+            <w:pPr>
+              <w:jc w:val="center"/>
+            </w:pPr>
+            <w:r>
+              <w:t>12.0</w:t>
             </w:r>
           </w:p>
         </w:tc>
@@ -1863,85 +1883,85 @@
               <w:jc w:val="left"/>
             </w:pPr>
             <w:r>
-              <w:t>Tek v osmici</w:t>
-            </w:r>
-          </w:p>
-        </w:tc>
-        <w:tc>
-          <w:tcPr>
-            <w:tcW w:type="dxa" w:w="1289"/>
-          </w:tcPr>
-          <w:p>
-            <w:pPr>
-              <w:jc w:val="center"/>
-            </w:pPr>
-            <w:r>
-              <w:t>6.9</w:t>
-            </w:r>
-          </w:p>
-        </w:tc>
-        <w:tc>
-          <w:tcPr>
-            <w:tcW w:type="dxa" w:w="1289"/>
-          </w:tcPr>
-          <w:p>
-            <w:pPr>
-              <w:jc w:val="center"/>
-            </w:pPr>
-            <w:r>
-              <w:t>58.6</w:t>
-            </w:r>
-          </w:p>
-        </w:tc>
-        <w:tc>
-          <w:tcPr>
-            <w:tcW w:type="dxa" w:w="1289"/>
-          </w:tcPr>
-          <w:p>
-            <w:pPr>
-              <w:jc w:val="center"/>
-            </w:pPr>
-            <w:r>
-              <w:t>43.3</w:t>
-            </w:r>
-          </w:p>
-        </w:tc>
-        <w:tc>
-          <w:tcPr>
-            <w:tcW w:type="dxa" w:w="1289"/>
-          </w:tcPr>
-          <w:p>
-            <w:pPr>
-              <w:jc w:val="center"/>
-            </w:pPr>
-            <w:r>
-              <w:t>10.9</w:t>
-            </w:r>
-          </w:p>
-        </w:tc>
-        <w:tc>
-          <w:tcPr>
-            <w:tcW w:type="dxa" w:w="1289"/>
-          </w:tcPr>
-          <w:p>
-            <w:pPr>
-              <w:jc w:val="center"/>
-            </w:pPr>
-            <w:r>
-              <w:t>42.6</w:t>
-            </w:r>
-          </w:p>
-        </w:tc>
-        <w:tc>
-          <w:tcPr>
-            <w:tcW w:type="dxa" w:w="1289"/>
-          </w:tcPr>
-          <w:p>
-            <w:pPr>
-              <w:jc w:val="center"/>
-            </w:pPr>
-            <w:r>
-              <w:t>9.7</w:t>
+              <w:t>Stisk pesti</w:t>
+            </w:r>
+          </w:p>
+        </w:tc>
+        <w:tc>
+          <w:tcPr>
+            <w:tcW w:type="dxa" w:w="1289"/>
+          </w:tcPr>
+          <w:p>
+            <w:pPr>
+              <w:jc w:val="center"/>
+            </w:pPr>
+            <w:r>
+              <w:t>10.0</w:t>
+            </w:r>
+          </w:p>
+        </w:tc>
+        <w:tc>
+          <w:tcPr>
+            <w:tcW w:type="dxa" w:w="1289"/>
+          </w:tcPr>
+          <w:p>
+            <w:pPr>
+              <w:jc w:val="center"/>
+            </w:pPr>
+            <w:r>
+              <w:t>13.3</w:t>
+            </w:r>
+          </w:p>
+        </w:tc>
+        <w:tc>
+          <w:tcPr>
+            <w:tcW w:type="dxa" w:w="1289"/>
+          </w:tcPr>
+          <w:p>
+            <w:pPr>
+              <w:jc w:val="center"/>
+            </w:pPr>
+            <w:r>
+              <w:t>2.7</w:t>
+            </w:r>
+          </w:p>
+        </w:tc>
+        <w:tc>
+          <w:tcPr>
+            <w:tcW w:type="dxa" w:w="1289"/>
+          </w:tcPr>
+          <w:p>
+            <w:pPr>
+              <w:jc w:val="center"/>
+            </w:pPr>
+            <w:r>
+              <w:t>5.5</w:t>
+            </w:r>
+          </w:p>
+        </w:tc>
+        <w:tc>
+          <w:tcPr>
+            <w:tcW w:type="dxa" w:w="1289"/>
+          </w:tcPr>
+          <w:p>
+            <w:pPr>
+              <w:jc w:val="center"/>
+            </w:pPr>
+            <w:r>
+              <w:t>2.1</w:t>
+            </w:r>
+          </w:p>
+        </w:tc>
+        <w:tc>
+          <w:tcPr>
+            <w:tcW w:type="dxa" w:w="1289"/>
+          </w:tcPr>
+          <w:p>
+            <w:pPr>
+              <w:jc w:val="center"/>
+            </w:pPr>
+            <w:r>
+              <w:t>4.9</w:t>
             </w:r>
           </w:p>
         </w:tc>
@@ -1956,85 +1976,85 @@
               <w:jc w:val="left"/>
             </w:pPr>
             <w:r>
-              <w:t>Upogibanje trupa</w:t>
-            </w:r>
-          </w:p>
-        </w:tc>
-        <w:tc>
-          <w:tcPr>
-            <w:tcW w:type="dxa" w:w="1289"/>
-          </w:tcPr>
-          <w:p>
-            <w:pPr>
-              <w:jc w:val="center"/>
-            </w:pPr>
-            <w:r>
-              <w:t>7.4</w:t>
-            </w:r>
-          </w:p>
-        </w:tc>
-        <w:tc>
-          <w:tcPr>
-            <w:tcW w:type="dxa" w:w="1289"/>
-          </w:tcPr>
-          <w:p>
-            <w:pPr>
-              <w:jc w:val="center"/>
-            </w:pPr>
-            <w:r>
-              <w:t>11.1</w:t>
-            </w:r>
-          </w:p>
-        </w:tc>
-        <w:tc>
-          <w:tcPr>
-            <w:tcW w:type="dxa" w:w="1289"/>
-          </w:tcPr>
-          <w:p>
-            <w:pPr>
-              <w:jc w:val="center"/>
-            </w:pPr>
-            <w:r>
-              <w:t>5.5</w:t>
-            </w:r>
-          </w:p>
-        </w:tc>
-        <w:tc>
-          <w:tcPr>
-            <w:tcW w:type="dxa" w:w="1289"/>
-          </w:tcPr>
-          <w:p>
-            <w:pPr>
-              <w:jc w:val="center"/>
-            </w:pPr>
-            <w:r>
-              <w:t>3.6</w:t>
-            </w:r>
-          </w:p>
-        </w:tc>
-        <w:tc>
-          <w:tcPr>
-            <w:tcW w:type="dxa" w:w="1289"/>
-          </w:tcPr>
-          <w:p>
-            <w:pPr>
-              <w:jc w:val="center"/>
-            </w:pPr>
-            <w:r>
-              <w:t>4.8</w:t>
-            </w:r>
-          </w:p>
-        </w:tc>
-        <w:tc>
-          <w:tcPr>
-            <w:tcW w:type="dxa" w:w="1289"/>
-          </w:tcPr>
-          <w:p>
-            <w:pPr>
-              <w:jc w:val="center"/>
-            </w:pPr>
-            <w:r>
-              <w:t>3.2</w:t>
+              <w:t>Tek na 600 m</w:t>
+            </w:r>
+          </w:p>
+        </w:tc>
+        <w:tc>
+          <w:tcPr>
+            <w:tcW w:type="dxa" w:w="1289"/>
+          </w:tcPr>
+          <w:p>
+            <w:pPr>
+              <w:jc w:val="center"/>
+            </w:pPr>
+            <w:r>
+              <w:t>15.4</w:t>
+            </w:r>
+          </w:p>
+        </w:tc>
+        <w:tc>
+          <w:tcPr>
+            <w:tcW w:type="dxa" w:w="1289"/>
+          </w:tcPr>
+          <w:p>
+            <w:pPr>
+              <w:jc w:val="center"/>
+            </w:pPr>
+            <w:r>
+              <w:t>69.2</w:t>
+            </w:r>
+          </w:p>
+        </w:tc>
+        <w:tc>
+          <w:tcPr>
+            <w:tcW w:type="dxa" w:w="1289"/>
+          </w:tcPr>
+          <w:p>
+            <w:pPr>
+              <w:jc w:val="center"/>
+            </w:pPr>
+            <w:r>
+              <w:t>59.1</w:t>
+            </w:r>
+          </w:p>
+        </w:tc>
+        <w:tc>
+          <w:tcPr>
+            <w:tcW w:type="dxa" w:w="1289"/>
+          </w:tcPr>
+          <w:p>
+            <w:pPr>
+              <w:jc w:val="center"/>
+            </w:pPr>
+            <w:r>
+              <w:t>13.9</w:t>
+            </w:r>
+          </w:p>
+        </w:tc>
+        <w:tc>
+          <w:tcPr>
+            <w:tcW w:type="dxa" w:w="1289"/>
+          </w:tcPr>
+          <w:p>
+            <w:pPr>
+              <w:jc w:val="center"/>
+            </w:pPr>
+            <w:r>
+              <w:t>58.2</w:t>
+            </w:r>
+          </w:p>
+        </w:tc>
+        <w:tc>
+          <w:tcPr>
+            <w:tcW w:type="dxa" w:w="1289"/>
+          </w:tcPr>
+          <w:p>
+            <w:pPr>
+              <w:jc w:val="center"/>
+            </w:pPr>
+            <w:r>
+              <w:t>14.4</w:t>
             </w:r>
           </w:p>
         </w:tc>
@@ -2049,85 +2069,85 @@
               <w:jc w:val="left"/>
             </w:pPr>
             <w:r>
-              <w:t>Vesa v zgibi</w:t>
-            </w:r>
-          </w:p>
-        </w:tc>
-        <w:tc>
-          <w:tcPr>
-            <w:tcW w:type="dxa" w:w="1289"/>
-          </w:tcPr>
-          <w:p>
-            <w:pPr>
-              <w:jc w:val="center"/>
-            </w:pPr>
-            <w:r>
-              <w:t>37.5</w:t>
-            </w:r>
-          </w:p>
-        </w:tc>
-        <w:tc>
-          <w:tcPr>
-            <w:tcW w:type="dxa" w:w="1289"/>
-          </w:tcPr>
-          <w:p>
-            <w:pPr>
-              <w:jc w:val="center"/>
-            </w:pPr>
-            <w:r>
-              <w:t>33.3</w:t>
-            </w:r>
-          </w:p>
-        </w:tc>
-        <w:tc>
-          <w:tcPr>
-            <w:tcW w:type="dxa" w:w="1289"/>
-          </w:tcPr>
-          <w:p>
-            <w:pPr>
-              <w:jc w:val="center"/>
-            </w:pPr>
-            <w:r>
-              <w:t>7.4</w:t>
-            </w:r>
-          </w:p>
-        </w:tc>
-        <w:tc>
-          <w:tcPr>
-            <w:tcW w:type="dxa" w:w="1289"/>
-          </w:tcPr>
-          <w:p>
-            <w:pPr>
-              <w:jc w:val="center"/>
-            </w:pPr>
-            <w:r>
-              <w:t>12.0</w:t>
-            </w:r>
-          </w:p>
-        </w:tc>
-        <w:tc>
-          <w:tcPr>
-            <w:tcW w:type="dxa" w:w="1289"/>
-          </w:tcPr>
-          <w:p>
-            <w:pPr>
-              <w:jc w:val="center"/>
-            </w:pPr>
-            <w:r>
-              <w:t>8.0</w:t>
-            </w:r>
-          </w:p>
-        </w:tc>
-        <w:tc>
-          <w:tcPr>
-            <w:tcW w:type="dxa" w:w="1289"/>
-          </w:tcPr>
-          <w:p>
-            <w:pPr>
-              <w:jc w:val="center"/>
-            </w:pPr>
-            <w:r>
-              <w:t>12.0</w:t>
+              <w:t>6-minutni test hoje</w:t>
+            </w:r>
+          </w:p>
+        </w:tc>
+        <w:tc>
+          <w:tcPr>
+            <w:tcW w:type="dxa" w:w="1289"/>
+          </w:tcPr>
+          <w:p>
+            <w:pPr>
+              <w:jc w:val="center"/>
+            </w:pPr>
+            <w:r>
+              <w:t>20.0</w:t>
+            </w:r>
+          </w:p>
+        </w:tc>
+        <w:tc>
+          <w:tcPr>
+            <w:tcW w:type="dxa" w:w="1289"/>
+          </w:tcPr>
+          <w:p>
+            <w:pPr>
+              <w:jc w:val="center"/>
+            </w:pPr>
+            <w:r>
+              <w:t>26.7</w:t>
+            </w:r>
+          </w:p>
+        </w:tc>
+        <w:tc>
+          <w:tcPr>
+            <w:tcW w:type="dxa" w:w="1289"/>
+          </w:tcPr>
+          <w:p>
+            <w:pPr>
+              <w:jc w:val="center"/>
+            </w:pPr>
+            <w:r>
+              <w:t>24.9</w:t>
+            </w:r>
+          </w:p>
+        </w:tc>
+        <w:tc>
+          <w:tcPr>
+            <w:tcW w:type="dxa" w:w="1289"/>
+          </w:tcPr>
+          <w:p>
+            <w:pPr>
+              <w:jc w:val="center"/>
+            </w:pPr>
+            <w:r>
+              <w:t>20.3</w:t>
+            </w:r>
+          </w:p>
+        </w:tc>
+        <w:tc>
+          <w:tcPr>
+            <w:tcW w:type="dxa" w:w="1289"/>
+          </w:tcPr>
+          <w:p>
+            <w:pPr>
+              <w:jc w:val="center"/>
+            </w:pPr>
+            <w:r>
+              <w:t>24.8</w:t>
+            </w:r>
+          </w:p>
+        </w:tc>
+        <w:tc>
+          <w:tcPr>
+            <w:tcW w:type="dxa" w:w="1289"/>
+          </w:tcPr>
+          <w:p>
+            <w:pPr>
+              <w:jc w:val="center"/>
+            </w:pPr>
+            <w:r>
+              <w:t>19.3</w:t>
             </w:r>
           </w:p>
         </w:tc>

</xml_diff>

<commit_message>
Popravil 2. tabelo, da je nižji rezultat dejansko boljši za določene teste, dodal opombe
</commit_message>
<xml_diff>
--- a/Fšfebr2026_odrasli.docx
+++ b/Fšfebr2026_odrasli.docx
@@ -89,11 +89,16 @@
         <w:t>Povprečni centili po testih</w:t>
       </w:r>
     </w:p>
+    <w:p>
+      <w:r>
+        <w:t>Pri testih, pri katerih je nižji rezultat boljši (npr. Tek na 600 m) so centili “obrnjeni” (100-centil), tako da v spodnji tabeli višje povprečje vedno pomeni boljši rezultat.</w:t>
+      </w:r>
+    </w:p>
     <w:tbl>
       <w:tblPr>
         <w:tblStyle w:val="TableGrid"/>
         <w:tblW w:type="auto" w:w="0"/>
-        <w:tblLayout w:type="fixed"/>
+        <w:tblLayout w:type="autofit"/>
         <w:tblLook w:firstColumn="1" w:firstRow="1" w:lastColumn="0" w:lastRow="0" w:noHBand="0" w:noVBand="1" w:val="04A0"/>
       </w:tblPr>
       <w:tblGrid>
@@ -185,35 +190,35 @@
               <w:jc w:val="center"/>
             </w:pPr>
             <w:r>
-              <w:t>55.8</w:t>
-            </w:r>
-          </w:p>
-        </w:tc>
-        <w:tc>
-          <w:tcPr>
-            <w:tcW w:type="dxa" w:w="1728"/>
-          </w:tcPr>
-          <w:p>
-            <w:pPr>
-              <w:keepLines/>
-              <w:jc w:val="center"/>
-            </w:pPr>
-            <w:r>
-              <w:t>59.7</w:t>
-            </w:r>
-          </w:p>
-        </w:tc>
-        <w:tc>
-          <w:tcPr>
-            <w:tcW w:type="dxa" w:w="1728"/>
-          </w:tcPr>
-          <w:p>
-            <w:pPr>
-              <w:keepLines/>
-              <w:jc w:val="center"/>
-            </w:pPr>
-            <w:r>
-              <w:t>60.0</w:t>
+              <w:t>44.2</w:t>
+            </w:r>
+          </w:p>
+        </w:tc>
+        <w:tc>
+          <w:tcPr>
+            <w:tcW w:type="dxa" w:w="1728"/>
+          </w:tcPr>
+          <w:p>
+            <w:pPr>
+              <w:keepLines/>
+              <w:jc w:val="center"/>
+            </w:pPr>
+            <w:r>
+              <w:t>40.3</w:t>
+            </w:r>
+          </w:p>
+        </w:tc>
+        <w:tc>
+          <w:tcPr>
+            <w:tcW w:type="dxa" w:w="1728"/>
+          </w:tcPr>
+          <w:p>
+            <w:pPr>
+              <w:keepLines/>
+              <w:jc w:val="center"/>
+            </w:pPr>
+            <w:r>
+              <w:t>40.0</w:t>
             </w:r>
           </w:p>
         </w:tc>
@@ -243,35 +248,35 @@
               <w:jc w:val="center"/>
             </w:pPr>
             <w:r>
-              <w:t>56.9</w:t>
-            </w:r>
-          </w:p>
-        </w:tc>
-        <w:tc>
-          <w:tcPr>
-            <w:tcW w:type="dxa" w:w="1728"/>
-          </w:tcPr>
-          <w:p>
-            <w:pPr>
-              <w:keepLines/>
-              <w:jc w:val="center"/>
-            </w:pPr>
-            <w:r>
-              <w:t>46.4</w:t>
-            </w:r>
-          </w:p>
-        </w:tc>
-        <w:tc>
-          <w:tcPr>
-            <w:tcW w:type="dxa" w:w="1728"/>
-          </w:tcPr>
-          <w:p>
-            <w:pPr>
-              <w:keepLines/>
-              <w:jc w:val="center"/>
-            </w:pPr>
-            <w:r>
-              <w:t>48.1</w:t>
+              <w:t>43.1</w:t>
+            </w:r>
+          </w:p>
+        </w:tc>
+        <w:tc>
+          <w:tcPr>
+            <w:tcW w:type="dxa" w:w="1728"/>
+          </w:tcPr>
+          <w:p>
+            <w:pPr>
+              <w:keepLines/>
+              <w:jc w:val="center"/>
+            </w:pPr>
+            <w:r>
+              <w:t>53.6</w:t>
+            </w:r>
+          </w:p>
+        </w:tc>
+        <w:tc>
+          <w:tcPr>
+            <w:tcW w:type="dxa" w:w="1728"/>
+          </w:tcPr>
+          <w:p>
+            <w:pPr>
+              <w:keepLines/>
+              <w:jc w:val="center"/>
+            </w:pPr>
+            <w:r>
+              <w:t>51.9</w:t>
             </w:r>
           </w:p>
         </w:tc>
@@ -359,35 +364,35 @@
               <w:jc w:val="center"/>
             </w:pPr>
             <w:r>
-              <w:t>45.5</w:t>
-            </w:r>
-          </w:p>
-        </w:tc>
-        <w:tc>
-          <w:tcPr>
-            <w:tcW w:type="dxa" w:w="1728"/>
-          </w:tcPr>
-          <w:p>
-            <w:pPr>
-              <w:keepLines/>
-              <w:jc w:val="center"/>
-            </w:pPr>
-            <w:r>
-              <w:t>32.2</w:t>
-            </w:r>
-          </w:p>
-        </w:tc>
-        <w:tc>
-          <w:tcPr>
-            <w:tcW w:type="dxa" w:w="1728"/>
-          </w:tcPr>
-          <w:p>
-            <w:pPr>
-              <w:keepLines/>
-              <w:jc w:val="center"/>
-            </w:pPr>
-            <w:r>
-              <w:t>33.6</w:t>
+              <w:t>54.5</w:t>
+            </w:r>
+          </w:p>
+        </w:tc>
+        <w:tc>
+          <w:tcPr>
+            <w:tcW w:type="dxa" w:w="1728"/>
+          </w:tcPr>
+          <w:p>
+            <w:pPr>
+              <w:keepLines/>
+              <w:jc w:val="center"/>
+            </w:pPr>
+            <w:r>
+              <w:t>67.8</w:t>
+            </w:r>
+          </w:p>
+        </w:tc>
+        <w:tc>
+          <w:tcPr>
+            <w:tcW w:type="dxa" w:w="1728"/>
+          </w:tcPr>
+          <w:p>
+            <w:pPr>
+              <w:keepLines/>
+              <w:jc w:val="center"/>
+            </w:pPr>
+            <w:r>
+              <w:t>66.4</w:t>
             </w:r>
           </w:p>
         </w:tc>
@@ -920,7 +925,7 @@
       <w:r>
         <w:drawing>
           <wp:inline xmlns:a="http://schemas.openxmlformats.org/drawingml/2006/main" xmlns:pic="http://schemas.openxmlformats.org/drawingml/2006/picture">
-            <wp:extent cx="5486400" cy="2743200"/>
+            <wp:extent cx="5486400" cy="3429000"/>
             <wp:docPr id="1" name="Picture 1"/>
             <wp:cNvGraphicFramePr>
               <a:graphicFrameLocks noChangeAspect="1"/>
@@ -941,7 +946,7 @@
                   <pic:spPr>
                     <a:xfrm>
                       <a:off x="0" y="0"/>
-                      <a:ext cx="5486400" cy="2743200"/>
+                      <a:ext cx="5486400" cy="3429000"/>
                     </a:xfrm>
                     <a:prstGeom prst="rect"/>
                   </pic:spPr>
@@ -962,14 +967,19 @@
         <w:pStyle w:val="Heading2"/>
       </w:pPr>
       <w:r>
-        <w:t>Delež mejnih in tveganih rezultatov po testih - tabela</w:t>
+        <w:t>Delež mejnih in tveganih rezultatov po testih</w:t>
+      </w:r>
+    </w:p>
+    <w:p>
+      <w:r>
+        <w:t xml:space="preserve">Tabela prikazuje delež udeležencev meritev, ki imajo testni dosežek označen kot tvegan (rdeča cona) ali mejen (rumena cona). Delež zelene cone ni prikazan, se pa lahko izračuna kot razlika 100% - Tvegano – Mejno. </w:t>
       </w:r>
     </w:p>
     <w:tbl>
       <w:tblPr>
         <w:tblStyle w:val="TableGrid"/>
         <w:tblW w:type="auto" w:w="0"/>
-        <w:tblLayout w:type="fixed"/>
+        <w:tblLayout w:type="autofit"/>
         <w:tblLook w:firstColumn="1" w:firstRow="1" w:lastColumn="0" w:lastRow="0" w:noHBand="0" w:noVBand="1" w:val="04A0"/>
       </w:tblPr>
       <w:tblGrid>
@@ -2153,34 +2163,6 @@
         </w:tc>
       </w:tr>
     </w:tbl>
-    <w:p>
-      <w:r>
-        <w:br w:type="page"/>
-      </w:r>
-    </w:p>
-    <w:p>
-      <w:pPr>
-        <w:pStyle w:val="Heading2"/>
-      </w:pPr>
-      <w:r>
-        <w:t>Delež mejnih in tveganih rezultatov po testih</w:t>
-      </w:r>
-    </w:p>
-    <w:p>
-      <w:r>
-        <w:t>Z...ZmigajSdv</w:t>
-      </w:r>
-    </w:p>
-    <w:p>
-      <w:r>
-        <w:t>R...Regija</w:t>
-      </w:r>
-    </w:p>
-    <w:p>
-      <w:r>
-        <w:t>S...Slovenija</w:t>
-      </w:r>
-    </w:p>
     <w:p>
       <w:r>
         <w:drawing>
@@ -2215,6 +2197,11 @@
             </a:graphic>
           </wp:inline>
         </w:drawing>
+      </w:r>
+    </w:p>
+    <w:p>
+      <w:r>
+        <w:t>Oznake skupin: Z=ZmigajSdv, R=Regija, S=Slovenija</w:t>
       </w:r>
     </w:p>
     <w:sectPr>

</xml_diff>

<commit_message>
Popravil tabele (lišp, pravilni testi obrnjeni), spremenil barve stolpcev, zamenjal vrstni red vrstic na 1. strani
</commit_message>
<xml_diff>
--- a/Fšfebr2026_odrasli.docx
+++ b/Fšfebr2026_odrasli.docx
@@ -37,6 +37,11 @@
     </w:p>
     <w:p>
       <w:r>
+        <w:t>Kraj meritev: Gortanova 22, 1000 Ljubljana</w:t>
+      </w:r>
+    </w:p>
+    <w:p>
+      <w:r>
         <w:t>Administrator: Premelč Jerneja</w:t>
       </w:r>
     </w:p>
@@ -57,22 +62,17 @@
     </w:p>
     <w:p>
       <w:r>
-        <w:t>Kraj meritev: Gortanova 22, 1000 Ljubljana</w:t>
-      </w:r>
-    </w:p>
-    <w:p>
-      <w:r>
-        <w:t>Povprečna starost: 49,9</w:t>
-      </w:r>
-    </w:p>
-    <w:p>
-      <w:r>
         <w:t>Število moških: 9</w:t>
       </w:r>
     </w:p>
     <w:p>
       <w:r>
         <w:t>Število žensk: 21</w:t>
+      </w:r>
+    </w:p>
+    <w:p>
+      <w:r>
+        <w:t>Povprečna starost: 49,9</w:t>
       </w:r>
     </w:p>
     <w:p/>
@@ -91,7 +91,7 @@
     </w:p>
     <w:p>
       <w:r>
-        <w:t>Pri testih, pri katerih je nižji rezultat boljši (npr. Tek na 600 m) so centili “obrnjeni” (100-centil), tako da v spodnji tabeli višje povprečje vedno pomeni boljši rezultat.</w:t>
+        <w:t>Pri testih, pri katerih je zaželen nižji rezultat (npr. 6-minutni test hoje, Obseg pasu) so centili “obrnjeni” (100-centil), tako da v spodnji tabeli in grafikonu višje povprečje vedno pomeni boljši rezultat.</w:t>
       </w:r>
     </w:p>
     <w:tbl>
@@ -190,35 +190,35 @@
               <w:jc w:val="center"/>
             </w:pPr>
             <w:r>
-              <w:t>44.2</w:t>
-            </w:r>
-          </w:p>
-        </w:tc>
-        <w:tc>
-          <w:tcPr>
-            <w:tcW w:type="dxa" w:w="1728"/>
-          </w:tcPr>
-          <w:p>
-            <w:pPr>
-              <w:keepLines/>
-              <w:jc w:val="center"/>
-            </w:pPr>
-            <w:r>
-              <w:t>40.3</w:t>
-            </w:r>
-          </w:p>
-        </w:tc>
-        <w:tc>
-          <w:tcPr>
-            <w:tcW w:type="dxa" w:w="1728"/>
-          </w:tcPr>
-          <w:p>
-            <w:pPr>
-              <w:keepLines/>
-              <w:jc w:val="center"/>
-            </w:pPr>
-            <w:r>
-              <w:t>40.0</w:t>
+              <w:t>55.8</w:t>
+            </w:r>
+          </w:p>
+        </w:tc>
+        <w:tc>
+          <w:tcPr>
+            <w:tcW w:type="dxa" w:w="1728"/>
+          </w:tcPr>
+          <w:p>
+            <w:pPr>
+              <w:keepLines/>
+              <w:jc w:val="center"/>
+            </w:pPr>
+            <w:r>
+              <w:t>59.7</w:t>
+            </w:r>
+          </w:p>
+        </w:tc>
+        <w:tc>
+          <w:tcPr>
+            <w:tcW w:type="dxa" w:w="1728"/>
+          </w:tcPr>
+          <w:p>
+            <w:pPr>
+              <w:keepLines/>
+              <w:jc w:val="center"/>
+            </w:pPr>
+            <w:r>
+              <w:t>60.0</w:t>
             </w:r>
           </w:p>
         </w:tc>
@@ -248,35 +248,35 @@
               <w:jc w:val="center"/>
             </w:pPr>
             <w:r>
-              <w:t>43.1</w:t>
-            </w:r>
-          </w:p>
-        </w:tc>
-        <w:tc>
-          <w:tcPr>
-            <w:tcW w:type="dxa" w:w="1728"/>
-          </w:tcPr>
-          <w:p>
-            <w:pPr>
-              <w:keepLines/>
-              <w:jc w:val="center"/>
-            </w:pPr>
-            <w:r>
-              <w:t>53.6</w:t>
-            </w:r>
-          </w:p>
-        </w:tc>
-        <w:tc>
-          <w:tcPr>
-            <w:tcW w:type="dxa" w:w="1728"/>
-          </w:tcPr>
-          <w:p>
-            <w:pPr>
-              <w:keepLines/>
-              <w:jc w:val="center"/>
-            </w:pPr>
-            <w:r>
-              <w:t>51.9</w:t>
+              <w:t>56.9</w:t>
+            </w:r>
+          </w:p>
+        </w:tc>
+        <w:tc>
+          <w:tcPr>
+            <w:tcW w:type="dxa" w:w="1728"/>
+          </w:tcPr>
+          <w:p>
+            <w:pPr>
+              <w:keepLines/>
+              <w:jc w:val="center"/>
+            </w:pPr>
+            <w:r>
+              <w:t>46.4</w:t>
+            </w:r>
+          </w:p>
+        </w:tc>
+        <w:tc>
+          <w:tcPr>
+            <w:tcW w:type="dxa" w:w="1728"/>
+          </w:tcPr>
+          <w:p>
+            <w:pPr>
+              <w:keepLines/>
+              <w:jc w:val="center"/>
+            </w:pPr>
+            <w:r>
+              <w:t>48.1</w:t>
             </w:r>
           </w:p>
         </w:tc>
@@ -292,49 +292,49 @@
               <w:jc w:val="left"/>
             </w:pPr>
             <w:r>
-              <w:t>Indeks telesne mase</w:t>
-            </w:r>
-          </w:p>
-        </w:tc>
-        <w:tc>
-          <w:tcPr>
-            <w:tcW w:type="dxa" w:w="1728"/>
-          </w:tcPr>
-          <w:p>
-            <w:pPr>
-              <w:keepLines/>
-              <w:jc w:val="center"/>
-            </w:pPr>
-            <w:r>
-              <w:t>42.2</w:t>
-            </w:r>
-          </w:p>
-        </w:tc>
-        <w:tc>
-          <w:tcPr>
-            <w:tcW w:type="dxa" w:w="1728"/>
-          </w:tcPr>
-          <w:p>
-            <w:pPr>
-              <w:keepLines/>
-              <w:jc w:val="center"/>
-            </w:pPr>
-            <w:r>
-              <w:t>57.3</w:t>
-            </w:r>
-          </w:p>
-        </w:tc>
-        <w:tc>
-          <w:tcPr>
-            <w:tcW w:type="dxa" w:w="1728"/>
-          </w:tcPr>
-          <w:p>
-            <w:pPr>
-              <w:keepLines/>
-              <w:jc w:val="center"/>
-            </w:pPr>
-            <w:r>
-              <w:t>56.0</w:t>
+              <w:t>Indeks telesne mase*</w:t>
+            </w:r>
+          </w:p>
+        </w:tc>
+        <w:tc>
+          <w:tcPr>
+            <w:tcW w:type="dxa" w:w="1728"/>
+          </w:tcPr>
+          <w:p>
+            <w:pPr>
+              <w:keepLines/>
+              <w:jc w:val="center"/>
+            </w:pPr>
+            <w:r>
+              <w:t>57.8</w:t>
+            </w:r>
+          </w:p>
+        </w:tc>
+        <w:tc>
+          <w:tcPr>
+            <w:tcW w:type="dxa" w:w="1728"/>
+          </w:tcPr>
+          <w:p>
+            <w:pPr>
+              <w:keepLines/>
+              <w:jc w:val="center"/>
+            </w:pPr>
+            <w:r>
+              <w:t>42.7</w:t>
+            </w:r>
+          </w:p>
+        </w:tc>
+        <w:tc>
+          <w:tcPr>
+            <w:tcW w:type="dxa" w:w="1728"/>
+          </w:tcPr>
+          <w:p>
+            <w:pPr>
+              <w:keepLines/>
+              <w:jc w:val="center"/>
+            </w:pPr>
+            <w:r>
+              <w:t>44.0</w:t>
             </w:r>
           </w:p>
         </w:tc>
@@ -350,7 +350,7 @@
               <w:jc w:val="left"/>
             </w:pPr>
             <w:r>
-              <w:t>Obseg pasu</w:t>
+              <w:t>Obseg pasu*</w:t>
             </w:r>
           </w:p>
         </w:tc>
@@ -524,49 +524,49 @@
               <w:jc w:val="left"/>
             </w:pPr>
             <w:r>
-              <w:t>Tek v osmici</w:t>
-            </w:r>
-          </w:p>
-        </w:tc>
-        <w:tc>
-          <w:tcPr>
-            <w:tcW w:type="dxa" w:w="1728"/>
-          </w:tcPr>
-          <w:p>
-            <w:pPr>
-              <w:keepLines/>
-              <w:jc w:val="center"/>
-            </w:pPr>
-            <w:r>
-              <w:t>34.2</w:t>
-            </w:r>
-          </w:p>
-        </w:tc>
-        <w:tc>
-          <w:tcPr>
-            <w:tcW w:type="dxa" w:w="1728"/>
-          </w:tcPr>
-          <w:p>
-            <w:pPr>
-              <w:keepLines/>
-              <w:jc w:val="center"/>
-            </w:pPr>
-            <w:r>
-              <w:t>51.0</w:t>
-            </w:r>
-          </w:p>
-        </w:tc>
-        <w:tc>
-          <w:tcPr>
-            <w:tcW w:type="dxa" w:w="1728"/>
-          </w:tcPr>
-          <w:p>
-            <w:pPr>
-              <w:keepLines/>
-              <w:jc w:val="center"/>
-            </w:pPr>
-            <w:r>
-              <w:t>50.3</w:t>
+              <w:t>Tek v osmici*</w:t>
+            </w:r>
+          </w:p>
+        </w:tc>
+        <w:tc>
+          <w:tcPr>
+            <w:tcW w:type="dxa" w:w="1728"/>
+          </w:tcPr>
+          <w:p>
+            <w:pPr>
+              <w:keepLines/>
+              <w:jc w:val="center"/>
+            </w:pPr>
+            <w:r>
+              <w:t>65.8</w:t>
+            </w:r>
+          </w:p>
+        </w:tc>
+        <w:tc>
+          <w:tcPr>
+            <w:tcW w:type="dxa" w:w="1728"/>
+          </w:tcPr>
+          <w:p>
+            <w:pPr>
+              <w:keepLines/>
+              <w:jc w:val="center"/>
+            </w:pPr>
+            <w:r>
+              <w:t>49.0</w:t>
+            </w:r>
+          </w:p>
+        </w:tc>
+        <w:tc>
+          <w:tcPr>
+            <w:tcW w:type="dxa" w:w="1728"/>
+          </w:tcPr>
+          <w:p>
+            <w:pPr>
+              <w:keepLines/>
+              <w:jc w:val="center"/>
+            </w:pPr>
+            <w:r>
+              <w:t>49.7</w:t>
             </w:r>
           </w:p>
         </w:tc>
@@ -814,49 +814,49 @@
               <w:jc w:val="left"/>
             </w:pPr>
             <w:r>
-              <w:t>Tek na 600 m</w:t>
-            </w:r>
-          </w:p>
-        </w:tc>
-        <w:tc>
-          <w:tcPr>
-            <w:tcW w:type="dxa" w:w="1728"/>
-          </w:tcPr>
-          <w:p>
-            <w:pPr>
-              <w:keepLines/>
-              <w:jc w:val="center"/>
-            </w:pPr>
-            <w:r>
-              <w:t>19.4</w:t>
-            </w:r>
-          </w:p>
-        </w:tc>
-        <w:tc>
-          <w:tcPr>
-            <w:tcW w:type="dxa" w:w="1728"/>
-          </w:tcPr>
-          <w:p>
-            <w:pPr>
-              <w:keepLines/>
-              <w:jc w:val="center"/>
-            </w:pPr>
-            <w:r>
-              <w:t>45.9</w:t>
-            </w:r>
-          </w:p>
-        </w:tc>
-        <w:tc>
-          <w:tcPr>
-            <w:tcW w:type="dxa" w:w="1728"/>
-          </w:tcPr>
-          <w:p>
-            <w:pPr>
-              <w:keepLines/>
-              <w:jc w:val="center"/>
-            </w:pPr>
-            <w:r>
-              <w:t>45.5</w:t>
+              <w:t>Tek na 600 m*</w:t>
+            </w:r>
+          </w:p>
+        </w:tc>
+        <w:tc>
+          <w:tcPr>
+            <w:tcW w:type="dxa" w:w="1728"/>
+          </w:tcPr>
+          <w:p>
+            <w:pPr>
+              <w:keepLines/>
+              <w:jc w:val="center"/>
+            </w:pPr>
+            <w:r>
+              <w:t>80.6</w:t>
+            </w:r>
+          </w:p>
+        </w:tc>
+        <w:tc>
+          <w:tcPr>
+            <w:tcW w:type="dxa" w:w="1728"/>
+          </w:tcPr>
+          <w:p>
+            <w:pPr>
+              <w:keepLines/>
+              <w:jc w:val="center"/>
+            </w:pPr>
+            <w:r>
+              <w:t>54.1</w:t>
+            </w:r>
+          </w:p>
+        </w:tc>
+        <w:tc>
+          <w:tcPr>
+            <w:tcW w:type="dxa" w:w="1728"/>
+          </w:tcPr>
+          <w:p>
+            <w:pPr>
+              <w:keepLines/>
+              <w:jc w:val="center"/>
+            </w:pPr>
+            <w:r>
+              <w:t>54.5</w:t>
             </w:r>
           </w:p>
         </w:tc>
@@ -983,7 +983,7 @@
         <w:tblLook w:firstColumn="1" w:firstRow="1" w:lastColumn="0" w:lastRow="0" w:noHBand="0" w:noVBand="1" w:val="04A0"/>
       </w:tblPr>
       <w:tblGrid>
-        <w:gridCol w:w="2835"/>
+        <w:gridCol w:w="4535"/>
         <w:gridCol w:w="1289"/>
         <w:gridCol w:w="1289"/>
         <w:gridCol w:w="1289"/>
@@ -994,10 +994,11 @@
       <w:tr>
         <w:tc>
           <w:tcPr>
-            <w:tcW w:type="dxa" w:w="2835"/>
-          </w:tcPr>
-          <w:p>
-            <w:pPr>
+            <w:tcW w:type="dxa" w:w="4535"/>
+          </w:tcPr>
+          <w:p>
+            <w:pPr>
+              <w:keepLines/>
               <w:jc w:val="center"/>
             </w:pPr>
             <w:r>
@@ -1051,10 +1052,11 @@
       <w:tr>
         <w:tc>
           <w:tcPr>
-            <w:tcW w:type="dxa" w:w="2835"/>
-          </w:tcPr>
-          <w:p>
-            <w:pPr>
+            <w:tcW w:type="dxa" w:w="4535"/>
+          </w:tcPr>
+          <w:p>
+            <w:pPr>
+              <w:keepLines/>
               <w:jc w:val="center"/>
             </w:pPr>
             <w:r/>
@@ -1142,10 +1144,11 @@
       <w:tr>
         <w:tc>
           <w:tcPr>
-            <w:tcW w:type="dxa" w:w="2835"/>
-          </w:tcPr>
-          <w:p>
-            <w:pPr>
+            <w:tcW w:type="dxa" w:w="4535"/>
+          </w:tcPr>
+          <w:p>
+            <w:pPr>
+              <w:keepLines/>
               <w:jc w:val="left"/>
             </w:pPr>
             <w:r>
@@ -1235,10 +1238,11 @@
       <w:tr>
         <w:tc>
           <w:tcPr>
-            <w:tcW w:type="dxa" w:w="2835"/>
-          </w:tcPr>
-          <w:p>
-            <w:pPr>
+            <w:tcW w:type="dxa" w:w="4535"/>
+          </w:tcPr>
+          <w:p>
+            <w:pPr>
+              <w:keepLines/>
               <w:jc w:val="left"/>
             </w:pPr>
             <w:r>
@@ -1328,10 +1332,11 @@
       <w:tr>
         <w:tc>
           <w:tcPr>
-            <w:tcW w:type="dxa" w:w="2835"/>
-          </w:tcPr>
-          <w:p>
-            <w:pPr>
+            <w:tcW w:type="dxa" w:w="4535"/>
+          </w:tcPr>
+          <w:p>
+            <w:pPr>
+              <w:keepLines/>
               <w:jc w:val="left"/>
             </w:pPr>
             <w:r>
@@ -1421,10 +1426,11 @@
       <w:tr>
         <w:tc>
           <w:tcPr>
-            <w:tcW w:type="dxa" w:w="2835"/>
-          </w:tcPr>
-          <w:p>
-            <w:pPr>
+            <w:tcW w:type="dxa" w:w="4535"/>
+          </w:tcPr>
+          <w:p>
+            <w:pPr>
+              <w:keepLines/>
               <w:jc w:val="left"/>
             </w:pPr>
             <w:r>
@@ -1514,10 +1520,11 @@
       <w:tr>
         <w:tc>
           <w:tcPr>
-            <w:tcW w:type="dxa" w:w="2835"/>
-          </w:tcPr>
-          <w:p>
-            <w:pPr>
+            <w:tcW w:type="dxa" w:w="4535"/>
+          </w:tcPr>
+          <w:p>
+            <w:pPr>
+              <w:keepLines/>
               <w:jc w:val="left"/>
             </w:pPr>
             <w:r>
@@ -1607,10 +1614,11 @@
       <w:tr>
         <w:tc>
           <w:tcPr>
-            <w:tcW w:type="dxa" w:w="2835"/>
-          </w:tcPr>
-          <w:p>
-            <w:pPr>
+            <w:tcW w:type="dxa" w:w="4535"/>
+          </w:tcPr>
+          <w:p>
+            <w:pPr>
+              <w:keepLines/>
               <w:jc w:val="left"/>
             </w:pPr>
             <w:r>
@@ -1700,10 +1708,11 @@
       <w:tr>
         <w:tc>
           <w:tcPr>
-            <w:tcW w:type="dxa" w:w="2835"/>
-          </w:tcPr>
-          <w:p>
-            <w:pPr>
+            <w:tcW w:type="dxa" w:w="4535"/>
+          </w:tcPr>
+          <w:p>
+            <w:pPr>
+              <w:keepLines/>
               <w:jc w:val="left"/>
             </w:pPr>
             <w:r>
@@ -1793,10 +1802,11 @@
       <w:tr>
         <w:tc>
           <w:tcPr>
-            <w:tcW w:type="dxa" w:w="2835"/>
-          </w:tcPr>
-          <w:p>
-            <w:pPr>
+            <w:tcW w:type="dxa" w:w="4535"/>
+          </w:tcPr>
+          <w:p>
+            <w:pPr>
+              <w:keepLines/>
               <w:jc w:val="left"/>
             </w:pPr>
             <w:r>
@@ -1886,10 +1896,11 @@
       <w:tr>
         <w:tc>
           <w:tcPr>
-            <w:tcW w:type="dxa" w:w="2835"/>
-          </w:tcPr>
-          <w:p>
-            <w:pPr>
+            <w:tcW w:type="dxa" w:w="4535"/>
+          </w:tcPr>
+          <w:p>
+            <w:pPr>
+              <w:keepLines/>
               <w:jc w:val="left"/>
             </w:pPr>
             <w:r>
@@ -1979,10 +1990,11 @@
       <w:tr>
         <w:tc>
           <w:tcPr>
-            <w:tcW w:type="dxa" w:w="2835"/>
-          </w:tcPr>
-          <w:p>
-            <w:pPr>
+            <w:tcW w:type="dxa" w:w="4535"/>
+          </w:tcPr>
+          <w:p>
+            <w:pPr>
+              <w:keepLines/>
               <w:jc w:val="left"/>
             </w:pPr>
             <w:r>
@@ -2072,10 +2084,11 @@
       <w:tr>
         <w:tc>
           <w:tcPr>
-            <w:tcW w:type="dxa" w:w="2835"/>
-          </w:tcPr>
-          <w:p>
-            <w:pPr>
+            <w:tcW w:type="dxa" w:w="4535"/>
+          </w:tcPr>
+          <w:p>
+            <w:pPr>
+              <w:keepLines/>
               <w:jc w:val="left"/>
             </w:pPr>
             <w:r>
@@ -2163,6 +2176,11 @@
         </w:tc>
       </w:tr>
     </w:tbl>
+    <w:p>
+      <w:r>
+        <w:br/>
+      </w:r>
+    </w:p>
     <w:p>
       <w:r>
         <w:drawing>

</xml_diff>

<commit_message>
Zdaj se stil 1. tabele prebere iz excela. Uporabnik zdaj na začetku vnese ID, ne Meritev.id.
</commit_message>
<xml_diff>
--- a/Fšfebr2026_odrasli.docx
+++ b/Fšfebr2026_odrasli.docx
@@ -1,8 +1,11 @@
 
 <file path=word/document.xml><?xml version="1.0" encoding="utf-8"?>
-<w:document xmlns:wpc="http://schemas.microsoft.com/office/word/2010/wordprocessingCanvas" xmlns:cx="http://schemas.microsoft.com/office/drawing/2014/chartex" xmlns:cx1="http://schemas.microsoft.com/office/drawing/2015/9/8/chartex" xmlns:cx2="http://schemas.microsoft.com/office/drawing/2015/10/21/chartex" xmlns:cx3="http://schemas.microsoft.com/office/drawing/2016/5/9/chartex" xmlns:cx4="http://schemas.microsoft.com/office/drawing/2016/5/10/chartex" xmlns:cx5="http://schemas.microsoft.com/office/drawing/2016/5/11/chartex" xmlns:cx6="http://schemas.microsoft.com/office/drawing/2016/5/12/chartex" xmlns:cx7="http://schemas.microsoft.com/office/drawing/2016/5/13/chartex" xmlns:cx8="http://schemas.microsoft.com/office/drawing/2016/5/14/chartex" xmlns:mc="http://schemas.openxmlformats.org/markup-compatibility/2006" xmlns:aink="http://schemas.microsoft.com/office/drawing/2016/ink" xmlns:am3d="http://schemas.microsoft.com/office/drawing/2017/model3d" xmlns:o="urn:schemas-microsoft-com:office:office" xmlns:oel="http://schemas.microsoft.com/office/2019/extlst" xmlns:r="http://schemas.openxmlformats.org/officeDocument/2006/relationships" xmlns:m="http://schemas.openxmlformats.org/officeDocument/2006/math" xmlns:v="urn:schemas-microsoft-com:vml" xmlns:wp14="http://schemas.microsoft.com/office/word/2010/wordprocessingDrawing" xmlns:wp="http://schemas.openxmlformats.org/drawingml/2006/wordprocessingDrawing" xmlns:w10="urn:schemas-microsoft-com:office:word" xmlns:w="http://schemas.openxmlformats.org/wordprocessingml/2006/main" xmlns:w14="http://schemas.microsoft.com/office/word/2010/wordml" xmlns:w15="http://schemas.microsoft.com/office/word/2012/wordml" xmlns:w16cex="http://schemas.microsoft.com/office/word/2018/wordml/cex" xmlns:w16cid="http://schemas.microsoft.com/office/word/2016/wordml/cid" xmlns:w16="http://schemas.microsoft.com/office/word/2018/wordml" xmlns:w16du="http://schemas.microsoft.com/office/word/2023/wordml/word16du" xmlns:w16sdtdh="http://schemas.microsoft.com/office/word/2020/wordml/sdtdatahash" xmlns:w16sdtfl="http://schemas.microsoft.com/office/word/2024/wordml/sdtformatlock" xmlns:w16se="http://schemas.microsoft.com/office/word/2015/wordml/symex" xmlns:wpg="http://schemas.microsoft.com/office/word/2010/wordprocessingGroup" xmlns:wpi="http://schemas.microsoft.com/office/word/2010/wordprocessingInk" xmlns:wne="http://schemas.microsoft.com/office/word/2006/wordml" xmlns:wps="http://schemas.microsoft.com/office/word/2010/wordprocessingShape" mc:Ignorable="w14 w15 w16se w16cid w16 w16cex w16sdtdh w16sdtfl w16du wp14">
+<w:document xmlns:wpc="http://schemas.microsoft.com/office/word/2010/wordprocessingCanvas" xmlns:mc="http://schemas.openxmlformats.org/markup-compatibility/2006" xmlns:o="urn:schemas-microsoft-com:office:office" xmlns:r="http://schemas.openxmlformats.org/officeDocument/2006/relationships" xmlns:m="http://schemas.openxmlformats.org/officeDocument/2006/math" xmlns:v="urn:schemas-microsoft-com:vml" xmlns:wp14="http://schemas.microsoft.com/office/word/2010/wordprocessingDrawing" xmlns:wp="http://schemas.openxmlformats.org/drawingml/2006/wordprocessingDrawing" xmlns:w10="urn:schemas-microsoft-com:office:word" xmlns:w="http://schemas.openxmlformats.org/wordprocessingml/2006/main" xmlns:w14="http://schemas.microsoft.com/office/word/2010/wordml" xmlns:wpg="http://schemas.microsoft.com/office/word/2010/wordprocessingGroup" xmlns:wpi="http://schemas.microsoft.com/office/word/2010/wordprocessingInk" xmlns:wne="http://schemas.microsoft.com/office/word/2006/wordml" xmlns:wps="http://schemas.microsoft.com/office/word/2010/wordprocessingShape" mc:Ignorable="w14 wp14">
   <w:body>
-    <w:p/>
+    <w:p>
+      <w:bookmarkStart w:id="0" w:name="_GoBack"/>
+      <w:bookmarkEnd w:id="0"/>
+    </w:p>
     <w:p>
       <w:pPr>
         <w:pStyle w:val="Heading1"/>
@@ -37,12 +40,12 @@
     </w:p>
     <w:p>
       <w:r>
-        <w:t>Kraj meritev: Gortanova 22, 1000 Ljubljana</w:t>
+        <w:t>Kraj izvajalca: Gortanova 22, 1000 Ljubljana</w:t>
       </w:r>
     </w:p>
     <w:p>
       <w:r>
-        <w:t>Administrator: Premelč Jerneja</w:t>
+        <w:t>Administrator izvajalca: Premelč Jerneja</w:t>
       </w:r>
     </w:p>
     <w:p>
@@ -57,7 +60,7 @@
     </w:p>
     <w:p>
       <w:r>
-        <w:t>Število udeležencev ZV: 30</w:t>
+        <w:t>Število udeležencev skupine ZmigajSdv: 30</w:t>
       </w:r>
     </w:p>
     <w:p>
@@ -91,7 +94,7 @@
     </w:p>
     <w:p>
       <w:r>
-        <w:t>Pri testih, pri katerih je zaželen nižji rezultat (npr. 6-minutni test hoje, Obseg pasu) so centili “obrnjeni” (100-centil), tako da v spodnji tabeli in grafikonu višje povprečje vedno pomeni boljši rezultat.</w:t>
+        <w:t>Pri testih, pri katerih je zaželen nižji rezultat (npr. 6-minutni test hoje, Obseg pasu) so centili “obrnjeni” (100-centil), tako da v spodnji tabeli in grafikonu višje povprečje vedno pomeni boljši rezultat. Ti testi so označeni z *</w:t>
       </w:r>
     </w:p>
     <w:tbl>
@@ -938,7 +941,7 @@
                     <pic:cNvPicPr/>
                   </pic:nvPicPr>
                   <pic:blipFill>
-                    <a:blip r:embed="rId14"/>
+                    <a:blip r:embed="rId15"/>
                     <a:stretch>
                       <a:fillRect/>
                     </a:stretch>
@@ -2198,7 +2201,7 @@
                     <pic:cNvPicPr/>
                   </pic:nvPicPr>
                   <pic:blipFill>
-                    <a:blip r:embed="rId15"/>
+                    <a:blip r:embed="rId16"/>
                     <a:stretch>
                       <a:fillRect/>
                     </a:stretch>
@@ -2223,12 +2226,12 @@
       </w:r>
     </w:p>
     <w:sectPr>
-      <w:headerReference w:type="even" r:id="rId6"/>
-      <w:headerReference w:type="default" r:id="rId7"/>
-      <w:footerReference w:type="even" r:id="rId8"/>
-      <w:footerReference w:type="default" r:id="rId9"/>
-      <w:headerReference w:type="first" r:id="rId10"/>
-      <w:footerReference w:type="first" r:id="rId11"/>
+      <w:headerReference w:type="even" r:id="rId7"/>
+      <w:headerReference w:type="default" r:id="rId8"/>
+      <w:footerReference w:type="even" r:id="rId9"/>
+      <w:footerReference w:type="default" r:id="rId10"/>
+      <w:headerReference w:type="first" r:id="rId11"/>
+      <w:footerReference w:type="first" r:id="rId12"/>
       <w:pgSz w:w="11906" w:h="16838"/>
       <w:pgMar w:top="1440" w:right="1440" w:bottom="1440" w:left="1440" w:header="708" w:footer="708" w:gutter="0"/>
       <w:cols w:space="708"/>
@@ -2239,7 +2242,7 @@
 </file>
 
 <file path=word/endnotes.xml><?xml version="1.0" encoding="utf-8"?>
-<w:endnotes xmlns:wpc="http://schemas.microsoft.com/office/word/2010/wordprocessingCanvas" xmlns:cx="http://schemas.microsoft.com/office/drawing/2014/chartex" xmlns:cx1="http://schemas.microsoft.com/office/drawing/2015/9/8/chartex" xmlns:cx2="http://schemas.microsoft.com/office/drawing/2015/10/21/chartex" xmlns:cx3="http://schemas.microsoft.com/office/drawing/2016/5/9/chartex" xmlns:cx4="http://schemas.microsoft.com/office/drawing/2016/5/10/chartex" xmlns:cx5="http://schemas.microsoft.com/office/drawing/2016/5/11/chartex" xmlns:cx6="http://schemas.microsoft.com/office/drawing/2016/5/12/chartex" xmlns:cx7="http://schemas.microsoft.com/office/drawing/2016/5/13/chartex" xmlns:cx8="http://schemas.microsoft.com/office/drawing/2016/5/14/chartex" xmlns:mc="http://schemas.openxmlformats.org/markup-compatibility/2006" xmlns:aink="http://schemas.microsoft.com/office/drawing/2016/ink" xmlns:am3d="http://schemas.microsoft.com/office/drawing/2017/model3d" xmlns:o="urn:schemas-microsoft-com:office:office" xmlns:oel="http://schemas.microsoft.com/office/2019/extlst" xmlns:r="http://schemas.openxmlformats.org/officeDocument/2006/relationships" xmlns:m="http://schemas.openxmlformats.org/officeDocument/2006/math" xmlns:v="urn:schemas-microsoft-com:vml" xmlns:wp14="http://schemas.microsoft.com/office/word/2010/wordprocessingDrawing" xmlns:wp="http://schemas.openxmlformats.org/drawingml/2006/wordprocessingDrawing" xmlns:w10="urn:schemas-microsoft-com:office:word" xmlns:w="http://schemas.openxmlformats.org/wordprocessingml/2006/main" xmlns:w14="http://schemas.microsoft.com/office/word/2010/wordml" xmlns:w15="http://schemas.microsoft.com/office/word/2012/wordml" xmlns:w16cex="http://schemas.microsoft.com/office/word/2018/wordml/cex" xmlns:w16cid="http://schemas.microsoft.com/office/word/2016/wordml/cid" xmlns:w16="http://schemas.microsoft.com/office/word/2018/wordml" xmlns:w16du="http://schemas.microsoft.com/office/word/2023/wordml/word16du" xmlns:w16sdtdh="http://schemas.microsoft.com/office/word/2020/wordml/sdtdatahash" xmlns:w16sdtfl="http://schemas.microsoft.com/office/word/2024/wordml/sdtformatlock" xmlns:w16se="http://schemas.microsoft.com/office/word/2015/wordml/symex" xmlns:wpg="http://schemas.microsoft.com/office/word/2010/wordprocessingGroup" xmlns:wpi="http://schemas.microsoft.com/office/word/2010/wordprocessingInk" xmlns:wne="http://schemas.microsoft.com/office/word/2006/wordml" xmlns:wps="http://schemas.microsoft.com/office/word/2010/wordprocessingShape" mc:Ignorable="w14 w15 w16se w16cid w16 w16cex w16sdtdh w16sdtfl w16du wp14">
+<w:endnotes xmlns:wpc="http://schemas.microsoft.com/office/word/2010/wordprocessingCanvas" xmlns:mc="http://schemas.openxmlformats.org/markup-compatibility/2006" xmlns:o="urn:schemas-microsoft-com:office:office" xmlns:r="http://schemas.openxmlformats.org/officeDocument/2006/relationships" xmlns:m="http://schemas.openxmlformats.org/officeDocument/2006/math" xmlns:v="urn:schemas-microsoft-com:vml" xmlns:wp14="http://schemas.microsoft.com/office/word/2010/wordprocessingDrawing" xmlns:wp="http://schemas.openxmlformats.org/drawingml/2006/wordprocessingDrawing" xmlns:w10="urn:schemas-microsoft-com:office:word" xmlns:w="http://schemas.openxmlformats.org/wordprocessingml/2006/main" xmlns:w14="http://schemas.microsoft.com/office/word/2010/wordml" xmlns:wpg="http://schemas.microsoft.com/office/word/2010/wordprocessingGroup" xmlns:wpi="http://schemas.microsoft.com/office/word/2010/wordprocessingInk" xmlns:wne="http://schemas.microsoft.com/office/word/2006/wordml" xmlns:wps="http://schemas.microsoft.com/office/word/2010/wordprocessingShape" mc:Ignorable="w14 wp14">
   <w:endnote w:type="separator" w:id="-1">
     <w:p>
       <w:pPr>
@@ -2264,7 +2267,7 @@
 </file>
 
 <file path=word/footer1.xml><?xml version="1.0" encoding="utf-8"?>
-<w:ftr xmlns:wpc="http://schemas.microsoft.com/office/word/2010/wordprocessingCanvas" xmlns:cx="http://schemas.microsoft.com/office/drawing/2014/chartex" xmlns:cx1="http://schemas.microsoft.com/office/drawing/2015/9/8/chartex" xmlns:cx2="http://schemas.microsoft.com/office/drawing/2015/10/21/chartex" xmlns:cx3="http://schemas.microsoft.com/office/drawing/2016/5/9/chartex" xmlns:cx4="http://schemas.microsoft.com/office/drawing/2016/5/10/chartex" xmlns:cx5="http://schemas.microsoft.com/office/drawing/2016/5/11/chartex" xmlns:cx6="http://schemas.microsoft.com/office/drawing/2016/5/12/chartex" xmlns:cx7="http://schemas.microsoft.com/office/drawing/2016/5/13/chartex" xmlns:cx8="http://schemas.microsoft.com/office/drawing/2016/5/14/chartex" xmlns:mc="http://schemas.openxmlformats.org/markup-compatibility/2006" xmlns:aink="http://schemas.microsoft.com/office/drawing/2016/ink" xmlns:am3d="http://schemas.microsoft.com/office/drawing/2017/model3d" xmlns:o="urn:schemas-microsoft-com:office:office" xmlns:oel="http://schemas.microsoft.com/office/2019/extlst" xmlns:r="http://schemas.openxmlformats.org/officeDocument/2006/relationships" xmlns:m="http://schemas.openxmlformats.org/officeDocument/2006/math" xmlns:v="urn:schemas-microsoft-com:vml" xmlns:wp14="http://schemas.microsoft.com/office/word/2010/wordprocessingDrawing" xmlns:wp="http://schemas.openxmlformats.org/drawingml/2006/wordprocessingDrawing" xmlns:w10="urn:schemas-microsoft-com:office:word" xmlns:w="http://schemas.openxmlformats.org/wordprocessingml/2006/main" xmlns:w14="http://schemas.microsoft.com/office/word/2010/wordml" xmlns:w15="http://schemas.microsoft.com/office/word/2012/wordml" xmlns:w16cex="http://schemas.microsoft.com/office/word/2018/wordml/cex" xmlns:w16cid="http://schemas.microsoft.com/office/word/2016/wordml/cid" xmlns:w16="http://schemas.microsoft.com/office/word/2018/wordml" xmlns:w16du="http://schemas.microsoft.com/office/word/2023/wordml/word16du" xmlns:w16sdtdh="http://schemas.microsoft.com/office/word/2020/wordml/sdtdatahash" xmlns:w16sdtfl="http://schemas.microsoft.com/office/word/2024/wordml/sdtformatlock" xmlns:w16se="http://schemas.microsoft.com/office/word/2015/wordml/symex" xmlns:wpg="http://schemas.microsoft.com/office/word/2010/wordprocessingGroup" xmlns:wpi="http://schemas.microsoft.com/office/word/2010/wordprocessingInk" xmlns:wne="http://schemas.microsoft.com/office/word/2006/wordml" xmlns:wps="http://schemas.microsoft.com/office/word/2010/wordprocessingShape" mc:Ignorable="w14 w15 w16se w16cid w16 w16cex w16sdtdh w16sdtfl w16du wp14">
+<w:ftr xmlns:wpc="http://schemas.microsoft.com/office/word/2010/wordprocessingCanvas" xmlns:mc="http://schemas.openxmlformats.org/markup-compatibility/2006" xmlns:o="urn:schemas-microsoft-com:office:office" xmlns:r="http://schemas.openxmlformats.org/officeDocument/2006/relationships" xmlns:m="http://schemas.openxmlformats.org/officeDocument/2006/math" xmlns:v="urn:schemas-microsoft-com:vml" xmlns:wp14="http://schemas.microsoft.com/office/word/2010/wordprocessingDrawing" xmlns:wp="http://schemas.openxmlformats.org/drawingml/2006/wordprocessingDrawing" xmlns:w10="urn:schemas-microsoft-com:office:word" xmlns:w="http://schemas.openxmlformats.org/wordprocessingml/2006/main" xmlns:w14="http://schemas.microsoft.com/office/word/2010/wordml" xmlns:wpg="http://schemas.microsoft.com/office/word/2010/wordprocessingGroup" xmlns:wpi="http://schemas.microsoft.com/office/word/2010/wordprocessingInk" xmlns:wne="http://schemas.microsoft.com/office/word/2006/wordml" xmlns:wps="http://schemas.microsoft.com/office/word/2010/wordprocessingShape" mc:Ignorable="w14 wp14">
   <w:p>
     <w:pPr>
       <w:pStyle w:val="Footer"/>
@@ -2274,7 +2277,7 @@
 </file>
 
 <file path=word/footer2.xml><?xml version="1.0" encoding="utf-8"?>
-<w:ftr xmlns:wpc="http://schemas.microsoft.com/office/word/2010/wordprocessingCanvas" xmlns:cx="http://schemas.microsoft.com/office/drawing/2014/chartex" xmlns:cx1="http://schemas.microsoft.com/office/drawing/2015/9/8/chartex" xmlns:cx2="http://schemas.microsoft.com/office/drawing/2015/10/21/chartex" xmlns:cx3="http://schemas.microsoft.com/office/drawing/2016/5/9/chartex" xmlns:cx4="http://schemas.microsoft.com/office/drawing/2016/5/10/chartex" xmlns:cx5="http://schemas.microsoft.com/office/drawing/2016/5/11/chartex" xmlns:cx6="http://schemas.microsoft.com/office/drawing/2016/5/12/chartex" xmlns:cx7="http://schemas.microsoft.com/office/drawing/2016/5/13/chartex" xmlns:cx8="http://schemas.microsoft.com/office/drawing/2016/5/14/chartex" xmlns:mc="http://schemas.openxmlformats.org/markup-compatibility/2006" xmlns:aink="http://schemas.microsoft.com/office/drawing/2016/ink" xmlns:am3d="http://schemas.microsoft.com/office/drawing/2017/model3d" xmlns:o="urn:schemas-microsoft-com:office:office" xmlns:oel="http://schemas.microsoft.com/office/2019/extlst" xmlns:r="http://schemas.openxmlformats.org/officeDocument/2006/relationships" xmlns:m="http://schemas.openxmlformats.org/officeDocument/2006/math" xmlns:v="urn:schemas-microsoft-com:vml" xmlns:wp14="http://schemas.microsoft.com/office/word/2010/wordprocessingDrawing" xmlns:wp="http://schemas.openxmlformats.org/drawingml/2006/wordprocessingDrawing" xmlns:w10="urn:schemas-microsoft-com:office:word" xmlns:w="http://schemas.openxmlformats.org/wordprocessingml/2006/main" xmlns:w14="http://schemas.microsoft.com/office/word/2010/wordml" xmlns:w15="http://schemas.microsoft.com/office/word/2012/wordml" xmlns:w16cex="http://schemas.microsoft.com/office/word/2018/wordml/cex" xmlns:w16cid="http://schemas.microsoft.com/office/word/2016/wordml/cid" xmlns:w16="http://schemas.microsoft.com/office/word/2018/wordml" xmlns:w16du="http://schemas.microsoft.com/office/word/2023/wordml/word16du" xmlns:w16sdtdh="http://schemas.microsoft.com/office/word/2020/wordml/sdtdatahash" xmlns:w16sdtfl="http://schemas.microsoft.com/office/word/2024/wordml/sdtformatlock" xmlns:w16se="http://schemas.microsoft.com/office/word/2015/wordml/symex" xmlns:wpg="http://schemas.microsoft.com/office/word/2010/wordprocessingGroup" xmlns:wpi="http://schemas.microsoft.com/office/word/2010/wordprocessingInk" xmlns:wne="http://schemas.microsoft.com/office/word/2006/wordml" xmlns:wps="http://schemas.microsoft.com/office/word/2010/wordprocessingShape" mc:Ignorable="w14 w15 w16se w16cid w16 w16cex w16sdtdh w16sdtfl w16du wp14">
+<w:ftr xmlns:wpc="http://schemas.microsoft.com/office/word/2010/wordprocessingCanvas" xmlns:mc="http://schemas.openxmlformats.org/markup-compatibility/2006" xmlns:o="urn:schemas-microsoft-com:office:office" xmlns:r="http://schemas.openxmlformats.org/officeDocument/2006/relationships" xmlns:m="http://schemas.openxmlformats.org/officeDocument/2006/math" xmlns:v="urn:schemas-microsoft-com:vml" xmlns:wp14="http://schemas.microsoft.com/office/word/2010/wordprocessingDrawing" xmlns:wp="http://schemas.openxmlformats.org/drawingml/2006/wordprocessingDrawing" xmlns:w10="urn:schemas-microsoft-com:office:word" xmlns:w="http://schemas.openxmlformats.org/wordprocessingml/2006/main" xmlns:w14="http://schemas.microsoft.com/office/word/2010/wordml" xmlns:wpg="http://schemas.microsoft.com/office/word/2010/wordprocessingGroup" xmlns:wpi="http://schemas.microsoft.com/office/word/2010/wordprocessingInk" xmlns:wne="http://schemas.microsoft.com/office/word/2006/wordml" xmlns:wps="http://schemas.microsoft.com/office/word/2010/wordprocessingShape" mc:Ignorable="w14 wp14">
   <w:p>
     <w:pPr>
       <w:pStyle w:val="Footer"/>
@@ -2314,7 +2317,6 @@
               <w:noProof/>
               <w:sz w:val="20"/>
               <w:szCs w:val="20"/>
-              <w:lang w:val="sl-SI"/>
             </w:rPr>
           </w:pPr>
           <w:r>
@@ -2323,7 +2325,6 @@
               <w:noProof/>
               <w:sz w:val="20"/>
               <w:szCs w:val="20"/>
-              <w:lang w:val="sl-SI"/>
             </w:rPr>
             <w:t>Projekt:</w:t>
           </w:r>
@@ -2333,7 +2334,6 @@
               <w:noProof/>
               <w:sz w:val="20"/>
               <w:szCs w:val="20"/>
-              <w:lang w:val="sl-SI"/>
             </w:rPr>
             <w:br/>
           </w:r>
@@ -2345,7 +2345,6 @@
                 <w:noProof/>
                 <w:sz w:val="20"/>
                 <w:szCs w:val="20"/>
-                <w:lang w:val="sl-SI"/>
               </w:rPr>
               <w:t>Zmigaj se do vadbe</w:t>
             </w:r>
@@ -2356,7 +2355,6 @@
               <w:noProof/>
               <w:sz w:val="20"/>
               <w:szCs w:val="20"/>
-              <w:lang w:val="sl-SI"/>
             </w:rPr>
             <w:br/>
             <w:t>Olimpijski komite Slovenije</w:t>
@@ -2376,7 +2374,6 @@
               <w:noProof/>
               <w:sz w:val="20"/>
               <w:szCs w:val="20"/>
-              <w:lang w:val="sl-SI"/>
             </w:rPr>
           </w:pPr>
           <w:r>
@@ -2385,7 +2382,7 @@
               <w:noProof/>
               <w:sz w:val="20"/>
               <w:szCs w:val="20"/>
-              <w:lang w:val="sl-SI"/>
+              <w:lang w:eastAsia="sl-SI"/>
             </w:rPr>
             <w:drawing>
               <wp:inline distT="0" distB="0" distL="0" distR="0" wp14:anchorId="46A972DC" wp14:editId="56630B5C">
@@ -2450,7 +2447,6 @@
               <w:noProof/>
               <w:sz w:val="20"/>
               <w:szCs w:val="20"/>
-              <w:lang w:val="sl-SI"/>
             </w:rPr>
           </w:pPr>
           <w:r>
@@ -2459,7 +2455,6 @@
               <w:noProof/>
               <w:sz w:val="20"/>
               <w:szCs w:val="20"/>
-              <w:lang w:val="sl-SI"/>
             </w:rPr>
             <w:t>Analiza:</w:t>
           </w:r>
@@ -2469,18 +2464,8 @@
               <w:noProof/>
               <w:sz w:val="20"/>
               <w:szCs w:val="20"/>
-              <w:lang w:val="sl-SI"/>
             </w:rPr>
             <w:br/>
-          </w:r>
-          <w:r>
-            <w:rPr>
-              <w:rFonts w:ascii="Abadi ExtraLight" w:hAnsi="Abadi ExtraLight"/>
-              <w:noProof/>
-              <w:sz w:val="20"/>
-              <w:szCs w:val="20"/>
-              <w:lang w:val="sl-SI"/>
-            </w:rPr>
             <w:t>Univerza v Ljubljani</w:t>
           </w:r>
           <w:r>
@@ -2489,7 +2474,6 @@
               <w:noProof/>
               <w:sz w:val="20"/>
               <w:szCs w:val="20"/>
-              <w:lang w:val="sl-SI"/>
             </w:rPr>
             <w:tab/>
           </w:r>
@@ -2502,7 +2486,6 @@
               <w:noProof/>
               <w:sz w:val="20"/>
               <w:szCs w:val="20"/>
-              <w:lang w:val="sl-SI"/>
             </w:rPr>
           </w:pPr>
           <w:r>
@@ -2511,7 +2494,6 @@
               <w:noProof/>
               <w:sz w:val="20"/>
               <w:szCs w:val="20"/>
-              <w:lang w:val="sl-SI"/>
             </w:rPr>
             <w:t>Fakulteta za šport</w:t>
           </w:r>
@@ -2521,7 +2503,6 @@
               <w:noProof/>
               <w:sz w:val="20"/>
               <w:szCs w:val="20"/>
-              <w:lang w:val="sl-SI"/>
             </w:rPr>
             <w:br/>
           </w:r>
@@ -2533,7 +2514,6 @@
                 <w:noProof/>
                 <w:sz w:val="20"/>
                 <w:szCs w:val="20"/>
-                <w:lang w:val="sl-SI"/>
               </w:rPr>
               <w:t>Raziskovalna skupina SLOfit</w:t>
             </w:r>
@@ -2547,7 +2527,6 @@
               <w:noProof/>
               <w:sz w:val="20"/>
               <w:szCs w:val="20"/>
-              <w:lang w:val="sl-SI"/>
             </w:rPr>
           </w:pPr>
         </w:p>
@@ -2563,7 +2542,7 @@
 </file>
 
 <file path=word/footer3.xml><?xml version="1.0" encoding="utf-8"?>
-<w:ftr xmlns:wpc="http://schemas.microsoft.com/office/word/2010/wordprocessingCanvas" xmlns:cx="http://schemas.microsoft.com/office/drawing/2014/chartex" xmlns:cx1="http://schemas.microsoft.com/office/drawing/2015/9/8/chartex" xmlns:cx2="http://schemas.microsoft.com/office/drawing/2015/10/21/chartex" xmlns:cx3="http://schemas.microsoft.com/office/drawing/2016/5/9/chartex" xmlns:cx4="http://schemas.microsoft.com/office/drawing/2016/5/10/chartex" xmlns:cx5="http://schemas.microsoft.com/office/drawing/2016/5/11/chartex" xmlns:cx6="http://schemas.microsoft.com/office/drawing/2016/5/12/chartex" xmlns:cx7="http://schemas.microsoft.com/office/drawing/2016/5/13/chartex" xmlns:cx8="http://schemas.microsoft.com/office/drawing/2016/5/14/chartex" xmlns:mc="http://schemas.openxmlformats.org/markup-compatibility/2006" xmlns:aink="http://schemas.microsoft.com/office/drawing/2016/ink" xmlns:am3d="http://schemas.microsoft.com/office/drawing/2017/model3d" xmlns:o="urn:schemas-microsoft-com:office:office" xmlns:oel="http://schemas.microsoft.com/office/2019/extlst" xmlns:r="http://schemas.openxmlformats.org/officeDocument/2006/relationships" xmlns:m="http://schemas.openxmlformats.org/officeDocument/2006/math" xmlns:v="urn:schemas-microsoft-com:vml" xmlns:wp14="http://schemas.microsoft.com/office/word/2010/wordprocessingDrawing" xmlns:wp="http://schemas.openxmlformats.org/drawingml/2006/wordprocessingDrawing" xmlns:w10="urn:schemas-microsoft-com:office:word" xmlns:w="http://schemas.openxmlformats.org/wordprocessingml/2006/main" xmlns:w14="http://schemas.microsoft.com/office/word/2010/wordml" xmlns:w15="http://schemas.microsoft.com/office/word/2012/wordml" xmlns:w16cex="http://schemas.microsoft.com/office/word/2018/wordml/cex" xmlns:w16cid="http://schemas.microsoft.com/office/word/2016/wordml/cid" xmlns:w16="http://schemas.microsoft.com/office/word/2018/wordml" xmlns:w16du="http://schemas.microsoft.com/office/word/2023/wordml/word16du" xmlns:w16sdtdh="http://schemas.microsoft.com/office/word/2020/wordml/sdtdatahash" xmlns:w16sdtfl="http://schemas.microsoft.com/office/word/2024/wordml/sdtformatlock" xmlns:w16se="http://schemas.microsoft.com/office/word/2015/wordml/symex" xmlns:wpg="http://schemas.microsoft.com/office/word/2010/wordprocessingGroup" xmlns:wpi="http://schemas.microsoft.com/office/word/2010/wordprocessingInk" xmlns:wne="http://schemas.microsoft.com/office/word/2006/wordml" xmlns:wps="http://schemas.microsoft.com/office/word/2010/wordprocessingShape" mc:Ignorable="w14 w15 w16se w16cid w16 w16cex w16sdtdh w16sdtfl w16du wp14">
+<w:ftr xmlns:wpc="http://schemas.microsoft.com/office/word/2010/wordprocessingCanvas" xmlns:mc="http://schemas.openxmlformats.org/markup-compatibility/2006" xmlns:o="urn:schemas-microsoft-com:office:office" xmlns:r="http://schemas.openxmlformats.org/officeDocument/2006/relationships" xmlns:m="http://schemas.openxmlformats.org/officeDocument/2006/math" xmlns:v="urn:schemas-microsoft-com:vml" xmlns:wp14="http://schemas.microsoft.com/office/word/2010/wordprocessingDrawing" xmlns:wp="http://schemas.openxmlformats.org/drawingml/2006/wordprocessingDrawing" xmlns:w10="urn:schemas-microsoft-com:office:word" xmlns:w="http://schemas.openxmlformats.org/wordprocessingml/2006/main" xmlns:w14="http://schemas.microsoft.com/office/word/2010/wordml" xmlns:wpg="http://schemas.microsoft.com/office/word/2010/wordprocessingGroup" xmlns:wpi="http://schemas.microsoft.com/office/word/2010/wordprocessingInk" xmlns:wne="http://schemas.microsoft.com/office/word/2006/wordml" xmlns:wps="http://schemas.microsoft.com/office/word/2010/wordprocessingShape" mc:Ignorable="w14 wp14">
   <w:p>
     <w:pPr>
       <w:pStyle w:val="Footer"/>
@@ -2573,7 +2552,7 @@
 </file>
 
 <file path=word/footnotes.xml><?xml version="1.0" encoding="utf-8"?>
-<w:footnotes xmlns:wpc="http://schemas.microsoft.com/office/word/2010/wordprocessingCanvas" xmlns:cx="http://schemas.microsoft.com/office/drawing/2014/chartex" xmlns:cx1="http://schemas.microsoft.com/office/drawing/2015/9/8/chartex" xmlns:cx2="http://schemas.microsoft.com/office/drawing/2015/10/21/chartex" xmlns:cx3="http://schemas.microsoft.com/office/drawing/2016/5/9/chartex" xmlns:cx4="http://schemas.microsoft.com/office/drawing/2016/5/10/chartex" xmlns:cx5="http://schemas.microsoft.com/office/drawing/2016/5/11/chartex" xmlns:cx6="http://schemas.microsoft.com/office/drawing/2016/5/12/chartex" xmlns:cx7="http://schemas.microsoft.com/office/drawing/2016/5/13/chartex" xmlns:cx8="http://schemas.microsoft.com/office/drawing/2016/5/14/chartex" xmlns:mc="http://schemas.openxmlformats.org/markup-compatibility/2006" xmlns:aink="http://schemas.microsoft.com/office/drawing/2016/ink" xmlns:am3d="http://schemas.microsoft.com/office/drawing/2017/model3d" xmlns:o="urn:schemas-microsoft-com:office:office" xmlns:oel="http://schemas.microsoft.com/office/2019/extlst" xmlns:r="http://schemas.openxmlformats.org/officeDocument/2006/relationships" xmlns:m="http://schemas.openxmlformats.org/officeDocument/2006/math" xmlns:v="urn:schemas-microsoft-com:vml" xmlns:wp14="http://schemas.microsoft.com/office/word/2010/wordprocessingDrawing" xmlns:wp="http://schemas.openxmlformats.org/drawingml/2006/wordprocessingDrawing" xmlns:w10="urn:schemas-microsoft-com:office:word" xmlns:w="http://schemas.openxmlformats.org/wordprocessingml/2006/main" xmlns:w14="http://schemas.microsoft.com/office/word/2010/wordml" xmlns:w15="http://schemas.microsoft.com/office/word/2012/wordml" xmlns:w16cex="http://schemas.microsoft.com/office/word/2018/wordml/cex" xmlns:w16cid="http://schemas.microsoft.com/office/word/2016/wordml/cid" xmlns:w16="http://schemas.microsoft.com/office/word/2018/wordml" xmlns:w16du="http://schemas.microsoft.com/office/word/2023/wordml/word16du" xmlns:w16sdtdh="http://schemas.microsoft.com/office/word/2020/wordml/sdtdatahash" xmlns:w16sdtfl="http://schemas.microsoft.com/office/word/2024/wordml/sdtformatlock" xmlns:w16se="http://schemas.microsoft.com/office/word/2015/wordml/symex" xmlns:wpg="http://schemas.microsoft.com/office/word/2010/wordprocessingGroup" xmlns:wpi="http://schemas.microsoft.com/office/word/2010/wordprocessingInk" xmlns:wne="http://schemas.microsoft.com/office/word/2006/wordml" xmlns:wps="http://schemas.microsoft.com/office/word/2010/wordprocessingShape" mc:Ignorable="w14 w15 w16se w16cid w16 w16cex w16sdtdh w16sdtfl w16du wp14">
+<w:footnotes xmlns:wpc="http://schemas.microsoft.com/office/word/2010/wordprocessingCanvas" xmlns:mc="http://schemas.openxmlformats.org/markup-compatibility/2006" xmlns:o="urn:schemas-microsoft-com:office:office" xmlns:r="http://schemas.openxmlformats.org/officeDocument/2006/relationships" xmlns:m="http://schemas.openxmlformats.org/officeDocument/2006/math" xmlns:v="urn:schemas-microsoft-com:vml" xmlns:wp14="http://schemas.microsoft.com/office/word/2010/wordprocessingDrawing" xmlns:wp="http://schemas.openxmlformats.org/drawingml/2006/wordprocessingDrawing" xmlns:w10="urn:schemas-microsoft-com:office:word" xmlns:w="http://schemas.openxmlformats.org/wordprocessingml/2006/main" xmlns:w14="http://schemas.microsoft.com/office/word/2010/wordml" xmlns:wpg="http://schemas.microsoft.com/office/word/2010/wordprocessingGroup" xmlns:wpi="http://schemas.microsoft.com/office/word/2010/wordprocessingInk" xmlns:wne="http://schemas.microsoft.com/office/word/2006/wordml" xmlns:wps="http://schemas.microsoft.com/office/word/2010/wordprocessingShape" mc:Ignorable="w14 wp14">
   <w:footnote w:type="separator" w:id="-1">
     <w:p>
       <w:pPr>
@@ -2598,7 +2577,7 @@
 </file>
 
 <file path=word/header1.xml><?xml version="1.0" encoding="utf-8"?>
-<w:hdr xmlns:wpc="http://schemas.microsoft.com/office/word/2010/wordprocessingCanvas" xmlns:cx="http://schemas.microsoft.com/office/drawing/2014/chartex" xmlns:cx1="http://schemas.microsoft.com/office/drawing/2015/9/8/chartex" xmlns:cx2="http://schemas.microsoft.com/office/drawing/2015/10/21/chartex" xmlns:cx3="http://schemas.microsoft.com/office/drawing/2016/5/9/chartex" xmlns:cx4="http://schemas.microsoft.com/office/drawing/2016/5/10/chartex" xmlns:cx5="http://schemas.microsoft.com/office/drawing/2016/5/11/chartex" xmlns:cx6="http://schemas.microsoft.com/office/drawing/2016/5/12/chartex" xmlns:cx7="http://schemas.microsoft.com/office/drawing/2016/5/13/chartex" xmlns:cx8="http://schemas.microsoft.com/office/drawing/2016/5/14/chartex" xmlns:mc="http://schemas.openxmlformats.org/markup-compatibility/2006" xmlns:aink="http://schemas.microsoft.com/office/drawing/2016/ink" xmlns:am3d="http://schemas.microsoft.com/office/drawing/2017/model3d" xmlns:o="urn:schemas-microsoft-com:office:office" xmlns:oel="http://schemas.microsoft.com/office/2019/extlst" xmlns:r="http://schemas.openxmlformats.org/officeDocument/2006/relationships" xmlns:m="http://schemas.openxmlformats.org/officeDocument/2006/math" xmlns:v="urn:schemas-microsoft-com:vml" xmlns:wp14="http://schemas.microsoft.com/office/word/2010/wordprocessingDrawing" xmlns:wp="http://schemas.openxmlformats.org/drawingml/2006/wordprocessingDrawing" xmlns:w10="urn:schemas-microsoft-com:office:word" xmlns:w="http://schemas.openxmlformats.org/wordprocessingml/2006/main" xmlns:w14="http://schemas.microsoft.com/office/word/2010/wordml" xmlns:w15="http://schemas.microsoft.com/office/word/2012/wordml" xmlns:w16cex="http://schemas.microsoft.com/office/word/2018/wordml/cex" xmlns:w16cid="http://schemas.microsoft.com/office/word/2016/wordml/cid" xmlns:w16="http://schemas.microsoft.com/office/word/2018/wordml" xmlns:w16du="http://schemas.microsoft.com/office/word/2023/wordml/word16du" xmlns:w16sdtdh="http://schemas.microsoft.com/office/word/2020/wordml/sdtdatahash" xmlns:w16sdtfl="http://schemas.microsoft.com/office/word/2024/wordml/sdtformatlock" xmlns:w16se="http://schemas.microsoft.com/office/word/2015/wordml/symex" xmlns:wpg="http://schemas.microsoft.com/office/word/2010/wordprocessingGroup" xmlns:wpi="http://schemas.microsoft.com/office/word/2010/wordprocessingInk" xmlns:wne="http://schemas.microsoft.com/office/word/2006/wordml" xmlns:wps="http://schemas.microsoft.com/office/word/2010/wordprocessingShape" mc:Ignorable="w14 w15 w16se w16cid w16 w16cex w16sdtdh w16sdtfl w16du wp14">
+<w:hdr xmlns:wpc="http://schemas.microsoft.com/office/word/2010/wordprocessingCanvas" xmlns:mc="http://schemas.openxmlformats.org/markup-compatibility/2006" xmlns:o="urn:schemas-microsoft-com:office:office" xmlns:r="http://schemas.openxmlformats.org/officeDocument/2006/relationships" xmlns:m="http://schemas.openxmlformats.org/officeDocument/2006/math" xmlns:v="urn:schemas-microsoft-com:vml" xmlns:wp14="http://schemas.microsoft.com/office/word/2010/wordprocessingDrawing" xmlns:wp="http://schemas.openxmlformats.org/drawingml/2006/wordprocessingDrawing" xmlns:w10="urn:schemas-microsoft-com:office:word" xmlns:w="http://schemas.openxmlformats.org/wordprocessingml/2006/main" xmlns:w14="http://schemas.microsoft.com/office/word/2010/wordml" xmlns:wpg="http://schemas.microsoft.com/office/word/2010/wordprocessingGroup" xmlns:wpi="http://schemas.microsoft.com/office/word/2010/wordprocessingInk" xmlns:wne="http://schemas.microsoft.com/office/word/2006/wordml" xmlns:wps="http://schemas.microsoft.com/office/word/2010/wordprocessingShape" mc:Ignorable="w14 wp14">
   <w:p>
     <w:pPr>
       <w:pStyle w:val="Header"/>
@@ -2608,7 +2587,7 @@
 </file>
 
 <file path=word/header2.xml><?xml version="1.0" encoding="utf-8"?>
-<w:hdr xmlns:wpc="http://schemas.microsoft.com/office/word/2010/wordprocessingCanvas" xmlns:cx="http://schemas.microsoft.com/office/drawing/2014/chartex" xmlns:cx1="http://schemas.microsoft.com/office/drawing/2015/9/8/chartex" xmlns:cx2="http://schemas.microsoft.com/office/drawing/2015/10/21/chartex" xmlns:cx3="http://schemas.microsoft.com/office/drawing/2016/5/9/chartex" xmlns:cx4="http://schemas.microsoft.com/office/drawing/2016/5/10/chartex" xmlns:cx5="http://schemas.microsoft.com/office/drawing/2016/5/11/chartex" xmlns:cx6="http://schemas.microsoft.com/office/drawing/2016/5/12/chartex" xmlns:cx7="http://schemas.microsoft.com/office/drawing/2016/5/13/chartex" xmlns:cx8="http://schemas.microsoft.com/office/drawing/2016/5/14/chartex" xmlns:mc="http://schemas.openxmlformats.org/markup-compatibility/2006" xmlns:aink="http://schemas.microsoft.com/office/drawing/2016/ink" xmlns:am3d="http://schemas.microsoft.com/office/drawing/2017/model3d" xmlns:o="urn:schemas-microsoft-com:office:office" xmlns:oel="http://schemas.microsoft.com/office/2019/extlst" xmlns:r="http://schemas.openxmlformats.org/officeDocument/2006/relationships" xmlns:m="http://schemas.openxmlformats.org/officeDocument/2006/math" xmlns:v="urn:schemas-microsoft-com:vml" xmlns:wp14="http://schemas.microsoft.com/office/word/2010/wordprocessingDrawing" xmlns:wp="http://schemas.openxmlformats.org/drawingml/2006/wordprocessingDrawing" xmlns:w10="urn:schemas-microsoft-com:office:word" xmlns:w="http://schemas.openxmlformats.org/wordprocessingml/2006/main" xmlns:w14="http://schemas.microsoft.com/office/word/2010/wordml" xmlns:w15="http://schemas.microsoft.com/office/word/2012/wordml" xmlns:w16cex="http://schemas.microsoft.com/office/word/2018/wordml/cex" xmlns:w16cid="http://schemas.microsoft.com/office/word/2016/wordml/cid" xmlns:w16="http://schemas.microsoft.com/office/word/2018/wordml" xmlns:w16du="http://schemas.microsoft.com/office/word/2023/wordml/word16du" xmlns:w16sdtdh="http://schemas.microsoft.com/office/word/2020/wordml/sdtdatahash" xmlns:w16sdtfl="http://schemas.microsoft.com/office/word/2024/wordml/sdtformatlock" xmlns:w16se="http://schemas.microsoft.com/office/word/2015/wordml/symex" xmlns:wpg="http://schemas.microsoft.com/office/word/2010/wordprocessingGroup" xmlns:wpi="http://schemas.microsoft.com/office/word/2010/wordprocessingInk" xmlns:wne="http://schemas.microsoft.com/office/word/2006/wordml" xmlns:wps="http://schemas.microsoft.com/office/word/2010/wordprocessingShape" mc:Ignorable="w14 w15 w16se w16cid w16 w16cex w16sdtdh w16sdtfl w16du wp14">
+<w:hdr xmlns:wpc="http://schemas.microsoft.com/office/word/2010/wordprocessingCanvas" xmlns:mc="http://schemas.openxmlformats.org/markup-compatibility/2006" xmlns:o="urn:schemas-microsoft-com:office:office" xmlns:r="http://schemas.openxmlformats.org/officeDocument/2006/relationships" xmlns:m="http://schemas.openxmlformats.org/officeDocument/2006/math" xmlns:v="urn:schemas-microsoft-com:vml" xmlns:wp14="http://schemas.microsoft.com/office/word/2010/wordprocessingDrawing" xmlns:wp="http://schemas.openxmlformats.org/drawingml/2006/wordprocessingDrawing" xmlns:w10="urn:schemas-microsoft-com:office:word" xmlns:w="http://schemas.openxmlformats.org/wordprocessingml/2006/main" xmlns:w14="http://schemas.microsoft.com/office/word/2010/wordml" xmlns:wpg="http://schemas.microsoft.com/office/word/2010/wordprocessingGroup" xmlns:wpi="http://schemas.microsoft.com/office/word/2010/wordprocessingInk" xmlns:wne="http://schemas.microsoft.com/office/word/2006/wordml" xmlns:wps="http://schemas.microsoft.com/office/word/2010/wordprocessingShape" mc:Ignorable="w14 wp14">
   <w:p>
     <w:pPr>
       <w:pStyle w:val="Header"/>
@@ -2618,7 +2597,7 @@
 </file>
 
 <file path=word/header3.xml><?xml version="1.0" encoding="utf-8"?>
-<w:hdr xmlns:wpc="http://schemas.microsoft.com/office/word/2010/wordprocessingCanvas" xmlns:cx="http://schemas.microsoft.com/office/drawing/2014/chartex" xmlns:cx1="http://schemas.microsoft.com/office/drawing/2015/9/8/chartex" xmlns:cx2="http://schemas.microsoft.com/office/drawing/2015/10/21/chartex" xmlns:cx3="http://schemas.microsoft.com/office/drawing/2016/5/9/chartex" xmlns:cx4="http://schemas.microsoft.com/office/drawing/2016/5/10/chartex" xmlns:cx5="http://schemas.microsoft.com/office/drawing/2016/5/11/chartex" xmlns:cx6="http://schemas.microsoft.com/office/drawing/2016/5/12/chartex" xmlns:cx7="http://schemas.microsoft.com/office/drawing/2016/5/13/chartex" xmlns:cx8="http://schemas.microsoft.com/office/drawing/2016/5/14/chartex" xmlns:mc="http://schemas.openxmlformats.org/markup-compatibility/2006" xmlns:aink="http://schemas.microsoft.com/office/drawing/2016/ink" xmlns:am3d="http://schemas.microsoft.com/office/drawing/2017/model3d" xmlns:o="urn:schemas-microsoft-com:office:office" xmlns:oel="http://schemas.microsoft.com/office/2019/extlst" xmlns:r="http://schemas.openxmlformats.org/officeDocument/2006/relationships" xmlns:m="http://schemas.openxmlformats.org/officeDocument/2006/math" xmlns:v="urn:schemas-microsoft-com:vml" xmlns:wp14="http://schemas.microsoft.com/office/word/2010/wordprocessingDrawing" xmlns:wp="http://schemas.openxmlformats.org/drawingml/2006/wordprocessingDrawing" xmlns:w10="urn:schemas-microsoft-com:office:word" xmlns:w="http://schemas.openxmlformats.org/wordprocessingml/2006/main" xmlns:w14="http://schemas.microsoft.com/office/word/2010/wordml" xmlns:w15="http://schemas.microsoft.com/office/word/2012/wordml" xmlns:w16cex="http://schemas.microsoft.com/office/word/2018/wordml/cex" xmlns:w16cid="http://schemas.microsoft.com/office/word/2016/wordml/cid" xmlns:w16="http://schemas.microsoft.com/office/word/2018/wordml" xmlns:w16du="http://schemas.microsoft.com/office/word/2023/wordml/word16du" xmlns:w16sdtdh="http://schemas.microsoft.com/office/word/2020/wordml/sdtdatahash" xmlns:w16sdtfl="http://schemas.microsoft.com/office/word/2024/wordml/sdtformatlock" xmlns:w16se="http://schemas.microsoft.com/office/word/2015/wordml/symex" xmlns:wpg="http://schemas.microsoft.com/office/word/2010/wordprocessingGroup" xmlns:wpi="http://schemas.microsoft.com/office/word/2010/wordprocessingInk" xmlns:wne="http://schemas.microsoft.com/office/word/2006/wordml" xmlns:wps="http://schemas.microsoft.com/office/word/2010/wordprocessingShape" mc:Ignorable="w14 w15 w16se w16cid w16 w16cex w16sdtdh w16sdtfl w16du wp14">
+<w:hdr xmlns:wpc="http://schemas.microsoft.com/office/word/2010/wordprocessingCanvas" xmlns:mc="http://schemas.openxmlformats.org/markup-compatibility/2006" xmlns:o="urn:schemas-microsoft-com:office:office" xmlns:r="http://schemas.openxmlformats.org/officeDocument/2006/relationships" xmlns:m="http://schemas.openxmlformats.org/officeDocument/2006/math" xmlns:v="urn:schemas-microsoft-com:vml" xmlns:wp14="http://schemas.microsoft.com/office/word/2010/wordprocessingDrawing" xmlns:wp="http://schemas.openxmlformats.org/drawingml/2006/wordprocessingDrawing" xmlns:w10="urn:schemas-microsoft-com:office:word" xmlns:w="http://schemas.openxmlformats.org/wordprocessingml/2006/main" xmlns:w14="http://schemas.microsoft.com/office/word/2010/wordml" xmlns:wpg="http://schemas.microsoft.com/office/word/2010/wordprocessingGroup" xmlns:wpi="http://schemas.microsoft.com/office/word/2010/wordprocessingInk" xmlns:wne="http://schemas.microsoft.com/office/word/2006/wordml" xmlns:wps="http://schemas.microsoft.com/office/word/2010/wordprocessingShape" mc:Ignorable="w14 wp14">
   <w:p>
     <w:pPr>
       <w:pStyle w:val="Header"/>
@@ -2628,7 +2607,7 @@
 </file>
 
 <file path=word/styles.xml><?xml version="1.0" encoding="utf-8"?>
-<w:styles xmlns:mc="http://schemas.openxmlformats.org/markup-compatibility/2006" xmlns:r="http://schemas.openxmlformats.org/officeDocument/2006/relationships" xmlns:w="http://schemas.openxmlformats.org/wordprocessingml/2006/main" xmlns:w14="http://schemas.microsoft.com/office/word/2010/wordml" xmlns:w15="http://schemas.microsoft.com/office/word/2012/wordml" xmlns:w16cex="http://schemas.microsoft.com/office/word/2018/wordml/cex" xmlns:w16cid="http://schemas.microsoft.com/office/word/2016/wordml/cid" xmlns:w16="http://schemas.microsoft.com/office/word/2018/wordml" xmlns:w16du="http://schemas.microsoft.com/office/word/2023/wordml/word16du" xmlns:w16sdtdh="http://schemas.microsoft.com/office/word/2020/wordml/sdtdatahash" xmlns:w16sdtfl="http://schemas.microsoft.com/office/word/2024/wordml/sdtformatlock" xmlns:w16se="http://schemas.microsoft.com/office/word/2015/wordml/symex" mc:Ignorable="w14 w15 w16se w16cid w16 w16cex w16sdtdh w16sdtfl w16du">
+<w:styles xmlns:mc="http://schemas.openxmlformats.org/markup-compatibility/2006" xmlns:r="http://schemas.openxmlformats.org/officeDocument/2006/relationships" xmlns:w="http://schemas.openxmlformats.org/wordprocessingml/2006/main" xmlns:w14="http://schemas.microsoft.com/office/word/2010/wordml" mc:Ignorable="w14">
   <w:docDefaults>
     <w:rPrDefault>
       <w:rPr>
@@ -2636,7 +2615,7 @@
         <w:kern w:val="2"/>
         <w:sz w:val="24"/>
         <w:szCs w:val="24"/>
-        <w:lang w:val="en-SI" w:eastAsia="en-US" w:bidi="ar-SA"/>
+        <w:lang w:val="sl-SI" w:eastAsia="en-US" w:bidi="ar-SA"/>
         <w14:ligatures w14:val="standardContextual"/>
       </w:rPr>
     </w:rPrDefault>
@@ -2646,383 +2625,144 @@
       </w:pPr>
     </w:pPrDefault>
   </w:docDefaults>
-  <w:latentStyles w:defLockedState="0" w:defUIPriority="99" w:defSemiHidden="0" w:defUnhideWhenUsed="0" w:defQFormat="0" w:count="376">
-    <w:lsdException w:name="Normal" w:uiPriority="0" w:qFormat="1"/>
-    <w:lsdException w:name="heading 1" w:uiPriority="9" w:qFormat="1"/>
-    <w:lsdException w:name="heading 2" w:semiHidden="1" w:uiPriority="9" w:unhideWhenUsed="1" w:qFormat="1"/>
-    <w:lsdException w:name="heading 3" w:semiHidden="1" w:uiPriority="9" w:unhideWhenUsed="1" w:qFormat="1"/>
-    <w:lsdException w:name="heading 4" w:semiHidden="1" w:uiPriority="9" w:unhideWhenUsed="1" w:qFormat="1"/>
-    <w:lsdException w:name="heading 5" w:semiHidden="1" w:uiPriority="9" w:unhideWhenUsed="1" w:qFormat="1"/>
-    <w:lsdException w:name="heading 6" w:semiHidden="1" w:uiPriority="9" w:unhideWhenUsed="1" w:qFormat="1"/>
-    <w:lsdException w:name="heading 7" w:semiHidden="1" w:uiPriority="9" w:unhideWhenUsed="1" w:qFormat="1"/>
-    <w:lsdException w:name="heading 8" w:semiHidden="1" w:uiPriority="9" w:unhideWhenUsed="1" w:qFormat="1"/>
-    <w:lsdException w:name="heading 9" w:semiHidden="1" w:uiPriority="9" w:unhideWhenUsed="1" w:qFormat="1"/>
-    <w:lsdException w:name="index 1" w:semiHidden="1" w:unhideWhenUsed="1"/>
-    <w:lsdException w:name="index 2" w:semiHidden="1" w:unhideWhenUsed="1"/>
-    <w:lsdException w:name="index 3" w:semiHidden="1" w:unhideWhenUsed="1"/>
-    <w:lsdException w:name="index 4" w:semiHidden="1" w:unhideWhenUsed="1"/>
-    <w:lsdException w:name="index 5" w:semiHidden="1" w:unhideWhenUsed="1"/>
-    <w:lsdException w:name="index 6" w:semiHidden="1" w:unhideWhenUsed="1"/>
-    <w:lsdException w:name="index 7" w:semiHidden="1" w:unhideWhenUsed="1"/>
-    <w:lsdException w:name="index 8" w:semiHidden="1" w:unhideWhenUsed="1"/>
-    <w:lsdException w:name="index 9" w:semiHidden="1" w:unhideWhenUsed="1"/>
-    <w:lsdException w:name="toc 1" w:semiHidden="1" w:uiPriority="39" w:unhideWhenUsed="1"/>
-    <w:lsdException w:name="toc 2" w:semiHidden="1" w:uiPriority="39" w:unhideWhenUsed="1"/>
-    <w:lsdException w:name="toc 3" w:semiHidden="1" w:uiPriority="39" w:unhideWhenUsed="1"/>
-    <w:lsdException w:name="toc 4" w:semiHidden="1" w:uiPriority="39" w:unhideWhenUsed="1"/>
-    <w:lsdException w:name="toc 5" w:semiHidden="1" w:uiPriority="39" w:unhideWhenUsed="1"/>
-    <w:lsdException w:name="toc 6" w:semiHidden="1" w:uiPriority="39" w:unhideWhenUsed="1"/>
-    <w:lsdException w:name="toc 7" w:semiHidden="1" w:uiPriority="39" w:unhideWhenUsed="1"/>
-    <w:lsdException w:name="toc 8" w:semiHidden="1" w:uiPriority="39" w:unhideWhenUsed="1"/>
-    <w:lsdException w:name="toc 9" w:semiHidden="1" w:uiPriority="39" w:unhideWhenUsed="1"/>
-    <w:lsdException w:name="Normal Indent" w:semiHidden="1" w:unhideWhenUsed="1"/>
-    <w:lsdException w:name="footnote text" w:semiHidden="1" w:unhideWhenUsed="1"/>
-    <w:lsdException w:name="annotation text" w:semiHidden="1" w:unhideWhenUsed="1"/>
-    <w:lsdException w:name="header" w:semiHidden="1" w:unhideWhenUsed="1"/>
-    <w:lsdException w:name="footer" w:semiHidden="1" w:unhideWhenUsed="1"/>
-    <w:lsdException w:name="index heading" w:semiHidden="1" w:unhideWhenUsed="1"/>
-    <w:lsdException w:name="caption" w:semiHidden="1" w:uiPriority="35" w:unhideWhenUsed="1" w:qFormat="1"/>
-    <w:lsdException w:name="table of figures" w:semiHidden="1" w:unhideWhenUsed="1"/>
-    <w:lsdException w:name="envelope address" w:semiHidden="1" w:unhideWhenUsed="1"/>
-    <w:lsdException w:name="envelope return" w:semiHidden="1" w:unhideWhenUsed="1"/>
-    <w:lsdException w:name="footnote reference" w:semiHidden="1" w:unhideWhenUsed="1"/>
-    <w:lsdException w:name="annotation reference" w:semiHidden="1" w:unhideWhenUsed="1"/>
-    <w:lsdException w:name="line number" w:semiHidden="1" w:unhideWhenUsed="1"/>
-    <w:lsdException w:name="page number" w:semiHidden="1" w:unhideWhenUsed="1"/>
-    <w:lsdException w:name="endnote reference" w:semiHidden="1" w:unhideWhenUsed="1"/>
-    <w:lsdException w:name="endnote text" w:semiHidden="1" w:unhideWhenUsed="1"/>
-    <w:lsdException w:name="table of authorities" w:semiHidden="1" w:unhideWhenUsed="1"/>
-    <w:lsdException w:name="macro" w:semiHidden="1" w:unhideWhenUsed="1"/>
-    <w:lsdException w:name="toa heading" w:semiHidden="1" w:unhideWhenUsed="1"/>
-    <w:lsdException w:name="List" w:semiHidden="1" w:unhideWhenUsed="1"/>
-    <w:lsdException w:name="List Bullet" w:semiHidden="1" w:unhideWhenUsed="1"/>
-    <w:lsdException w:name="List Number" w:semiHidden="1" w:unhideWhenUsed="1"/>
-    <w:lsdException w:name="List 2" w:semiHidden="1" w:unhideWhenUsed="1"/>
-    <w:lsdException w:name="List 3" w:semiHidden="1" w:unhideWhenUsed="1"/>
-    <w:lsdException w:name="List 4" w:semiHidden="1" w:unhideWhenUsed="1"/>
-    <w:lsdException w:name="List 5" w:semiHidden="1" w:unhideWhenUsed="1"/>
-    <w:lsdException w:name="List Bullet 2" w:semiHidden="1" w:unhideWhenUsed="1"/>
-    <w:lsdException w:name="List Bullet 3" w:semiHidden="1" w:unhideWhenUsed="1"/>
-    <w:lsdException w:name="List Bullet 4" w:semiHidden="1" w:unhideWhenUsed="1"/>
-    <w:lsdException w:name="List Bullet 5" w:semiHidden="1" w:unhideWhenUsed="1"/>
-    <w:lsdException w:name="List Number 2" w:semiHidden="1" w:unhideWhenUsed="1"/>
-    <w:lsdException w:name="List Number 3" w:semiHidden="1" w:unhideWhenUsed="1"/>
-    <w:lsdException w:name="List Number 4" w:semiHidden="1" w:unhideWhenUsed="1"/>
-    <w:lsdException w:name="List Number 5" w:semiHidden="1" w:unhideWhenUsed="1"/>
-    <w:lsdException w:name="Title" w:uiPriority="10" w:qFormat="1"/>
-    <w:lsdException w:name="Closing" w:semiHidden="1" w:unhideWhenUsed="1"/>
-    <w:lsdException w:name="Signature" w:semiHidden="1" w:unhideWhenUsed="1"/>
-    <w:lsdException w:name="Default Paragraph Font" w:semiHidden="1" w:uiPriority="1" w:unhideWhenUsed="1"/>
-    <w:lsdException w:name="Body Text" w:semiHidden="1" w:unhideWhenUsed="1"/>
-    <w:lsdException w:name="Body Text Indent" w:semiHidden="1" w:unhideWhenUsed="1"/>
-    <w:lsdException w:name="List Continue" w:semiHidden="1" w:unhideWhenUsed="1"/>
-    <w:lsdException w:name="List Continue 2" w:semiHidden="1" w:unhideWhenUsed="1"/>
-    <w:lsdException w:name="List Continue 3" w:semiHidden="1" w:unhideWhenUsed="1"/>
-    <w:lsdException w:name="List Continue 4" w:semiHidden="1" w:unhideWhenUsed="1"/>
-    <w:lsdException w:name="List Continue 5" w:semiHidden="1" w:unhideWhenUsed="1"/>
-    <w:lsdException w:name="Message Header" w:semiHidden="1" w:unhideWhenUsed="1"/>
-    <w:lsdException w:name="Subtitle" w:uiPriority="11" w:qFormat="1"/>
-    <w:lsdException w:name="Salutation" w:semiHidden="1" w:unhideWhenUsed="1"/>
-    <w:lsdException w:name="Date" w:semiHidden="1" w:unhideWhenUsed="1"/>
-    <w:lsdException w:name="Body Text First Indent" w:semiHidden="1" w:unhideWhenUsed="1"/>
-    <w:lsdException w:name="Body Text First Indent 2" w:semiHidden="1" w:unhideWhenUsed="1"/>
-    <w:lsdException w:name="Note Heading" w:semiHidden="1" w:unhideWhenUsed="1"/>
-    <w:lsdException w:name="Body Text 2" w:semiHidden="1" w:unhideWhenUsed="1"/>
-    <w:lsdException w:name="Body Text 3" w:semiHidden="1" w:unhideWhenUsed="1"/>
-    <w:lsdException w:name="Body Text Indent 2" w:semiHidden="1" w:unhideWhenUsed="1"/>
-    <w:lsdException w:name="Body Text Indent 3" w:semiHidden="1" w:unhideWhenUsed="1"/>
-    <w:lsdException w:name="Block Text" w:semiHidden="1" w:unhideWhenUsed="1"/>
-    <w:lsdException w:name="Hyperlink" w:semiHidden="1" w:unhideWhenUsed="1"/>
-    <w:lsdException w:name="FollowedHyperlink" w:semiHidden="1" w:unhideWhenUsed="1"/>
-    <w:lsdException w:name="Strong" w:uiPriority="22" w:qFormat="1"/>
-    <w:lsdException w:name="Emphasis" w:uiPriority="20" w:qFormat="1"/>
-    <w:lsdException w:name="Document Map" w:semiHidden="1" w:unhideWhenUsed="1"/>
-    <w:lsdException w:name="Plain Text" w:semiHidden="1" w:unhideWhenUsed="1"/>
-    <w:lsdException w:name="E-mail Signature" w:semiHidden="1" w:unhideWhenUsed="1"/>
-    <w:lsdException w:name="HTML Top of Form" w:semiHidden="1" w:unhideWhenUsed="1"/>
-    <w:lsdException w:name="HTML Bottom of Form" w:semiHidden="1" w:unhideWhenUsed="1"/>
-    <w:lsdException w:name="Normal (Web)" w:semiHidden="1" w:unhideWhenUsed="1"/>
-    <w:lsdException w:name="HTML Acronym" w:semiHidden="1" w:unhideWhenUsed="1"/>
-    <w:lsdException w:name="HTML Address" w:semiHidden="1" w:unhideWhenUsed="1"/>
-    <w:lsdException w:name="HTML Cite" w:semiHidden="1" w:unhideWhenUsed="1"/>
-    <w:lsdException w:name="HTML Code" w:semiHidden="1" w:unhideWhenUsed="1"/>
-    <w:lsdException w:name="HTML Definition" w:semiHidden="1" w:unhideWhenUsed="1"/>
-    <w:lsdException w:name="HTML Keyboard" w:semiHidden="1" w:unhideWhenUsed="1"/>
-    <w:lsdException w:name="HTML Preformatted" w:semiHidden="1" w:unhideWhenUsed="1"/>
-    <w:lsdException w:name="HTML Sample" w:semiHidden="1" w:unhideWhenUsed="1"/>
-    <w:lsdException w:name="HTML Typewriter" w:semiHidden="1" w:unhideWhenUsed="1"/>
-    <w:lsdException w:name="HTML Variable" w:semiHidden="1" w:unhideWhenUsed="1"/>
-    <w:lsdException w:name="Normal Table" w:semiHidden="1" w:unhideWhenUsed="1"/>
-    <w:lsdException w:name="annotation subject" w:semiHidden="1" w:unhideWhenUsed="1"/>
-    <w:lsdException w:name="No List" w:semiHidden="1" w:unhideWhenUsed="1"/>
-    <w:lsdException w:name="Outline List 1" w:semiHidden="1" w:unhideWhenUsed="1"/>
-    <w:lsdException w:name="Outline List 2" w:semiHidden="1" w:unhideWhenUsed="1"/>
-    <w:lsdException w:name="Outline List 3" w:semiHidden="1" w:unhideWhenUsed="1"/>
-    <w:lsdException w:name="Table Simple 1" w:semiHidden="1" w:unhideWhenUsed="1"/>
-    <w:lsdException w:name="Table Simple 2" w:semiHidden="1" w:unhideWhenUsed="1"/>
-    <w:lsdException w:name="Table Simple 3" w:semiHidden="1" w:unhideWhenUsed="1"/>
-    <w:lsdException w:name="Table Classic 1" w:semiHidden="1" w:unhideWhenUsed="1"/>
-    <w:lsdException w:name="Table Classic 2" w:semiHidden="1" w:unhideWhenUsed="1"/>
-    <w:lsdException w:name="Table Classic 3" w:semiHidden="1" w:unhideWhenUsed="1"/>
-    <w:lsdException w:name="Table Classic 4" w:semiHidden="1" w:unhideWhenUsed="1"/>
-    <w:lsdException w:name="Table Colorful 1" w:semiHidden="1" w:unhideWhenUsed="1"/>
-    <w:lsdException w:name="Table Colorful 2" w:semiHidden="1" w:unhideWhenUsed="1"/>
-    <w:lsdException w:name="Table Colorful 3" w:semiHidden="1" w:unhideWhenUsed="1"/>
-    <w:lsdException w:name="Table Columns 1" w:semiHidden="1" w:unhideWhenUsed="1"/>
-    <w:lsdException w:name="Table Columns 2" w:semiHidden="1" w:unhideWhenUsed="1"/>
-    <w:lsdException w:name="Table Columns 3" w:semiHidden="1" w:unhideWhenUsed="1"/>
-    <w:lsdException w:name="Table Columns 4" w:semiHidden="1" w:unhideWhenUsed="1"/>
-    <w:lsdException w:name="Table Columns 5" w:semiHidden="1" w:unhideWhenUsed="1"/>
-    <w:lsdException w:name="Table Grid 1" w:semiHidden="1" w:unhideWhenUsed="1"/>
-    <w:lsdException w:name="Table Grid 2" w:semiHidden="1" w:unhideWhenUsed="1"/>
-    <w:lsdException w:name="Table Grid 3" w:semiHidden="1" w:unhideWhenUsed="1"/>
-    <w:lsdException w:name="Table Grid 4" w:semiHidden="1" w:unhideWhenUsed="1"/>
-    <w:lsdException w:name="Table Grid 5" w:semiHidden="1" w:unhideWhenUsed="1"/>
-    <w:lsdException w:name="Table Grid 6" w:semiHidden="1" w:unhideWhenUsed="1"/>
-    <w:lsdException w:name="Table Grid 7" w:semiHidden="1" w:unhideWhenUsed="1"/>
-    <w:lsdException w:name="Table Grid 8" w:semiHidden="1" w:unhideWhenUsed="1"/>
-    <w:lsdException w:name="Table List 1" w:semiHidden="1" w:unhideWhenUsed="1"/>
-    <w:lsdException w:name="Table List 2" w:semiHidden="1" w:unhideWhenUsed="1"/>
-    <w:lsdException w:name="Table List 3" w:semiHidden="1" w:unhideWhenUsed="1"/>
-    <w:lsdException w:name="Table List 4" w:semiHidden="1" w:unhideWhenUsed="1"/>
-    <w:lsdException w:name="Table List 5" w:semiHidden="1" w:unhideWhenUsed="1"/>
-    <w:lsdException w:name="Table List 6" w:semiHidden="1" w:unhideWhenUsed="1"/>
-    <w:lsdException w:name="Table List 7" w:semiHidden="1" w:unhideWhenUsed="1"/>
-    <w:lsdException w:name="Table List 8" w:semiHidden="1" w:unhideWhenUsed="1"/>
-    <w:lsdException w:name="Table 3D effects 1" w:semiHidden="1" w:unhideWhenUsed="1"/>
-    <w:lsdException w:name="Table 3D effects 2" w:semiHidden="1" w:unhideWhenUsed="1"/>
-    <w:lsdException w:name="Table 3D effects 3" w:semiHidden="1" w:unhideWhenUsed="1"/>
-    <w:lsdException w:name="Table Contemporary" w:semiHidden="1" w:unhideWhenUsed="1"/>
-    <w:lsdException w:name="Table Elegant" w:semiHidden="1" w:unhideWhenUsed="1"/>
-    <w:lsdException w:name="Table Professional" w:semiHidden="1" w:unhideWhenUsed="1"/>
-    <w:lsdException w:name="Table Subtle 1" w:semiHidden="1" w:unhideWhenUsed="1"/>
-    <w:lsdException w:name="Table Subtle 2" w:semiHidden="1" w:unhideWhenUsed="1"/>
-    <w:lsdException w:name="Table Web 1" w:semiHidden="1" w:unhideWhenUsed="1"/>
-    <w:lsdException w:name="Table Web 2" w:semiHidden="1" w:unhideWhenUsed="1"/>
-    <w:lsdException w:name="Table Web 3" w:semiHidden="1" w:unhideWhenUsed="1"/>
-    <w:lsdException w:name="Balloon Text" w:semiHidden="1" w:unhideWhenUsed="1"/>
-    <w:lsdException w:name="Table Grid" w:uiPriority="39"/>
-    <w:lsdException w:name="Table Theme" w:semiHidden="1" w:unhideWhenUsed="1"/>
-    <w:lsdException w:name="Placeholder Text" w:semiHidden="1"/>
-    <w:lsdException w:name="No Spacing" w:uiPriority="1" w:qFormat="1"/>
-    <w:lsdException w:name="Light Shading" w:uiPriority="60"/>
-    <w:lsdException w:name="Light List" w:uiPriority="61"/>
-    <w:lsdException w:name="Light Grid" w:uiPriority="62"/>
-    <w:lsdException w:name="Medium Shading 1" w:uiPriority="63"/>
-    <w:lsdException w:name="Medium Shading 2" w:uiPriority="64"/>
-    <w:lsdException w:name="Medium List 1" w:uiPriority="65"/>
-    <w:lsdException w:name="Medium List 2" w:uiPriority="66"/>
-    <w:lsdException w:name="Medium Grid 1" w:uiPriority="67"/>
-    <w:lsdException w:name="Medium Grid 2" w:uiPriority="68"/>
-    <w:lsdException w:name="Medium Grid 3" w:uiPriority="69"/>
-    <w:lsdException w:name="Dark List" w:uiPriority="70"/>
-    <w:lsdException w:name="Colorful Shading" w:uiPriority="71"/>
-    <w:lsdException w:name="Colorful List" w:uiPriority="72"/>
-    <w:lsdException w:name="Colorful Grid" w:uiPriority="73"/>
-    <w:lsdException w:name="Light Shading Accent 1" w:uiPriority="60"/>
-    <w:lsdException w:name="Light List Accent 1" w:uiPriority="61"/>
-    <w:lsdException w:name="Light Grid Accent 1" w:uiPriority="62"/>
-    <w:lsdException w:name="Medium Shading 1 Accent 1" w:uiPriority="63"/>
-    <w:lsdException w:name="Medium Shading 2 Accent 1" w:uiPriority="64"/>
-    <w:lsdException w:name="Medium List 1 Accent 1" w:uiPriority="65"/>
-    <w:lsdException w:name="Revision" w:semiHidden="1"/>
-    <w:lsdException w:name="List Paragraph" w:uiPriority="34" w:qFormat="1"/>
-    <w:lsdException w:name="Quote" w:uiPriority="29" w:qFormat="1"/>
-    <w:lsdException w:name="Intense Quote" w:uiPriority="30" w:qFormat="1"/>
-    <w:lsdException w:name="Medium List 2 Accent 1" w:uiPriority="66"/>
-    <w:lsdException w:name="Medium Grid 1 Accent 1" w:uiPriority="67"/>
-    <w:lsdException w:name="Medium Grid 2 Accent 1" w:uiPriority="68"/>
-    <w:lsdException w:name="Medium Grid 3 Accent 1" w:uiPriority="69"/>
-    <w:lsdException w:name="Dark List Accent 1" w:uiPriority="70"/>
-    <w:lsdException w:name="Colorful Shading Accent 1" w:uiPriority="71"/>
-    <w:lsdException w:name="Colorful List Accent 1" w:uiPriority="72"/>
-    <w:lsdException w:name="Colorful Grid Accent 1" w:uiPriority="73"/>
-    <w:lsdException w:name="Light Shading Accent 2" w:uiPriority="60"/>
-    <w:lsdException w:name="Light List Accent 2" w:uiPriority="61"/>
-    <w:lsdException w:name="Light Grid Accent 2" w:uiPriority="62"/>
-    <w:lsdException w:name="Medium Shading 1 Accent 2" w:uiPriority="63"/>
-    <w:lsdException w:name="Medium Shading 2 Accent 2" w:uiPriority="64"/>
-    <w:lsdException w:name="Medium List 1 Accent 2" w:uiPriority="65"/>
-    <w:lsdException w:name="Medium List 2 Accent 2" w:uiPriority="66"/>
-    <w:lsdException w:name="Medium Grid 1 Accent 2" w:uiPriority="67"/>
-    <w:lsdException w:name="Medium Grid 2 Accent 2" w:uiPriority="68"/>
-    <w:lsdException w:name="Medium Grid 3 Accent 2" w:uiPriority="69"/>
-    <w:lsdException w:name="Dark List Accent 2" w:uiPriority="70"/>
-    <w:lsdException w:name="Colorful Shading Accent 2" w:uiPriority="71"/>
-    <w:lsdException w:name="Colorful List Accent 2" w:uiPriority="72"/>
-    <w:lsdException w:name="Colorful Grid Accent 2" w:uiPriority="73"/>
-    <w:lsdException w:name="Light Shading Accent 3" w:uiPriority="60"/>
-    <w:lsdException w:name="Light List Accent 3" w:uiPriority="61"/>
-    <w:lsdException w:name="Light Grid Accent 3" w:uiPriority="62"/>
-    <w:lsdException w:name="Medium Shading 1 Accent 3" w:uiPriority="63"/>
-    <w:lsdException w:name="Medium Shading 2 Accent 3" w:uiPriority="64"/>
-    <w:lsdException w:name="Medium List 1 Accent 3" w:uiPriority="65"/>
-    <w:lsdException w:name="Medium List 2 Accent 3" w:uiPriority="66"/>
-    <w:lsdException w:name="Medium Grid 1 Accent 3" w:uiPriority="67"/>
-    <w:lsdException w:name="Medium Grid 2 Accent 3" w:uiPriority="68"/>
-    <w:lsdException w:name="Medium Grid 3 Accent 3" w:uiPriority="69"/>
-    <w:lsdException w:name="Dark List Accent 3" w:uiPriority="70"/>
-    <w:lsdException w:name="Colorful Shading Accent 3" w:uiPriority="71"/>
-    <w:lsdException w:name="Colorful List Accent 3" w:uiPriority="72"/>
-    <w:lsdException w:name="Colorful Grid Accent 3" w:uiPriority="73"/>
-    <w:lsdException w:name="Light Shading Accent 4" w:uiPriority="60"/>
-    <w:lsdException w:name="Light List Accent 4" w:uiPriority="61"/>
-    <w:lsdException w:name="Light Grid Accent 4" w:uiPriority="62"/>
-    <w:lsdException w:name="Medium Shading 1 Accent 4" w:uiPriority="63"/>
-    <w:lsdException w:name="Medium Shading 2 Accent 4" w:uiPriority="64"/>
-    <w:lsdException w:name="Medium List 1 Accent 4" w:uiPriority="65"/>
-    <w:lsdException w:name="Medium List 2 Accent 4" w:uiPriority="66"/>
-    <w:lsdException w:name="Medium Grid 1 Accent 4" w:uiPriority="67"/>
-    <w:lsdException w:name="Medium Grid 2 Accent 4" w:uiPriority="68"/>
-    <w:lsdException w:name="Medium Grid 3 Accent 4" w:uiPriority="69"/>
-    <w:lsdException w:name="Dark List Accent 4" w:uiPriority="70"/>
-    <w:lsdException w:name="Colorful Shading Accent 4" w:uiPriority="71"/>
-    <w:lsdException w:name="Colorful List Accent 4" w:uiPriority="72"/>
-    <w:lsdException w:name="Colorful Grid Accent 4" w:uiPriority="73"/>
-    <w:lsdException w:name="Light Shading Accent 5" w:uiPriority="60"/>
-    <w:lsdException w:name="Light List Accent 5" w:uiPriority="61"/>
-    <w:lsdException w:name="Light Grid Accent 5" w:uiPriority="62"/>
-    <w:lsdException w:name="Medium Shading 1 Accent 5" w:uiPriority="63"/>
-    <w:lsdException w:name="Medium Shading 2 Accent 5" w:uiPriority="64"/>
-    <w:lsdException w:name="Medium List 1 Accent 5" w:uiPriority="65"/>
-    <w:lsdException w:name="Medium List 2 Accent 5" w:uiPriority="66"/>
-    <w:lsdException w:name="Medium Grid 1 Accent 5" w:uiPriority="67"/>
-    <w:lsdException w:name="Medium Grid 2 Accent 5" w:uiPriority="68"/>
-    <w:lsdException w:name="Medium Grid 3 Accent 5" w:uiPriority="69"/>
-    <w:lsdException w:name="Dark List Accent 5" w:uiPriority="70"/>
-    <w:lsdException w:name="Colorful Shading Accent 5" w:uiPriority="71"/>
-    <w:lsdException w:name="Colorful List Accent 5" w:uiPriority="72"/>
-    <w:lsdException w:name="Colorful Grid Accent 5" w:uiPriority="73"/>
-    <w:lsdException w:name="Light Shading Accent 6" w:uiPriority="60"/>
-    <w:lsdException w:name="Light List Accent 6" w:uiPriority="61"/>
-    <w:lsdException w:name="Light Grid Accent 6" w:uiPriority="62"/>
-    <w:lsdException w:name="Medium Shading 1 Accent 6" w:uiPriority="63"/>
-    <w:lsdException w:name="Medium Shading 2 Accent 6" w:uiPriority="64"/>
-    <w:lsdException w:name="Medium List 1 Accent 6" w:uiPriority="65"/>
-    <w:lsdException w:name="Medium List 2 Accent 6" w:uiPriority="66"/>
-    <w:lsdException w:name="Medium Grid 1 Accent 6" w:uiPriority="67"/>
-    <w:lsdException w:name="Medium Grid 2 Accent 6" w:uiPriority="68"/>
-    <w:lsdException w:name="Medium Grid 3 Accent 6" w:uiPriority="69"/>
-    <w:lsdException w:name="Dark List Accent 6" w:uiPriority="70"/>
-    <w:lsdException w:name="Colorful Shading Accent 6" w:uiPriority="71"/>
-    <w:lsdException w:name="Colorful List Accent 6" w:uiPriority="72"/>
-    <w:lsdException w:name="Colorful Grid Accent 6" w:uiPriority="73"/>
-    <w:lsdException w:name="Subtle Emphasis" w:uiPriority="19" w:qFormat="1"/>
-    <w:lsdException w:name="Intense Emphasis" w:uiPriority="21" w:qFormat="1"/>
-    <w:lsdException w:name="Subtle Reference" w:uiPriority="31" w:qFormat="1"/>
-    <w:lsdException w:name="Intense Reference" w:uiPriority="32" w:qFormat="1"/>
-    <w:lsdException w:name="Book Title" w:uiPriority="33" w:qFormat="1"/>
-    <w:lsdException w:name="Bibliography" w:semiHidden="1" w:uiPriority="37" w:unhideWhenUsed="1"/>
-    <w:lsdException w:name="TOC Heading" w:semiHidden="1" w:uiPriority="39" w:unhideWhenUsed="1" w:qFormat="1"/>
-    <w:lsdException w:name="Plain Table 1" w:uiPriority="41"/>
-    <w:lsdException w:name="Plain Table 2" w:uiPriority="42"/>
-    <w:lsdException w:name="Plain Table 3" w:uiPriority="43"/>
-    <w:lsdException w:name="Plain Table 4" w:uiPriority="44"/>
-    <w:lsdException w:name="Plain Table 5" w:uiPriority="45"/>
-    <w:lsdException w:name="Grid Table Light" w:uiPriority="40"/>
-    <w:lsdException w:name="Grid Table 1 Light" w:uiPriority="46"/>
-    <w:lsdException w:name="Grid Table 2" w:uiPriority="47"/>
-    <w:lsdException w:name="Grid Table 3" w:uiPriority="48"/>
-    <w:lsdException w:name="Grid Table 4" w:uiPriority="49"/>
-    <w:lsdException w:name="Grid Table 5 Dark" w:uiPriority="50"/>
-    <w:lsdException w:name="Grid Table 6 Colorful" w:uiPriority="51"/>
-    <w:lsdException w:name="Grid Table 7 Colorful" w:uiPriority="52"/>
-    <w:lsdException w:name="Grid Table 1 Light Accent 1" w:uiPriority="46"/>
-    <w:lsdException w:name="Grid Table 2 Accent 1" w:uiPriority="47"/>
-    <w:lsdException w:name="Grid Table 3 Accent 1" w:uiPriority="48"/>
-    <w:lsdException w:name="Grid Table 4 Accent 1" w:uiPriority="49"/>
-    <w:lsdException w:name="Grid Table 5 Dark Accent 1" w:uiPriority="50"/>
-    <w:lsdException w:name="Grid Table 6 Colorful Accent 1" w:uiPriority="51"/>
-    <w:lsdException w:name="Grid Table 7 Colorful Accent 1" w:uiPriority="52"/>
-    <w:lsdException w:name="Grid Table 1 Light Accent 2" w:uiPriority="46"/>
-    <w:lsdException w:name="Grid Table 2 Accent 2" w:uiPriority="47"/>
-    <w:lsdException w:name="Grid Table 3 Accent 2" w:uiPriority="48"/>
-    <w:lsdException w:name="Grid Table 4 Accent 2" w:uiPriority="49"/>
-    <w:lsdException w:name="Grid Table 5 Dark Accent 2" w:uiPriority="50"/>
-    <w:lsdException w:name="Grid Table 6 Colorful Accent 2" w:uiPriority="51"/>
-    <w:lsdException w:name="Grid Table 7 Colorful Accent 2" w:uiPriority="52"/>
-    <w:lsdException w:name="Grid Table 1 Light Accent 3" w:uiPriority="46"/>
-    <w:lsdException w:name="Grid Table 2 Accent 3" w:uiPriority="47"/>
-    <w:lsdException w:name="Grid Table 3 Accent 3" w:uiPriority="48"/>
-    <w:lsdException w:name="Grid Table 4 Accent 3" w:uiPriority="49"/>
-    <w:lsdException w:name="Grid Table 5 Dark Accent 3" w:uiPriority="50"/>
-    <w:lsdException w:name="Grid Table 6 Colorful Accent 3" w:uiPriority="51"/>
-    <w:lsdException w:name="Grid Table 7 Colorful Accent 3" w:uiPriority="52"/>
-    <w:lsdException w:name="Grid Table 1 Light Accent 4" w:uiPriority="46"/>
-    <w:lsdException w:name="Grid Table 2 Accent 4" w:uiPriority="47"/>
-    <w:lsdException w:name="Grid Table 3 Accent 4" w:uiPriority="48"/>
-    <w:lsdException w:name="Grid Table 4 Accent 4" w:uiPriority="49"/>
-    <w:lsdException w:name="Grid Table 5 Dark Accent 4" w:uiPriority="50"/>
-    <w:lsdException w:name="Grid Table 6 Colorful Accent 4" w:uiPriority="51"/>
-    <w:lsdException w:name="Grid Table 7 Colorful Accent 4" w:uiPriority="52"/>
-    <w:lsdException w:name="Grid Table 1 Light Accent 5" w:uiPriority="46"/>
-    <w:lsdException w:name="Grid Table 2 Accent 5" w:uiPriority="47"/>
-    <w:lsdException w:name="Grid Table 3 Accent 5" w:uiPriority="48"/>
-    <w:lsdException w:name="Grid Table 4 Accent 5" w:uiPriority="49"/>
-    <w:lsdException w:name="Grid Table 5 Dark Accent 5" w:uiPriority="50"/>
-    <w:lsdException w:name="Grid Table 6 Colorful Accent 5" w:uiPriority="51"/>
-    <w:lsdException w:name="Grid Table 7 Colorful Accent 5" w:uiPriority="52"/>
-    <w:lsdException w:name="Grid Table 1 Light Accent 6" w:uiPriority="46"/>
-    <w:lsdException w:name="Grid Table 2 Accent 6" w:uiPriority="47"/>
-    <w:lsdException w:name="Grid Table 3 Accent 6" w:uiPriority="48"/>
-    <w:lsdException w:name="Grid Table 4 Accent 6" w:uiPriority="49"/>
-    <w:lsdException w:name="Grid Table 5 Dark Accent 6" w:uiPriority="50"/>
-    <w:lsdException w:name="Grid Table 6 Colorful Accent 6" w:uiPriority="51"/>
-    <w:lsdException w:name="Grid Table 7 Colorful Accent 6" w:uiPriority="52"/>
-    <w:lsdException w:name="List Table 1 Light" w:uiPriority="46"/>
-    <w:lsdException w:name="List Table 2" w:uiPriority="47"/>
-    <w:lsdException w:name="List Table 3" w:uiPriority="48"/>
-    <w:lsdException w:name="List Table 4" w:uiPriority="49"/>
-    <w:lsdException w:name="List Table 5 Dark" w:uiPriority="50"/>
-    <w:lsdException w:name="List Table 6 Colorful" w:uiPriority="51"/>
-    <w:lsdException w:name="List Table 7 Colorful" w:uiPriority="52"/>
-    <w:lsdException w:name="List Table 1 Light Accent 1" w:uiPriority="46"/>
-    <w:lsdException w:name="List Table 2 Accent 1" w:uiPriority="47"/>
-    <w:lsdException w:name="List Table 3 Accent 1" w:uiPriority="48"/>
-    <w:lsdException w:name="List Table 4 Accent 1" w:uiPriority="49"/>
-    <w:lsdException w:name="List Table 5 Dark Accent 1" w:uiPriority="50"/>
-    <w:lsdException w:name="List Table 6 Colorful Accent 1" w:uiPriority="51"/>
-    <w:lsdException w:name="List Table 7 Colorful Accent 1" w:uiPriority="52"/>
-    <w:lsdException w:name="List Table 1 Light Accent 2" w:uiPriority="46"/>
-    <w:lsdException w:name="List Table 2 Accent 2" w:uiPriority="47"/>
-    <w:lsdException w:name="List Table 3 Accent 2" w:uiPriority="48"/>
-    <w:lsdException w:name="List Table 4 Accent 2" w:uiPriority="49"/>
-    <w:lsdException w:name="List Table 5 Dark Accent 2" w:uiPriority="50"/>
-    <w:lsdException w:name="List Table 6 Colorful Accent 2" w:uiPriority="51"/>
-    <w:lsdException w:name="List Table 7 Colorful Accent 2" w:uiPriority="52"/>
-    <w:lsdException w:name="List Table 1 Light Accent 3" w:uiPriority="46"/>
-    <w:lsdException w:name="List Table 2 Accent 3" w:uiPriority="47"/>
-    <w:lsdException w:name="List Table 3 Accent 3" w:uiPriority="48"/>
-    <w:lsdException w:name="List Table 4 Accent 3" w:uiPriority="49"/>
-    <w:lsdException w:name="List Table 5 Dark Accent 3" w:uiPriority="50"/>
-    <w:lsdException w:name="List Table 6 Colorful Accent 3" w:uiPriority="51"/>
-    <w:lsdException w:name="List Table 7 Colorful Accent 3" w:uiPriority="52"/>
-    <w:lsdException w:name="List Table 1 Light Accent 4" w:uiPriority="46"/>
-    <w:lsdException w:name="List Table 2 Accent 4" w:uiPriority="47"/>
-    <w:lsdException w:name="List Table 3 Accent 4" w:uiPriority="48"/>
-    <w:lsdException w:name="List Table 4 Accent 4" w:uiPriority="49"/>
-    <w:lsdException w:name="List Table 5 Dark Accent 4" w:uiPriority="50"/>
-    <w:lsdException w:name="List Table 6 Colorful Accent 4" w:uiPriority="51"/>
-    <w:lsdException w:name="List Table 7 Colorful Accent 4" w:uiPriority="52"/>
-    <w:lsdException w:name="List Table 1 Light Accent 5" w:uiPriority="46"/>
-    <w:lsdException w:name="List Table 2 Accent 5" w:uiPriority="47"/>
-    <w:lsdException w:name="List Table 3 Accent 5" w:uiPriority="48"/>
-    <w:lsdException w:name="List Table 4 Accent 5" w:uiPriority="49"/>
-    <w:lsdException w:name="List Table 5 Dark Accent 5" w:uiPriority="50"/>
-    <w:lsdException w:name="List Table 6 Colorful Accent 5" w:uiPriority="51"/>
-    <w:lsdException w:name="List Table 7 Colorful Accent 5" w:uiPriority="52"/>
-    <w:lsdException w:name="List Table 1 Light Accent 6" w:uiPriority="46"/>
-    <w:lsdException w:name="List Table 2 Accent 6" w:uiPriority="47"/>
-    <w:lsdException w:name="List Table 3 Accent 6" w:uiPriority="48"/>
-    <w:lsdException w:name="List Table 4 Accent 6" w:uiPriority="49"/>
-    <w:lsdException w:name="List Table 5 Dark Accent 6" w:uiPriority="50"/>
-    <w:lsdException w:name="List Table 6 Colorful Accent 6" w:uiPriority="51"/>
-    <w:lsdException w:name="List Table 7 Colorful Accent 6" w:uiPriority="52"/>
-    <w:lsdException w:name="Mention" w:semiHidden="1" w:unhideWhenUsed="1"/>
-    <w:lsdException w:name="Smart Hyperlink" w:semiHidden="1" w:unhideWhenUsed="1"/>
-    <w:lsdException w:name="Hashtag" w:semiHidden="1" w:unhideWhenUsed="1"/>
-    <w:lsdException w:name="Unresolved Mention" w:semiHidden="1" w:unhideWhenUsed="1"/>
-    <w:lsdException w:name="Smart Link" w:semiHidden="1" w:unhideWhenUsed="1"/>
+  <w:latentStyles w:defLockedState="0" w:defUIPriority="99" w:defSemiHidden="1" w:defUnhideWhenUsed="1" w:defQFormat="0" w:count="267">
+    <w:lsdException w:name="Normal" w:semiHidden="0" w:uiPriority="0" w:unhideWhenUsed="0" w:qFormat="1"/>
+    <w:lsdException w:name="heading 1" w:semiHidden="0" w:uiPriority="9" w:unhideWhenUsed="0" w:qFormat="1"/>
+    <w:lsdException w:name="heading 2" w:uiPriority="9" w:qFormat="1"/>
+    <w:lsdException w:name="heading 3" w:uiPriority="9" w:qFormat="1"/>
+    <w:lsdException w:name="heading 4" w:uiPriority="9" w:qFormat="1"/>
+    <w:lsdException w:name="heading 5" w:uiPriority="9" w:qFormat="1"/>
+    <w:lsdException w:name="heading 6" w:uiPriority="9" w:qFormat="1"/>
+    <w:lsdException w:name="heading 7" w:uiPriority="9" w:qFormat="1"/>
+    <w:lsdException w:name="heading 8" w:uiPriority="9" w:qFormat="1"/>
+    <w:lsdException w:name="heading 9" w:uiPriority="9" w:qFormat="1"/>
+    <w:lsdException w:name="toc 1" w:uiPriority="39"/>
+    <w:lsdException w:name="toc 2" w:uiPriority="39"/>
+    <w:lsdException w:name="toc 3" w:uiPriority="39"/>
+    <w:lsdException w:name="toc 4" w:uiPriority="39"/>
+    <w:lsdException w:name="toc 5" w:uiPriority="39"/>
+    <w:lsdException w:name="toc 6" w:uiPriority="39"/>
+    <w:lsdException w:name="toc 7" w:uiPriority="39"/>
+    <w:lsdException w:name="toc 8" w:uiPriority="39"/>
+    <w:lsdException w:name="toc 9" w:uiPriority="39"/>
+    <w:lsdException w:name="caption" w:uiPriority="35" w:qFormat="1"/>
+    <w:lsdException w:name="Title" w:semiHidden="0" w:uiPriority="10" w:unhideWhenUsed="0" w:qFormat="1"/>
+    <w:lsdException w:name="Default Paragraph Font" w:uiPriority="1"/>
+    <w:lsdException w:name="Subtitle" w:semiHidden="0" w:uiPriority="11" w:unhideWhenUsed="0" w:qFormat="1"/>
+    <w:lsdException w:name="Strong" w:semiHidden="0" w:uiPriority="22" w:unhideWhenUsed="0" w:qFormat="1"/>
+    <w:lsdException w:name="Emphasis" w:semiHidden="0" w:uiPriority="20" w:unhideWhenUsed="0" w:qFormat="1"/>
+    <w:lsdException w:name="Table Grid" w:semiHidden="0" w:uiPriority="39" w:unhideWhenUsed="0"/>
+    <w:lsdException w:name="Placeholder Text" w:unhideWhenUsed="0"/>
+    <w:lsdException w:name="No Spacing" w:semiHidden="0" w:uiPriority="1" w:unhideWhenUsed="0" w:qFormat="1"/>
+    <w:lsdException w:name="Light Shading" w:semiHidden="0" w:uiPriority="60" w:unhideWhenUsed="0"/>
+    <w:lsdException w:name="Light List" w:semiHidden="0" w:uiPriority="61" w:unhideWhenUsed="0"/>
+    <w:lsdException w:name="Light Grid" w:semiHidden="0" w:uiPriority="62" w:unhideWhenUsed="0"/>
+    <w:lsdException w:name="Medium Shading 1" w:semiHidden="0" w:uiPriority="63" w:unhideWhenUsed="0"/>
+    <w:lsdException w:name="Medium Shading 2" w:semiHidden="0" w:uiPriority="64" w:unhideWhenUsed="0"/>
+    <w:lsdException w:name="Medium List 1" w:semiHidden="0" w:uiPriority="65" w:unhideWhenUsed="0"/>
+    <w:lsdException w:name="Medium List 2" w:semiHidden="0" w:uiPriority="66" w:unhideWhenUsed="0"/>
+    <w:lsdException w:name="Medium Grid 1" w:semiHidden="0" w:uiPriority="67" w:unhideWhenUsed="0"/>
+    <w:lsdException w:name="Medium Grid 2" w:semiHidden="0" w:uiPriority="68" w:unhideWhenUsed="0"/>
+    <w:lsdException w:name="Medium Grid 3" w:semiHidden="0" w:uiPriority="69" w:unhideWhenUsed="0"/>
+    <w:lsdException w:name="Dark List" w:semiHidden="0" w:uiPriority="70" w:unhideWhenUsed="0"/>
+    <w:lsdException w:name="Colorful Shading" w:semiHidden="0" w:uiPriority="71" w:unhideWhenUsed="0"/>
+    <w:lsdException w:name="Colorful List" w:semiHidden="0" w:uiPriority="72" w:unhideWhenUsed="0"/>
+    <w:lsdException w:name="Colorful Grid" w:semiHidden="0" w:uiPriority="73" w:unhideWhenUsed="0"/>
+    <w:lsdException w:name="Light Shading Accent 1" w:semiHidden="0" w:uiPriority="60" w:unhideWhenUsed="0"/>
+    <w:lsdException w:name="Light List Accent 1" w:semiHidden="0" w:uiPriority="61" w:unhideWhenUsed="0"/>
+    <w:lsdException w:name="Light Grid Accent 1" w:semiHidden="0" w:uiPriority="62" w:unhideWhenUsed="0"/>
+    <w:lsdException w:name="Medium Shading 1 Accent 1" w:semiHidden="0" w:uiPriority="63" w:unhideWhenUsed="0"/>
+    <w:lsdException w:name="Medium Shading 2 Accent 1" w:semiHidden="0" w:uiPriority="64" w:unhideWhenUsed="0"/>
+    <w:lsdException w:name="Medium List 1 Accent 1" w:semiHidden="0" w:uiPriority="65" w:unhideWhenUsed="0"/>
+    <w:lsdException w:name="Revision" w:unhideWhenUsed="0"/>
+    <w:lsdException w:name="List Paragraph" w:semiHidden="0" w:uiPriority="34" w:unhideWhenUsed="0" w:qFormat="1"/>
+    <w:lsdException w:name="Quote" w:semiHidden="0" w:uiPriority="29" w:unhideWhenUsed="0" w:qFormat="1"/>
+    <w:lsdException w:name="Intense Quote" w:semiHidden="0" w:uiPriority="30" w:unhideWhenUsed="0" w:qFormat="1"/>
+    <w:lsdException w:name="Medium List 2 Accent 1" w:semiHidden="0" w:uiPriority="66" w:unhideWhenUsed="0"/>
+    <w:lsdException w:name="Medium Grid 1 Accent 1" w:semiHidden="0" w:uiPriority="67" w:unhideWhenUsed="0"/>
+    <w:lsdException w:name="Medium Grid 2 Accent 1" w:semiHidden="0" w:uiPriority="68" w:unhideWhenUsed="0"/>
+    <w:lsdException w:name="Medium Grid 3 Accent 1" w:semiHidden="0" w:uiPriority="69" w:unhideWhenUsed="0"/>
+    <w:lsdException w:name="Dark List Accent 1" w:semiHidden="0" w:uiPriority="70" w:unhideWhenUsed="0"/>
+    <w:lsdException w:name="Colorful Shading Accent 1" w:semiHidden="0" w:uiPriority="71" w:unhideWhenUsed="0"/>
+    <w:lsdException w:name="Colorful List Accent 1" w:semiHidden="0" w:uiPriority="72" w:unhideWhenUsed="0"/>
+    <w:lsdException w:name="Colorful Grid Accent 1" w:semiHidden="0" w:uiPriority="73" w:unhideWhenUsed="0"/>
+    <w:lsdException w:name="Light Shading Accent 2" w:semiHidden="0" w:uiPriority="60" w:unhideWhenUsed="0"/>
+    <w:lsdException w:name="Light List Accent 2" w:semiHidden="0" w:uiPriority="61" w:unhideWhenUsed="0"/>
+    <w:lsdException w:name="Light Grid Accent 2" w:semiHidden="0" w:uiPriority="62" w:unhideWhenUsed="0"/>
+    <w:lsdException w:name="Medium Shading 1 Accent 2" w:semiHidden="0" w:uiPriority="63" w:unhideWhenUsed="0"/>
+    <w:lsdException w:name="Medium Shading 2 Accent 2" w:semiHidden="0" w:uiPriority="64" w:unhideWhenUsed="0"/>
+    <w:lsdException w:name="Medium List 1 Accent 2" w:semiHidden="0" w:uiPriority="65" w:unhideWhenUsed="0"/>
+    <w:lsdException w:name="Medium List 2 Accent 2" w:semiHidden="0" w:uiPriority="66" w:unhideWhenUsed="0"/>
+    <w:lsdException w:name="Medium Grid 1 Accent 2" w:semiHidden="0" w:uiPriority="67" w:unhideWhenUsed="0"/>
+    <w:lsdException w:name="Medium Grid 2 Accent 2" w:semiHidden="0" w:uiPriority="68" w:unhideWhenUsed="0"/>
+    <w:lsdException w:name="Medium Grid 3 Accent 2" w:semiHidden="0" w:uiPriority="69" w:unhideWhenUsed="0"/>
+    <w:lsdException w:name="Dark List Accent 2" w:semiHidden="0" w:uiPriority="70" w:unhideWhenUsed="0"/>
+    <w:lsdException w:name="Colorful Shading Accent 2" w:semiHidden="0" w:uiPriority="71" w:unhideWhenUsed="0"/>
+    <w:lsdException w:name="Colorful List Accent 2" w:semiHidden="0" w:uiPriority="72" w:unhideWhenUsed="0"/>
+    <w:lsdException w:name="Colorful Grid Accent 2" w:semiHidden="0" w:uiPriority="73" w:unhideWhenUsed="0"/>
+    <w:lsdException w:name="Light Shading Accent 3" w:semiHidden="0" w:uiPriority="60" w:unhideWhenUsed="0"/>
+    <w:lsdException w:name="Light List Accent 3" w:semiHidden="0" w:uiPriority="61" w:unhideWhenUsed="0"/>
+    <w:lsdException w:name="Light Grid Accent 3" w:semiHidden="0" w:uiPriority="62" w:unhideWhenUsed="0"/>
+    <w:lsdException w:name="Medium Shading 1 Accent 3" w:semiHidden="0" w:uiPriority="63" w:unhideWhenUsed="0"/>
+    <w:lsdException w:name="Medium Shading 2 Accent 3" w:semiHidden="0" w:uiPriority="64" w:unhideWhenUsed="0"/>
+    <w:lsdException w:name="Medium List 1 Accent 3" w:semiHidden="0" w:uiPriority="65" w:unhideWhenUsed="0"/>
+    <w:lsdException w:name="Medium List 2 Accent 3" w:semiHidden="0" w:uiPriority="66" w:unhideWhenUsed="0"/>
+    <w:lsdException w:name="Medium Grid 1 Accent 3" w:semiHidden="0" w:uiPriority="67" w:unhideWhenUsed="0"/>
+    <w:lsdException w:name="Medium Grid 2 Accent 3" w:semiHidden="0" w:uiPriority="68" w:unhideWhenUsed="0"/>
+    <w:lsdException w:name="Medium Grid 3 Accent 3" w:semiHidden="0" w:uiPriority="69" w:unhideWhenUsed="0"/>
+    <w:lsdException w:name="Dark List Accent 3" w:semiHidden="0" w:uiPriority="70" w:unhideWhenUsed="0"/>
+    <w:lsdException w:name="Colorful Shading Accent 3" w:semiHidden="0" w:uiPriority="71" w:unhideWhenUsed="0"/>
+    <w:lsdException w:name="Colorful List Accent 3" w:semiHidden="0" w:uiPriority="72" w:unhideWhenUsed="0"/>
+    <w:lsdException w:name="Colorful Grid Accent 3" w:semiHidden="0" w:uiPriority="73" w:unhideWhenUsed="0"/>
+    <w:lsdException w:name="Light Shading Accent 4" w:semiHidden="0" w:uiPriority="60" w:unhideWhenUsed="0"/>
+    <w:lsdException w:name="Light List Accent 4" w:semiHidden="0" w:uiPriority="61" w:unhideWhenUsed="0"/>
+    <w:lsdException w:name="Light Grid Accent 4" w:semiHidden="0" w:uiPriority="62" w:unhideWhenUsed="0"/>
+    <w:lsdException w:name="Medium Shading 1 Accent 4" w:semiHidden="0" w:uiPriority="63" w:unhideWhenUsed="0"/>
+    <w:lsdException w:name="Medium Shading 2 Accent 4" w:semiHidden="0" w:uiPriority="64" w:unhideWhenUsed="0"/>
+    <w:lsdException w:name="Medium List 1 Accent 4" w:semiHidden="0" w:uiPriority="65" w:unhideWhenUsed="0"/>
+    <w:lsdException w:name="Medium List 2 Accent 4" w:semiHidden="0" w:uiPriority="66" w:unhideWhenUsed="0"/>
+    <w:lsdException w:name="Medium Grid 1 Accent 4" w:semiHidden="0" w:uiPriority="67" w:unhideWhenUsed="0"/>
+    <w:lsdException w:name="Medium Grid 2 Accent 4" w:semiHidden="0" w:uiPriority="68" w:unhideWhenUsed="0"/>
+    <w:lsdException w:name="Medium Grid 3 Accent 4" w:semiHidden="0" w:uiPriority="69" w:unhideWhenUsed="0"/>
+    <w:lsdException w:name="Dark List Accent 4" w:semiHidden="0" w:uiPriority="70" w:unhideWhenUsed="0"/>
+    <w:lsdException w:name="Colorful Shading Accent 4" w:semiHidden="0" w:uiPriority="71" w:unhideWhenUsed="0"/>
+    <w:lsdException w:name="Colorful List Accent 4" w:semiHidden="0" w:uiPriority="72" w:unhideWhenUsed="0"/>
+    <w:lsdException w:name="Colorful Grid Accent 4" w:semiHidden="0" w:uiPriority="73" w:unhideWhenUsed="0"/>
+    <w:lsdException w:name="Light Shading Accent 5" w:semiHidden="0" w:uiPriority="60" w:unhideWhenUsed="0"/>
+    <w:lsdException w:name="Light List Accent 5" w:semiHidden="0" w:uiPriority="61" w:unhideWhenUsed="0"/>
+    <w:lsdException w:name="Light Grid Accent 5" w:semiHidden="0" w:uiPriority="62" w:unhideWhenUsed="0"/>
+    <w:lsdException w:name="Medium Shading 1 Accent 5" w:semiHidden="0" w:uiPriority="63" w:unhideWhenUsed="0"/>
+    <w:lsdException w:name="Medium Shading 2 Accent 5" w:semiHidden="0" w:uiPriority="64" w:unhideWhenUsed="0"/>
+    <w:lsdException w:name="Medium List 1 Accent 5" w:semiHidden="0" w:uiPriority="65" w:unhideWhenUsed="0"/>
+    <w:lsdException w:name="Medium List 2 Accent 5" w:semiHidden="0" w:uiPriority="66" w:unhideWhenUsed="0"/>
+    <w:lsdException w:name="Medium Grid 1 Accent 5" w:semiHidden="0" w:uiPriority="67" w:unhideWhenUsed="0"/>
+    <w:lsdException w:name="Medium Grid 2 Accent 5" w:semiHidden="0" w:uiPriority="68" w:unhideWhenUsed="0"/>
+    <w:lsdException w:name="Medium Grid 3 Accent 5" w:semiHidden="0" w:uiPriority="69" w:unhideWhenUsed="0"/>
+    <w:lsdException w:name="Dark List Accent 5" w:semiHidden="0" w:uiPriority="70" w:unhideWhenUsed="0"/>
+    <w:lsdException w:name="Colorful Shading Accent 5" w:semiHidden="0" w:uiPriority="71" w:unhideWhenUsed="0"/>
+    <w:lsdException w:name="Colorful List Accent 5" w:semiHidden="0" w:uiPriority="72" w:unhideWhenUsed="0"/>
+    <w:lsdException w:name="Colorful Grid Accent 5" w:semiHidden="0" w:uiPriority="73" w:unhideWhenUsed="0"/>
+    <w:lsdException w:name="Light Shading Accent 6" w:semiHidden="0" w:uiPriority="60" w:unhideWhenUsed="0"/>
+    <w:lsdException w:name="Light List Accent 6" w:semiHidden="0" w:uiPriority="61" w:unhideWhenUsed="0"/>
+    <w:lsdException w:name="Light Grid Accent 6" w:semiHidden="0" w:uiPriority="62" w:unhideWhenUsed="0"/>
+    <w:lsdException w:name="Medium Shading 1 Accent 6" w:semiHidden="0" w:uiPriority="63" w:unhideWhenUsed="0"/>
+    <w:lsdException w:name="Medium Shading 2 Accent 6" w:semiHidden="0" w:uiPriority="64" w:unhideWhenUsed="0"/>
+    <w:lsdException w:name="Medium List 1 Accent 6" w:semiHidden="0" w:uiPriority="65" w:unhideWhenUsed="0"/>
+    <w:lsdException w:name="Medium List 2 Accent 6" w:semiHidden="0" w:uiPriority="66" w:unhideWhenUsed="0"/>
+    <w:lsdException w:name="Medium Grid 1 Accent 6" w:semiHidden="0" w:uiPriority="67" w:unhideWhenUsed="0"/>
+    <w:lsdException w:name="Medium Grid 2 Accent 6" w:semiHidden="0" w:uiPriority="68" w:unhideWhenUsed="0"/>
+    <w:lsdException w:name="Medium Grid 3 Accent 6" w:semiHidden="0" w:uiPriority="69" w:unhideWhenUsed="0"/>
+    <w:lsdException w:name="Dark List Accent 6" w:semiHidden="0" w:uiPriority="70" w:unhideWhenUsed="0"/>
+    <w:lsdException w:name="Colorful Shading Accent 6" w:semiHidden="0" w:uiPriority="71" w:unhideWhenUsed="0"/>
+    <w:lsdException w:name="Colorful List Accent 6" w:semiHidden="0" w:uiPriority="72" w:unhideWhenUsed="0"/>
+    <w:lsdException w:name="Colorful Grid Accent 6" w:semiHidden="0" w:uiPriority="73" w:unhideWhenUsed="0"/>
+    <w:lsdException w:name="Subtle Emphasis" w:semiHidden="0" w:uiPriority="19" w:unhideWhenUsed="0" w:qFormat="1"/>
+    <w:lsdException w:name="Intense Emphasis" w:semiHidden="0" w:uiPriority="21" w:unhideWhenUsed="0" w:qFormat="1"/>
+    <w:lsdException w:name="Subtle Reference" w:semiHidden="0" w:uiPriority="31" w:unhideWhenUsed="0" w:qFormat="1"/>
+    <w:lsdException w:name="Intense Reference" w:semiHidden="0" w:uiPriority="32" w:unhideWhenUsed="0" w:qFormat="1"/>
+    <w:lsdException w:name="Book Title" w:semiHidden="0" w:uiPriority="33" w:unhideWhenUsed="0" w:qFormat="1"/>
+    <w:lsdException w:name="Bibliography" w:uiPriority="37"/>
+    <w:lsdException w:name="TOC Heading" w:uiPriority="39" w:qFormat="1"/>
   </w:latentStyles>
   <w:style w:type="paragraph" w:default="1" w:styleId="Normal">
     <w:name w:val="Normal"/>
@@ -3599,7 +3339,7 @@
       <w:u w:val="single"/>
     </w:rPr>
   </w:style>
-  <w:style w:type="character" w:styleId="UnresolvedMention">
+  <w:style w:type="character" w:customStyle="1" w:styleId="UnresolvedMention">
     <w:name w:val="Unresolved Mention"/>
     <w:basedOn w:val="DefaultParagraphFont"/>
     <w:uiPriority w:val="99"/>
@@ -3629,6 +3369,1031 @@
         <w:insideV w:val="single" w:sz="4" w:space="0" w:color="auto"/>
       </w:tblBorders>
     </w:tblPr>
+  </w:style>
+  <w:style w:type="paragraph" w:styleId="BalloonText">
+    <w:name w:val="Balloon Text"/>
+    <w:basedOn w:val="Normal"/>
+    <w:link w:val="BalloonTextChar"/>
+    <w:uiPriority w:val="99"/>
+    <w:semiHidden/>
+    <w:unhideWhenUsed/>
+    <w:rsid w:val="00665955"/>
+    <w:pPr>
+      <w:spacing w:after="0" w:line="240" w:lineRule="auto"/>
+    </w:pPr>
+    <w:rPr>
+      <w:rFonts w:ascii="Tahoma" w:hAnsi="Tahoma" w:cs="Tahoma"/>
+      <w:sz w:val="16"/>
+      <w:szCs w:val="16"/>
+    </w:rPr>
+  </w:style>
+  <w:style w:type="character" w:customStyle="1" w:styleId="BalloonTextChar">
+    <w:name w:val="Balloon Text Char"/>
+    <w:basedOn w:val="DefaultParagraphFont"/>
+    <w:link w:val="BalloonText"/>
+    <w:uiPriority w:val="99"/>
+    <w:semiHidden/>
+    <w:rsid w:val="00665955"/>
+    <w:rPr>
+      <w:rFonts w:ascii="Tahoma" w:hAnsi="Tahoma" w:cs="Tahoma"/>
+      <w:sz w:val="16"/>
+      <w:szCs w:val="16"/>
+    </w:rPr>
+  </w:style>
+  <w:style w:type="table" w:styleId="MediumShading1-Accent4">
+    <w:name w:val="Medium Shading 1 Accent 4"/>
+    <w:basedOn w:val="TableNormal"/>
+    <w:uiPriority w:val="63"/>
+    <w:rsid w:val="00665955"/>
+    <w:pPr>
+      <w:spacing w:after="0" w:line="240" w:lineRule="auto"/>
+    </w:pPr>
+    <w:tblPr>
+      <w:tblStyleRowBandSize w:val="1"/>
+      <w:tblStyleColBandSize w:val="1"/>
+      <w:tblBorders>
+        <w:top w:val="single" w:sz="8" w:space="0" w:color="39BEF1" w:themeColor="accent4" w:themeTint="BF"/>
+        <w:left w:val="single" w:sz="8" w:space="0" w:color="39BEF1" w:themeColor="accent4" w:themeTint="BF"/>
+        <w:bottom w:val="single" w:sz="8" w:space="0" w:color="39BEF1" w:themeColor="accent4" w:themeTint="BF"/>
+        <w:right w:val="single" w:sz="8" w:space="0" w:color="39BEF1" w:themeColor="accent4" w:themeTint="BF"/>
+        <w:insideH w:val="single" w:sz="8" w:space="0" w:color="39BEF1" w:themeColor="accent4" w:themeTint="BF"/>
+      </w:tblBorders>
+    </w:tblPr>
+    <w:tblStylePr w:type="firstRow">
+      <w:pPr>
+        <w:spacing w:before="0" w:after="0" w:line="240" w:lineRule="auto"/>
+      </w:pPr>
+      <w:rPr>
+        <w:b/>
+        <w:bCs/>
+        <w:color w:val="FFFFFF" w:themeColor="background1"/>
+      </w:rPr>
+      <w:tblPr/>
+      <w:tcPr>
+        <w:tcBorders>
+          <w:top w:val="single" w:sz="8" w:space="0" w:color="39BEF1" w:themeColor="accent4" w:themeTint="BF"/>
+          <w:left w:val="single" w:sz="8" w:space="0" w:color="39BEF1" w:themeColor="accent4" w:themeTint="BF"/>
+          <w:bottom w:val="single" w:sz="8" w:space="0" w:color="39BEF1" w:themeColor="accent4" w:themeTint="BF"/>
+          <w:right w:val="single" w:sz="8" w:space="0" w:color="39BEF1" w:themeColor="accent4" w:themeTint="BF"/>
+          <w:insideH w:val="nil"/>
+          <w:insideV w:val="nil"/>
+        </w:tcBorders>
+        <w:shd w:val="clear" w:color="auto" w:fill="0F9ED5" w:themeFill="accent4"/>
+      </w:tcPr>
+    </w:tblStylePr>
+    <w:tblStylePr w:type="lastRow">
+      <w:pPr>
+        <w:spacing w:before="0" w:after="0" w:line="240" w:lineRule="auto"/>
+      </w:pPr>
+      <w:rPr>
+        <w:b/>
+        <w:bCs/>
+      </w:rPr>
+      <w:tblPr/>
+      <w:tcPr>
+        <w:tcBorders>
+          <w:top w:val="double" w:sz="6" w:space="0" w:color="39BEF1" w:themeColor="accent4" w:themeTint="BF"/>
+          <w:left w:val="single" w:sz="8" w:space="0" w:color="39BEF1" w:themeColor="accent4" w:themeTint="BF"/>
+          <w:bottom w:val="single" w:sz="8" w:space="0" w:color="39BEF1" w:themeColor="accent4" w:themeTint="BF"/>
+          <w:right w:val="single" w:sz="8" w:space="0" w:color="39BEF1" w:themeColor="accent4" w:themeTint="BF"/>
+          <w:insideH w:val="nil"/>
+          <w:insideV w:val="nil"/>
+        </w:tcBorders>
+      </w:tcPr>
+    </w:tblStylePr>
+    <w:tblStylePr w:type="firstCol">
+      <w:rPr>
+        <w:b/>
+        <w:bCs/>
+      </w:rPr>
+    </w:tblStylePr>
+    <w:tblStylePr w:type="lastCol">
+      <w:rPr>
+        <w:b/>
+        <w:bCs/>
+      </w:rPr>
+    </w:tblStylePr>
+    <w:tblStylePr w:type="band1Vert">
+      <w:tblPr/>
+      <w:tcPr>
+        <w:shd w:val="clear" w:color="auto" w:fill="BDE9FA" w:themeFill="accent4" w:themeFillTint="3F"/>
+      </w:tcPr>
+    </w:tblStylePr>
+    <w:tblStylePr w:type="band1Horz">
+      <w:tblPr/>
+      <w:tcPr>
+        <w:tcBorders>
+          <w:insideH w:val="nil"/>
+          <w:insideV w:val="nil"/>
+        </w:tcBorders>
+        <w:shd w:val="clear" w:color="auto" w:fill="BDE9FA" w:themeFill="accent4" w:themeFillTint="3F"/>
+      </w:tcPr>
+    </w:tblStylePr>
+    <w:tblStylePr w:type="band2Horz">
+      <w:tblPr/>
+      <w:tcPr>
+        <w:tcBorders>
+          <w:insideH w:val="nil"/>
+          <w:insideV w:val="nil"/>
+        </w:tcBorders>
+      </w:tcPr>
+    </w:tblStylePr>
+  </w:style>
+</w:styles>
+</file>
+
+<file path=word/stylesWithEffects.xml><?xml version="1.0" encoding="utf-8"?>
+<w:styles xmlns:wpc="http://schemas.microsoft.com/office/word/2010/wordprocessingCanvas" xmlns:mc="http://schemas.openxmlformats.org/markup-compatibility/2006" xmlns:o="urn:schemas-microsoft-com:office:office" xmlns:r="http://schemas.openxmlformats.org/officeDocument/2006/relationships" xmlns:m="http://schemas.openxmlformats.org/officeDocument/2006/math" xmlns:v="urn:schemas-microsoft-com:vml" xmlns:wp14="http://schemas.microsoft.com/office/word/2010/wordprocessingDrawing" xmlns:wp="http://schemas.openxmlformats.org/drawingml/2006/wordprocessingDrawing" xmlns:w10="urn:schemas-microsoft-com:office:word" xmlns:w="http://schemas.openxmlformats.org/wordprocessingml/2006/main" xmlns:w14="http://schemas.microsoft.com/office/word/2010/wordml" xmlns:wpg="http://schemas.microsoft.com/office/word/2010/wordprocessingGroup" xmlns:wpi="http://schemas.microsoft.com/office/word/2010/wordprocessingInk" xmlns:wne="http://schemas.microsoft.com/office/word/2006/wordml" xmlns:wps="http://schemas.microsoft.com/office/word/2010/wordprocessingShape" mc:Ignorable="w14 wp14">
+  <w:docDefaults>
+    <w:rPrDefault>
+      <w:rPr>
+        <w:rFonts w:asciiTheme="minorHAnsi" w:eastAsiaTheme="minorHAnsi" w:hAnsiTheme="minorHAnsi" w:cstheme="minorBidi"/>
+        <w:kern w:val="2"/>
+        <w:sz w:val="24"/>
+        <w:szCs w:val="24"/>
+        <w:lang w:val="sl-SI" w:eastAsia="en-US" w:bidi="ar-SA"/>
+        <w14:ligatures w14:val="standardContextual"/>
+      </w:rPr>
+    </w:rPrDefault>
+    <w:pPrDefault>
+      <w:pPr>
+        <w:spacing w:after="160" w:line="278" w:lineRule="auto"/>
+      </w:pPr>
+    </w:pPrDefault>
+  </w:docDefaults>
+  <w:latentStyles w:defLockedState="0" w:defUIPriority="99" w:defSemiHidden="1" w:defUnhideWhenUsed="1" w:defQFormat="0" w:count="267">
+    <w:lsdException w:name="Normal" w:semiHidden="0" w:uiPriority="0" w:unhideWhenUsed="0" w:qFormat="1"/>
+    <w:lsdException w:name="heading 1" w:semiHidden="0" w:uiPriority="9" w:unhideWhenUsed="0" w:qFormat="1"/>
+    <w:lsdException w:name="heading 2" w:uiPriority="9" w:qFormat="1"/>
+    <w:lsdException w:name="heading 3" w:uiPriority="9" w:qFormat="1"/>
+    <w:lsdException w:name="heading 4" w:uiPriority="9" w:qFormat="1"/>
+    <w:lsdException w:name="heading 5" w:uiPriority="9" w:qFormat="1"/>
+    <w:lsdException w:name="heading 6" w:uiPriority="9" w:qFormat="1"/>
+    <w:lsdException w:name="heading 7" w:uiPriority="9" w:qFormat="1"/>
+    <w:lsdException w:name="heading 8" w:uiPriority="9" w:qFormat="1"/>
+    <w:lsdException w:name="heading 9" w:uiPriority="9" w:qFormat="1"/>
+    <w:lsdException w:name="toc 1" w:uiPriority="39"/>
+    <w:lsdException w:name="toc 2" w:uiPriority="39"/>
+    <w:lsdException w:name="toc 3" w:uiPriority="39"/>
+    <w:lsdException w:name="toc 4" w:uiPriority="39"/>
+    <w:lsdException w:name="toc 5" w:uiPriority="39"/>
+    <w:lsdException w:name="toc 6" w:uiPriority="39"/>
+    <w:lsdException w:name="toc 7" w:uiPriority="39"/>
+    <w:lsdException w:name="toc 8" w:uiPriority="39"/>
+    <w:lsdException w:name="toc 9" w:uiPriority="39"/>
+    <w:lsdException w:name="caption" w:uiPriority="35" w:qFormat="1"/>
+    <w:lsdException w:name="Title" w:semiHidden="0" w:uiPriority="10" w:unhideWhenUsed="0" w:qFormat="1"/>
+    <w:lsdException w:name="Default Paragraph Font" w:uiPriority="1"/>
+    <w:lsdException w:name="Subtitle" w:semiHidden="0" w:uiPriority="11" w:unhideWhenUsed="0" w:qFormat="1"/>
+    <w:lsdException w:name="Strong" w:semiHidden="0" w:uiPriority="22" w:unhideWhenUsed="0" w:qFormat="1"/>
+    <w:lsdException w:name="Emphasis" w:semiHidden="0" w:uiPriority="20" w:unhideWhenUsed="0" w:qFormat="1"/>
+    <w:lsdException w:name="Table Grid" w:semiHidden="0" w:uiPriority="39" w:unhideWhenUsed="0"/>
+    <w:lsdException w:name="Placeholder Text" w:unhideWhenUsed="0"/>
+    <w:lsdException w:name="No Spacing" w:semiHidden="0" w:uiPriority="1" w:unhideWhenUsed="0" w:qFormat="1"/>
+    <w:lsdException w:name="Light Shading" w:semiHidden="0" w:uiPriority="60" w:unhideWhenUsed="0"/>
+    <w:lsdException w:name="Light List" w:semiHidden="0" w:uiPriority="61" w:unhideWhenUsed="0"/>
+    <w:lsdException w:name="Light Grid" w:semiHidden="0" w:uiPriority="62" w:unhideWhenUsed="0"/>
+    <w:lsdException w:name="Medium Shading 1" w:semiHidden="0" w:uiPriority="63" w:unhideWhenUsed="0"/>
+    <w:lsdException w:name="Medium Shading 2" w:semiHidden="0" w:uiPriority="64" w:unhideWhenUsed="0"/>
+    <w:lsdException w:name="Medium List 1" w:semiHidden="0" w:uiPriority="65" w:unhideWhenUsed="0"/>
+    <w:lsdException w:name="Medium List 2" w:semiHidden="0" w:uiPriority="66" w:unhideWhenUsed="0"/>
+    <w:lsdException w:name="Medium Grid 1" w:semiHidden="0" w:uiPriority="67" w:unhideWhenUsed="0"/>
+    <w:lsdException w:name="Medium Grid 2" w:semiHidden="0" w:uiPriority="68" w:unhideWhenUsed="0"/>
+    <w:lsdException w:name="Medium Grid 3" w:semiHidden="0" w:uiPriority="69" w:unhideWhenUsed="0"/>
+    <w:lsdException w:name="Dark List" w:semiHidden="0" w:uiPriority="70" w:unhideWhenUsed="0"/>
+    <w:lsdException w:name="Colorful Shading" w:semiHidden="0" w:uiPriority="71" w:unhideWhenUsed="0"/>
+    <w:lsdException w:name="Colorful List" w:semiHidden="0" w:uiPriority="72" w:unhideWhenUsed="0"/>
+    <w:lsdException w:name="Colorful Grid" w:semiHidden="0" w:uiPriority="73" w:unhideWhenUsed="0"/>
+    <w:lsdException w:name="Light Shading Accent 1" w:semiHidden="0" w:uiPriority="60" w:unhideWhenUsed="0"/>
+    <w:lsdException w:name="Light List Accent 1" w:semiHidden="0" w:uiPriority="61" w:unhideWhenUsed="0"/>
+    <w:lsdException w:name="Light Grid Accent 1" w:semiHidden="0" w:uiPriority="62" w:unhideWhenUsed="0"/>
+    <w:lsdException w:name="Medium Shading 1 Accent 1" w:semiHidden="0" w:uiPriority="63" w:unhideWhenUsed="0"/>
+    <w:lsdException w:name="Medium Shading 2 Accent 1" w:semiHidden="0" w:uiPriority="64" w:unhideWhenUsed="0"/>
+    <w:lsdException w:name="Medium List 1 Accent 1" w:semiHidden="0" w:uiPriority="65" w:unhideWhenUsed="0"/>
+    <w:lsdException w:name="Revision" w:unhideWhenUsed="0"/>
+    <w:lsdException w:name="List Paragraph" w:semiHidden="0" w:uiPriority="34" w:unhideWhenUsed="0" w:qFormat="1"/>
+    <w:lsdException w:name="Quote" w:semiHidden="0" w:uiPriority="29" w:unhideWhenUsed="0" w:qFormat="1"/>
+    <w:lsdException w:name="Intense Quote" w:semiHidden="0" w:uiPriority="30" w:unhideWhenUsed="0" w:qFormat="1"/>
+    <w:lsdException w:name="Medium List 2 Accent 1" w:semiHidden="0" w:uiPriority="66" w:unhideWhenUsed="0"/>
+    <w:lsdException w:name="Medium Grid 1 Accent 1" w:semiHidden="0" w:uiPriority="67" w:unhideWhenUsed="0"/>
+    <w:lsdException w:name="Medium Grid 2 Accent 1" w:semiHidden="0" w:uiPriority="68" w:unhideWhenUsed="0"/>
+    <w:lsdException w:name="Medium Grid 3 Accent 1" w:semiHidden="0" w:uiPriority="69" w:unhideWhenUsed="0"/>
+    <w:lsdException w:name="Dark List Accent 1" w:semiHidden="0" w:uiPriority="70" w:unhideWhenUsed="0"/>
+    <w:lsdException w:name="Colorful Shading Accent 1" w:semiHidden="0" w:uiPriority="71" w:unhideWhenUsed="0"/>
+    <w:lsdException w:name="Colorful List Accent 1" w:semiHidden="0" w:uiPriority="72" w:unhideWhenUsed="0"/>
+    <w:lsdException w:name="Colorful Grid Accent 1" w:semiHidden="0" w:uiPriority="73" w:unhideWhenUsed="0"/>
+    <w:lsdException w:name="Light Shading Accent 2" w:semiHidden="0" w:uiPriority="60" w:unhideWhenUsed="0"/>
+    <w:lsdException w:name="Light List Accent 2" w:semiHidden="0" w:uiPriority="61" w:unhideWhenUsed="0"/>
+    <w:lsdException w:name="Light Grid Accent 2" w:semiHidden="0" w:uiPriority="62" w:unhideWhenUsed="0"/>
+    <w:lsdException w:name="Medium Shading 1 Accent 2" w:semiHidden="0" w:uiPriority="63" w:unhideWhenUsed="0"/>
+    <w:lsdException w:name="Medium Shading 2 Accent 2" w:semiHidden="0" w:uiPriority="64" w:unhideWhenUsed="0"/>
+    <w:lsdException w:name="Medium List 1 Accent 2" w:semiHidden="0" w:uiPriority="65" w:unhideWhenUsed="0"/>
+    <w:lsdException w:name="Medium List 2 Accent 2" w:semiHidden="0" w:uiPriority="66" w:unhideWhenUsed="0"/>
+    <w:lsdException w:name="Medium Grid 1 Accent 2" w:semiHidden="0" w:uiPriority="67" w:unhideWhenUsed="0"/>
+    <w:lsdException w:name="Medium Grid 2 Accent 2" w:semiHidden="0" w:uiPriority="68" w:unhideWhenUsed="0"/>
+    <w:lsdException w:name="Medium Grid 3 Accent 2" w:semiHidden="0" w:uiPriority="69" w:unhideWhenUsed="0"/>
+    <w:lsdException w:name="Dark List Accent 2" w:semiHidden="0" w:uiPriority="70" w:unhideWhenUsed="0"/>
+    <w:lsdException w:name="Colorful Shading Accent 2" w:semiHidden="0" w:uiPriority="71" w:unhideWhenUsed="0"/>
+    <w:lsdException w:name="Colorful List Accent 2" w:semiHidden="0" w:uiPriority="72" w:unhideWhenUsed="0"/>
+    <w:lsdException w:name="Colorful Grid Accent 2" w:semiHidden="0" w:uiPriority="73" w:unhideWhenUsed="0"/>
+    <w:lsdException w:name="Light Shading Accent 3" w:semiHidden="0" w:uiPriority="60" w:unhideWhenUsed="0"/>
+    <w:lsdException w:name="Light List Accent 3" w:semiHidden="0" w:uiPriority="61" w:unhideWhenUsed="0"/>
+    <w:lsdException w:name="Light Grid Accent 3" w:semiHidden="0" w:uiPriority="62" w:unhideWhenUsed="0"/>
+    <w:lsdException w:name="Medium Shading 1 Accent 3" w:semiHidden="0" w:uiPriority="63" w:unhideWhenUsed="0"/>
+    <w:lsdException w:name="Medium Shading 2 Accent 3" w:semiHidden="0" w:uiPriority="64" w:unhideWhenUsed="0"/>
+    <w:lsdException w:name="Medium List 1 Accent 3" w:semiHidden="0" w:uiPriority="65" w:unhideWhenUsed="0"/>
+    <w:lsdException w:name="Medium List 2 Accent 3" w:semiHidden="0" w:uiPriority="66" w:unhideWhenUsed="0"/>
+    <w:lsdException w:name="Medium Grid 1 Accent 3" w:semiHidden="0" w:uiPriority="67" w:unhideWhenUsed="0"/>
+    <w:lsdException w:name="Medium Grid 2 Accent 3" w:semiHidden="0" w:uiPriority="68" w:unhideWhenUsed="0"/>
+    <w:lsdException w:name="Medium Grid 3 Accent 3" w:semiHidden="0" w:uiPriority="69" w:unhideWhenUsed="0"/>
+    <w:lsdException w:name="Dark List Accent 3" w:semiHidden="0" w:uiPriority="70" w:unhideWhenUsed="0"/>
+    <w:lsdException w:name="Colorful Shading Accent 3" w:semiHidden="0" w:uiPriority="71" w:unhideWhenUsed="0"/>
+    <w:lsdException w:name="Colorful List Accent 3" w:semiHidden="0" w:uiPriority="72" w:unhideWhenUsed="0"/>
+    <w:lsdException w:name="Colorful Grid Accent 3" w:semiHidden="0" w:uiPriority="73" w:unhideWhenUsed="0"/>
+    <w:lsdException w:name="Light Shading Accent 4" w:semiHidden="0" w:uiPriority="60" w:unhideWhenUsed="0"/>
+    <w:lsdException w:name="Light List Accent 4" w:semiHidden="0" w:uiPriority="61" w:unhideWhenUsed="0"/>
+    <w:lsdException w:name="Light Grid Accent 4" w:semiHidden="0" w:uiPriority="62" w:unhideWhenUsed="0"/>
+    <w:lsdException w:name="Medium Shading 1 Accent 4" w:semiHidden="0" w:uiPriority="63" w:unhideWhenUsed="0"/>
+    <w:lsdException w:name="Medium Shading 2 Accent 4" w:semiHidden="0" w:uiPriority="64" w:unhideWhenUsed="0"/>
+    <w:lsdException w:name="Medium List 1 Accent 4" w:semiHidden="0" w:uiPriority="65" w:unhideWhenUsed="0"/>
+    <w:lsdException w:name="Medium List 2 Accent 4" w:semiHidden="0" w:uiPriority="66" w:unhideWhenUsed="0"/>
+    <w:lsdException w:name="Medium Grid 1 Accent 4" w:semiHidden="0" w:uiPriority="67" w:unhideWhenUsed="0"/>
+    <w:lsdException w:name="Medium Grid 2 Accent 4" w:semiHidden="0" w:uiPriority="68" w:unhideWhenUsed="0"/>
+    <w:lsdException w:name="Medium Grid 3 Accent 4" w:semiHidden="0" w:uiPriority="69" w:unhideWhenUsed="0"/>
+    <w:lsdException w:name="Dark List Accent 4" w:semiHidden="0" w:uiPriority="70" w:unhideWhenUsed="0"/>
+    <w:lsdException w:name="Colorful Shading Accent 4" w:semiHidden="0" w:uiPriority="71" w:unhideWhenUsed="0"/>
+    <w:lsdException w:name="Colorful List Accent 4" w:semiHidden="0" w:uiPriority="72" w:unhideWhenUsed="0"/>
+    <w:lsdException w:name="Colorful Grid Accent 4" w:semiHidden="0" w:uiPriority="73" w:unhideWhenUsed="0"/>
+    <w:lsdException w:name="Light Shading Accent 5" w:semiHidden="0" w:uiPriority="60" w:unhideWhenUsed="0"/>
+    <w:lsdException w:name="Light List Accent 5" w:semiHidden="0" w:uiPriority="61" w:unhideWhenUsed="0"/>
+    <w:lsdException w:name="Light Grid Accent 5" w:semiHidden="0" w:uiPriority="62" w:unhideWhenUsed="0"/>
+    <w:lsdException w:name="Medium Shading 1 Accent 5" w:semiHidden="0" w:uiPriority="63" w:unhideWhenUsed="0"/>
+    <w:lsdException w:name="Medium Shading 2 Accent 5" w:semiHidden="0" w:uiPriority="64" w:unhideWhenUsed="0"/>
+    <w:lsdException w:name="Medium List 1 Accent 5" w:semiHidden="0" w:uiPriority="65" w:unhideWhenUsed="0"/>
+    <w:lsdException w:name="Medium List 2 Accent 5" w:semiHidden="0" w:uiPriority="66" w:unhideWhenUsed="0"/>
+    <w:lsdException w:name="Medium Grid 1 Accent 5" w:semiHidden="0" w:uiPriority="67" w:unhideWhenUsed="0"/>
+    <w:lsdException w:name="Medium Grid 2 Accent 5" w:semiHidden="0" w:uiPriority="68" w:unhideWhenUsed="0"/>
+    <w:lsdException w:name="Medium Grid 3 Accent 5" w:semiHidden="0" w:uiPriority="69" w:unhideWhenUsed="0"/>
+    <w:lsdException w:name="Dark List Accent 5" w:semiHidden="0" w:uiPriority="70" w:unhideWhenUsed="0"/>
+    <w:lsdException w:name="Colorful Shading Accent 5" w:semiHidden="0" w:uiPriority="71" w:unhideWhenUsed="0"/>
+    <w:lsdException w:name="Colorful List Accent 5" w:semiHidden="0" w:uiPriority="72" w:unhideWhenUsed="0"/>
+    <w:lsdException w:name="Colorful Grid Accent 5" w:semiHidden="0" w:uiPriority="73" w:unhideWhenUsed="0"/>
+    <w:lsdException w:name="Light Shading Accent 6" w:semiHidden="0" w:uiPriority="60" w:unhideWhenUsed="0"/>
+    <w:lsdException w:name="Light List Accent 6" w:semiHidden="0" w:uiPriority="61" w:unhideWhenUsed="0"/>
+    <w:lsdException w:name="Light Grid Accent 6" w:semiHidden="0" w:uiPriority="62" w:unhideWhenUsed="0"/>
+    <w:lsdException w:name="Medium Shading 1 Accent 6" w:semiHidden="0" w:uiPriority="63" w:unhideWhenUsed="0"/>
+    <w:lsdException w:name="Medium Shading 2 Accent 6" w:semiHidden="0" w:uiPriority="64" w:unhideWhenUsed="0"/>
+    <w:lsdException w:name="Medium List 1 Accent 6" w:semiHidden="0" w:uiPriority="65" w:unhideWhenUsed="0"/>
+    <w:lsdException w:name="Medium List 2 Accent 6" w:semiHidden="0" w:uiPriority="66" w:unhideWhenUsed="0"/>
+    <w:lsdException w:name="Medium Grid 1 Accent 6" w:semiHidden="0" w:uiPriority="67" w:unhideWhenUsed="0"/>
+    <w:lsdException w:name="Medium Grid 2 Accent 6" w:semiHidden="0" w:uiPriority="68" w:unhideWhenUsed="0"/>
+    <w:lsdException w:name="Medium Grid 3 Accent 6" w:semiHidden="0" w:uiPriority="69" w:unhideWhenUsed="0"/>
+    <w:lsdException w:name="Dark List Accent 6" w:semiHidden="0" w:uiPriority="70" w:unhideWhenUsed="0"/>
+    <w:lsdException w:name="Colorful Shading Accent 6" w:semiHidden="0" w:uiPriority="71" w:unhideWhenUsed="0"/>
+    <w:lsdException w:name="Colorful List Accent 6" w:semiHidden="0" w:uiPriority="72" w:unhideWhenUsed="0"/>
+    <w:lsdException w:name="Colorful Grid Accent 6" w:semiHidden="0" w:uiPriority="73" w:unhideWhenUsed="0"/>
+    <w:lsdException w:name="Subtle Emphasis" w:semiHidden="0" w:uiPriority="19" w:unhideWhenUsed="0" w:qFormat="1"/>
+    <w:lsdException w:name="Intense Emphasis" w:semiHidden="0" w:uiPriority="21" w:unhideWhenUsed="0" w:qFormat="1"/>
+    <w:lsdException w:name="Subtle Reference" w:semiHidden="0" w:uiPriority="31" w:unhideWhenUsed="0" w:qFormat="1"/>
+    <w:lsdException w:name="Intense Reference" w:semiHidden="0" w:uiPriority="32" w:unhideWhenUsed="0" w:qFormat="1"/>
+    <w:lsdException w:name="Book Title" w:semiHidden="0" w:uiPriority="33" w:unhideWhenUsed="0" w:qFormat="1"/>
+    <w:lsdException w:name="Bibliography" w:uiPriority="37"/>
+    <w:lsdException w:name="TOC Heading" w:uiPriority="39" w:qFormat="1"/>
+  </w:latentStyles>
+  <w:style w:type="paragraph" w:default="1" w:styleId="Normal">
+    <w:name w:val="Normal"/>
+    <w:qFormat/>
+  </w:style>
+  <w:style w:type="paragraph" w:styleId="Heading1">
+    <w:name w:val="heading 1"/>
+    <w:basedOn w:val="Normal"/>
+    <w:next w:val="Normal"/>
+    <w:link w:val="Heading1Char"/>
+    <w:uiPriority w:val="9"/>
+    <w:qFormat/>
+    <w:rsid w:val="006B424D"/>
+    <w:pPr>
+      <w:keepNext/>
+      <w:keepLines/>
+      <w:spacing w:before="360" w:after="80"/>
+      <w:outlineLvl w:val="0"/>
+    </w:pPr>
+    <w:rPr>
+      <w:rFonts w:asciiTheme="majorHAnsi" w:eastAsiaTheme="majorEastAsia" w:hAnsiTheme="majorHAnsi" w:cstheme="majorBidi"/>
+      <w:color w:val="0F4761" w:themeColor="accent1" w:themeShade="BF"/>
+      <w:sz w:val="40"/>
+      <w:szCs w:val="40"/>
+    </w:rPr>
+  </w:style>
+  <w:style w:type="paragraph" w:styleId="Heading2">
+    <w:name w:val="heading 2"/>
+    <w:basedOn w:val="Normal"/>
+    <w:next w:val="Normal"/>
+    <w:link w:val="Heading2Char"/>
+    <w:uiPriority w:val="9"/>
+    <w:semiHidden/>
+    <w:unhideWhenUsed/>
+    <w:qFormat/>
+    <w:rsid w:val="006B424D"/>
+    <w:pPr>
+      <w:keepNext/>
+      <w:keepLines/>
+      <w:spacing w:before="160" w:after="80"/>
+      <w:outlineLvl w:val="1"/>
+    </w:pPr>
+    <w:rPr>
+      <w:rFonts w:asciiTheme="majorHAnsi" w:eastAsiaTheme="majorEastAsia" w:hAnsiTheme="majorHAnsi" w:cstheme="majorBidi"/>
+      <w:color w:val="0F4761" w:themeColor="accent1" w:themeShade="BF"/>
+      <w:sz w:val="32"/>
+      <w:szCs w:val="32"/>
+    </w:rPr>
+  </w:style>
+  <w:style w:type="paragraph" w:styleId="Heading3">
+    <w:name w:val="heading 3"/>
+    <w:basedOn w:val="Normal"/>
+    <w:next w:val="Normal"/>
+    <w:link w:val="Heading3Char"/>
+    <w:uiPriority w:val="9"/>
+    <w:semiHidden/>
+    <w:unhideWhenUsed/>
+    <w:qFormat/>
+    <w:rsid w:val="006B424D"/>
+    <w:pPr>
+      <w:keepNext/>
+      <w:keepLines/>
+      <w:spacing w:before="160" w:after="80"/>
+      <w:outlineLvl w:val="2"/>
+    </w:pPr>
+    <w:rPr>
+      <w:rFonts w:eastAsiaTheme="majorEastAsia" w:cstheme="majorBidi"/>
+      <w:color w:val="0F4761" w:themeColor="accent1" w:themeShade="BF"/>
+      <w:sz w:val="28"/>
+      <w:szCs w:val="28"/>
+    </w:rPr>
+  </w:style>
+  <w:style w:type="paragraph" w:styleId="Heading4">
+    <w:name w:val="heading 4"/>
+    <w:basedOn w:val="Normal"/>
+    <w:next w:val="Normal"/>
+    <w:link w:val="Heading4Char"/>
+    <w:uiPriority w:val="9"/>
+    <w:semiHidden/>
+    <w:unhideWhenUsed/>
+    <w:qFormat/>
+    <w:rsid w:val="006B424D"/>
+    <w:pPr>
+      <w:keepNext/>
+      <w:keepLines/>
+      <w:spacing w:before="80" w:after="40"/>
+      <w:outlineLvl w:val="3"/>
+    </w:pPr>
+    <w:rPr>
+      <w:rFonts w:eastAsiaTheme="majorEastAsia" w:cstheme="majorBidi"/>
+      <w:i/>
+      <w:iCs/>
+      <w:color w:val="0F4761" w:themeColor="accent1" w:themeShade="BF"/>
+    </w:rPr>
+  </w:style>
+  <w:style w:type="paragraph" w:styleId="Heading5">
+    <w:name w:val="heading 5"/>
+    <w:basedOn w:val="Normal"/>
+    <w:next w:val="Normal"/>
+    <w:link w:val="Heading5Char"/>
+    <w:uiPriority w:val="9"/>
+    <w:semiHidden/>
+    <w:unhideWhenUsed/>
+    <w:qFormat/>
+    <w:rsid w:val="006B424D"/>
+    <w:pPr>
+      <w:keepNext/>
+      <w:keepLines/>
+      <w:spacing w:before="80" w:after="40"/>
+      <w:outlineLvl w:val="4"/>
+    </w:pPr>
+    <w:rPr>
+      <w:rFonts w:eastAsiaTheme="majorEastAsia" w:cstheme="majorBidi"/>
+      <w:color w:val="0F4761" w:themeColor="accent1" w:themeShade="BF"/>
+    </w:rPr>
+  </w:style>
+  <w:style w:type="paragraph" w:styleId="Heading6">
+    <w:name w:val="heading 6"/>
+    <w:basedOn w:val="Normal"/>
+    <w:next w:val="Normal"/>
+    <w:link w:val="Heading6Char"/>
+    <w:uiPriority w:val="9"/>
+    <w:semiHidden/>
+    <w:unhideWhenUsed/>
+    <w:qFormat/>
+    <w:rsid w:val="006B424D"/>
+    <w:pPr>
+      <w:keepNext/>
+      <w:keepLines/>
+      <w:spacing w:before="40" w:after="0"/>
+      <w:outlineLvl w:val="5"/>
+    </w:pPr>
+    <w:rPr>
+      <w:rFonts w:eastAsiaTheme="majorEastAsia" w:cstheme="majorBidi"/>
+      <w:i/>
+      <w:iCs/>
+      <w:color w:val="595959" w:themeColor="text1" w:themeTint="A6"/>
+    </w:rPr>
+  </w:style>
+  <w:style w:type="paragraph" w:styleId="Heading7">
+    <w:name w:val="heading 7"/>
+    <w:basedOn w:val="Normal"/>
+    <w:next w:val="Normal"/>
+    <w:link w:val="Heading7Char"/>
+    <w:uiPriority w:val="9"/>
+    <w:semiHidden/>
+    <w:unhideWhenUsed/>
+    <w:qFormat/>
+    <w:rsid w:val="006B424D"/>
+    <w:pPr>
+      <w:keepNext/>
+      <w:keepLines/>
+      <w:spacing w:before="40" w:after="0"/>
+      <w:outlineLvl w:val="6"/>
+    </w:pPr>
+    <w:rPr>
+      <w:rFonts w:eastAsiaTheme="majorEastAsia" w:cstheme="majorBidi"/>
+      <w:color w:val="595959" w:themeColor="text1" w:themeTint="A6"/>
+    </w:rPr>
+  </w:style>
+  <w:style w:type="paragraph" w:styleId="Heading8">
+    <w:name w:val="heading 8"/>
+    <w:basedOn w:val="Normal"/>
+    <w:next w:val="Normal"/>
+    <w:link w:val="Heading8Char"/>
+    <w:uiPriority w:val="9"/>
+    <w:semiHidden/>
+    <w:unhideWhenUsed/>
+    <w:qFormat/>
+    <w:rsid w:val="006B424D"/>
+    <w:pPr>
+      <w:keepNext/>
+      <w:keepLines/>
+      <w:spacing w:after="0"/>
+      <w:outlineLvl w:val="7"/>
+    </w:pPr>
+    <w:rPr>
+      <w:rFonts w:eastAsiaTheme="majorEastAsia" w:cstheme="majorBidi"/>
+      <w:i/>
+      <w:iCs/>
+      <w:color w:val="272727" w:themeColor="text1" w:themeTint="D8"/>
+    </w:rPr>
+  </w:style>
+  <w:style w:type="paragraph" w:styleId="Heading9">
+    <w:name w:val="heading 9"/>
+    <w:basedOn w:val="Normal"/>
+    <w:next w:val="Normal"/>
+    <w:link w:val="Heading9Char"/>
+    <w:uiPriority w:val="9"/>
+    <w:semiHidden/>
+    <w:unhideWhenUsed/>
+    <w:qFormat/>
+    <w:rsid w:val="006B424D"/>
+    <w:pPr>
+      <w:keepNext/>
+      <w:keepLines/>
+      <w:spacing w:after="0"/>
+      <w:outlineLvl w:val="8"/>
+    </w:pPr>
+    <w:rPr>
+      <w:rFonts w:eastAsiaTheme="majorEastAsia" w:cstheme="majorBidi"/>
+      <w:color w:val="272727" w:themeColor="text1" w:themeTint="D8"/>
+    </w:rPr>
+  </w:style>
+  <w:style w:type="character" w:default="1" w:styleId="DefaultParagraphFont">
+    <w:name w:val="Default Paragraph Font"/>
+    <w:uiPriority w:val="1"/>
+    <w:semiHidden/>
+    <w:unhideWhenUsed/>
+  </w:style>
+  <w:style w:type="table" w:default="1" w:styleId="TableNormal">
+    <w:name w:val="Normal Table"/>
+    <w:uiPriority w:val="99"/>
+    <w:semiHidden/>
+    <w:unhideWhenUsed/>
+    <w:tblPr>
+      <w:tblInd w:w="0" w:type="dxa"/>
+      <w:tblCellMar>
+        <w:top w:w="0" w:type="dxa"/>
+        <w:left w:w="108" w:type="dxa"/>
+        <w:bottom w:w="0" w:type="dxa"/>
+        <w:right w:w="108" w:type="dxa"/>
+      </w:tblCellMar>
+    </w:tblPr>
+  </w:style>
+  <w:style w:type="numbering" w:default="1" w:styleId="NoList">
+    <w:name w:val="No List"/>
+    <w:uiPriority w:val="99"/>
+    <w:semiHidden/>
+    <w:unhideWhenUsed/>
+  </w:style>
+  <w:style w:type="character" w:customStyle="1" w:styleId="Heading1Char">
+    <w:name w:val="Heading 1 Char"/>
+    <w:basedOn w:val="DefaultParagraphFont"/>
+    <w:link w:val="Heading1"/>
+    <w:uiPriority w:val="9"/>
+    <w:rsid w:val="006B424D"/>
+    <w:rPr>
+      <w:rFonts w:asciiTheme="majorHAnsi" w:eastAsiaTheme="majorEastAsia" w:hAnsiTheme="majorHAnsi" w:cstheme="majorBidi"/>
+      <w:color w:val="0F4761" w:themeColor="accent1" w:themeShade="BF"/>
+      <w:sz w:val="40"/>
+      <w:szCs w:val="40"/>
+    </w:rPr>
+  </w:style>
+  <w:style w:type="character" w:customStyle="1" w:styleId="Heading2Char">
+    <w:name w:val="Heading 2 Char"/>
+    <w:basedOn w:val="DefaultParagraphFont"/>
+    <w:link w:val="Heading2"/>
+    <w:uiPriority w:val="9"/>
+    <w:semiHidden/>
+    <w:rsid w:val="006B424D"/>
+    <w:rPr>
+      <w:rFonts w:asciiTheme="majorHAnsi" w:eastAsiaTheme="majorEastAsia" w:hAnsiTheme="majorHAnsi" w:cstheme="majorBidi"/>
+      <w:color w:val="0F4761" w:themeColor="accent1" w:themeShade="BF"/>
+      <w:sz w:val="32"/>
+      <w:szCs w:val="32"/>
+    </w:rPr>
+  </w:style>
+  <w:style w:type="character" w:customStyle="1" w:styleId="Heading3Char">
+    <w:name w:val="Heading 3 Char"/>
+    <w:basedOn w:val="DefaultParagraphFont"/>
+    <w:link w:val="Heading3"/>
+    <w:uiPriority w:val="9"/>
+    <w:semiHidden/>
+    <w:rsid w:val="006B424D"/>
+    <w:rPr>
+      <w:rFonts w:eastAsiaTheme="majorEastAsia" w:cstheme="majorBidi"/>
+      <w:color w:val="0F4761" w:themeColor="accent1" w:themeShade="BF"/>
+      <w:sz w:val="28"/>
+      <w:szCs w:val="28"/>
+    </w:rPr>
+  </w:style>
+  <w:style w:type="character" w:customStyle="1" w:styleId="Heading4Char">
+    <w:name w:val="Heading 4 Char"/>
+    <w:basedOn w:val="DefaultParagraphFont"/>
+    <w:link w:val="Heading4"/>
+    <w:uiPriority w:val="9"/>
+    <w:semiHidden/>
+    <w:rsid w:val="006B424D"/>
+    <w:rPr>
+      <w:rFonts w:eastAsiaTheme="majorEastAsia" w:cstheme="majorBidi"/>
+      <w:i/>
+      <w:iCs/>
+      <w:color w:val="0F4761" w:themeColor="accent1" w:themeShade="BF"/>
+    </w:rPr>
+  </w:style>
+  <w:style w:type="character" w:customStyle="1" w:styleId="Heading5Char">
+    <w:name w:val="Heading 5 Char"/>
+    <w:basedOn w:val="DefaultParagraphFont"/>
+    <w:link w:val="Heading5"/>
+    <w:uiPriority w:val="9"/>
+    <w:semiHidden/>
+    <w:rsid w:val="006B424D"/>
+    <w:rPr>
+      <w:rFonts w:eastAsiaTheme="majorEastAsia" w:cstheme="majorBidi"/>
+      <w:color w:val="0F4761" w:themeColor="accent1" w:themeShade="BF"/>
+    </w:rPr>
+  </w:style>
+  <w:style w:type="character" w:customStyle="1" w:styleId="Heading6Char">
+    <w:name w:val="Heading 6 Char"/>
+    <w:basedOn w:val="DefaultParagraphFont"/>
+    <w:link w:val="Heading6"/>
+    <w:uiPriority w:val="9"/>
+    <w:semiHidden/>
+    <w:rsid w:val="006B424D"/>
+    <w:rPr>
+      <w:rFonts w:eastAsiaTheme="majorEastAsia" w:cstheme="majorBidi"/>
+      <w:i/>
+      <w:iCs/>
+      <w:color w:val="595959" w:themeColor="text1" w:themeTint="A6"/>
+    </w:rPr>
+  </w:style>
+  <w:style w:type="character" w:customStyle="1" w:styleId="Heading7Char">
+    <w:name w:val="Heading 7 Char"/>
+    <w:basedOn w:val="DefaultParagraphFont"/>
+    <w:link w:val="Heading7"/>
+    <w:uiPriority w:val="9"/>
+    <w:semiHidden/>
+    <w:rsid w:val="006B424D"/>
+    <w:rPr>
+      <w:rFonts w:eastAsiaTheme="majorEastAsia" w:cstheme="majorBidi"/>
+      <w:color w:val="595959" w:themeColor="text1" w:themeTint="A6"/>
+    </w:rPr>
+  </w:style>
+  <w:style w:type="character" w:customStyle="1" w:styleId="Heading8Char">
+    <w:name w:val="Heading 8 Char"/>
+    <w:basedOn w:val="DefaultParagraphFont"/>
+    <w:link w:val="Heading8"/>
+    <w:uiPriority w:val="9"/>
+    <w:semiHidden/>
+    <w:rsid w:val="006B424D"/>
+    <w:rPr>
+      <w:rFonts w:eastAsiaTheme="majorEastAsia" w:cstheme="majorBidi"/>
+      <w:i/>
+      <w:iCs/>
+      <w:color w:val="272727" w:themeColor="text1" w:themeTint="D8"/>
+    </w:rPr>
+  </w:style>
+  <w:style w:type="character" w:customStyle="1" w:styleId="Heading9Char">
+    <w:name w:val="Heading 9 Char"/>
+    <w:basedOn w:val="DefaultParagraphFont"/>
+    <w:link w:val="Heading9"/>
+    <w:uiPriority w:val="9"/>
+    <w:semiHidden/>
+    <w:rsid w:val="006B424D"/>
+    <w:rPr>
+      <w:rFonts w:eastAsiaTheme="majorEastAsia" w:cstheme="majorBidi"/>
+      <w:color w:val="272727" w:themeColor="text1" w:themeTint="D8"/>
+    </w:rPr>
+  </w:style>
+  <w:style w:type="paragraph" w:styleId="Title">
+    <w:name w:val="Title"/>
+    <w:basedOn w:val="Normal"/>
+    <w:next w:val="Normal"/>
+    <w:link w:val="TitleChar"/>
+    <w:uiPriority w:val="10"/>
+    <w:qFormat/>
+    <w:rsid w:val="006B424D"/>
+    <w:pPr>
+      <w:spacing w:after="80" w:line="240" w:lineRule="auto"/>
+      <w:contextualSpacing/>
+    </w:pPr>
+    <w:rPr>
+      <w:rFonts w:asciiTheme="majorHAnsi" w:eastAsiaTheme="majorEastAsia" w:hAnsiTheme="majorHAnsi" w:cstheme="majorBidi"/>
+      <w:spacing w:val="-10"/>
+      <w:kern w:val="28"/>
+      <w:sz w:val="56"/>
+      <w:szCs w:val="56"/>
+    </w:rPr>
+  </w:style>
+  <w:style w:type="character" w:customStyle="1" w:styleId="TitleChar">
+    <w:name w:val="Title Char"/>
+    <w:basedOn w:val="DefaultParagraphFont"/>
+    <w:link w:val="Title"/>
+    <w:uiPriority w:val="10"/>
+    <w:rsid w:val="006B424D"/>
+    <w:rPr>
+      <w:rFonts w:asciiTheme="majorHAnsi" w:eastAsiaTheme="majorEastAsia" w:hAnsiTheme="majorHAnsi" w:cstheme="majorBidi"/>
+      <w:spacing w:val="-10"/>
+      <w:kern w:val="28"/>
+      <w:sz w:val="56"/>
+      <w:szCs w:val="56"/>
+    </w:rPr>
+  </w:style>
+  <w:style w:type="paragraph" w:styleId="Subtitle">
+    <w:name w:val="Subtitle"/>
+    <w:basedOn w:val="Normal"/>
+    <w:next w:val="Normal"/>
+    <w:link w:val="SubtitleChar"/>
+    <w:uiPriority w:val="11"/>
+    <w:qFormat/>
+    <w:rsid w:val="006B424D"/>
+    <w:pPr>
+      <w:numPr>
+        <w:ilvl w:val="1"/>
+      </w:numPr>
+    </w:pPr>
+    <w:rPr>
+      <w:rFonts w:eastAsiaTheme="majorEastAsia" w:cstheme="majorBidi"/>
+      <w:color w:val="595959" w:themeColor="text1" w:themeTint="A6"/>
+      <w:spacing w:val="15"/>
+      <w:sz w:val="28"/>
+      <w:szCs w:val="28"/>
+    </w:rPr>
+  </w:style>
+  <w:style w:type="character" w:customStyle="1" w:styleId="SubtitleChar">
+    <w:name w:val="Subtitle Char"/>
+    <w:basedOn w:val="DefaultParagraphFont"/>
+    <w:link w:val="Subtitle"/>
+    <w:uiPriority w:val="11"/>
+    <w:rsid w:val="006B424D"/>
+    <w:rPr>
+      <w:rFonts w:eastAsiaTheme="majorEastAsia" w:cstheme="majorBidi"/>
+      <w:color w:val="595959" w:themeColor="text1" w:themeTint="A6"/>
+      <w:spacing w:val="15"/>
+      <w:sz w:val="28"/>
+      <w:szCs w:val="28"/>
+    </w:rPr>
+  </w:style>
+  <w:style w:type="paragraph" w:styleId="Quote">
+    <w:name w:val="Quote"/>
+    <w:basedOn w:val="Normal"/>
+    <w:next w:val="Normal"/>
+    <w:link w:val="QuoteChar"/>
+    <w:uiPriority w:val="29"/>
+    <w:qFormat/>
+    <w:rsid w:val="006B424D"/>
+    <w:pPr>
+      <w:spacing w:before="160"/>
+      <w:jc w:val="center"/>
+    </w:pPr>
+    <w:rPr>
+      <w:i/>
+      <w:iCs/>
+      <w:color w:val="404040" w:themeColor="text1" w:themeTint="BF"/>
+    </w:rPr>
+  </w:style>
+  <w:style w:type="character" w:customStyle="1" w:styleId="QuoteChar">
+    <w:name w:val="Quote Char"/>
+    <w:basedOn w:val="DefaultParagraphFont"/>
+    <w:link w:val="Quote"/>
+    <w:uiPriority w:val="29"/>
+    <w:rsid w:val="006B424D"/>
+    <w:rPr>
+      <w:i/>
+      <w:iCs/>
+      <w:color w:val="404040" w:themeColor="text1" w:themeTint="BF"/>
+    </w:rPr>
+  </w:style>
+  <w:style w:type="paragraph" w:styleId="ListParagraph">
+    <w:name w:val="List Paragraph"/>
+    <w:basedOn w:val="Normal"/>
+    <w:uiPriority w:val="34"/>
+    <w:qFormat/>
+    <w:rsid w:val="006B424D"/>
+    <w:pPr>
+      <w:ind w:left="720"/>
+      <w:contextualSpacing/>
+    </w:pPr>
+  </w:style>
+  <w:style w:type="character" w:styleId="IntenseEmphasis">
+    <w:name w:val="Intense Emphasis"/>
+    <w:basedOn w:val="DefaultParagraphFont"/>
+    <w:uiPriority w:val="21"/>
+    <w:qFormat/>
+    <w:rsid w:val="006B424D"/>
+    <w:rPr>
+      <w:i/>
+      <w:iCs/>
+      <w:color w:val="0F4761" w:themeColor="accent1" w:themeShade="BF"/>
+    </w:rPr>
+  </w:style>
+  <w:style w:type="paragraph" w:styleId="IntenseQuote">
+    <w:name w:val="Intense Quote"/>
+    <w:basedOn w:val="Normal"/>
+    <w:next w:val="Normal"/>
+    <w:link w:val="IntenseQuoteChar"/>
+    <w:uiPriority w:val="30"/>
+    <w:qFormat/>
+    <w:rsid w:val="006B424D"/>
+    <w:pPr>
+      <w:pBdr>
+        <w:top w:val="single" w:sz="4" w:space="10" w:color="0F4761" w:themeColor="accent1" w:themeShade="BF"/>
+        <w:bottom w:val="single" w:sz="4" w:space="10" w:color="0F4761" w:themeColor="accent1" w:themeShade="BF"/>
+      </w:pBdr>
+      <w:spacing w:before="360" w:after="360"/>
+      <w:ind w:left="864" w:right="864"/>
+      <w:jc w:val="center"/>
+    </w:pPr>
+    <w:rPr>
+      <w:i/>
+      <w:iCs/>
+      <w:color w:val="0F4761" w:themeColor="accent1" w:themeShade="BF"/>
+    </w:rPr>
+  </w:style>
+  <w:style w:type="character" w:customStyle="1" w:styleId="IntenseQuoteChar">
+    <w:name w:val="Intense Quote Char"/>
+    <w:basedOn w:val="DefaultParagraphFont"/>
+    <w:link w:val="IntenseQuote"/>
+    <w:uiPriority w:val="30"/>
+    <w:rsid w:val="006B424D"/>
+    <w:rPr>
+      <w:i/>
+      <w:iCs/>
+      <w:color w:val="0F4761" w:themeColor="accent1" w:themeShade="BF"/>
+    </w:rPr>
+  </w:style>
+  <w:style w:type="character" w:styleId="IntenseReference">
+    <w:name w:val="Intense Reference"/>
+    <w:basedOn w:val="DefaultParagraphFont"/>
+    <w:uiPriority w:val="32"/>
+    <w:qFormat/>
+    <w:rsid w:val="006B424D"/>
+    <w:rPr>
+      <w:b/>
+      <w:bCs/>
+      <w:smallCaps/>
+      <w:color w:val="0F4761" w:themeColor="accent1" w:themeShade="BF"/>
+      <w:spacing w:val="5"/>
+    </w:rPr>
+  </w:style>
+  <w:style w:type="paragraph" w:styleId="Header">
+    <w:name w:val="header"/>
+    <w:basedOn w:val="Normal"/>
+    <w:link w:val="HeaderChar"/>
+    <w:uiPriority w:val="99"/>
+    <w:unhideWhenUsed/>
+    <w:rsid w:val="00AC1C0D"/>
+    <w:pPr>
+      <w:tabs>
+        <w:tab w:val="center" w:pos="4513"/>
+        <w:tab w:val="right" w:pos="9026"/>
+      </w:tabs>
+      <w:spacing w:after="0" w:line="240" w:lineRule="auto"/>
+    </w:pPr>
+  </w:style>
+  <w:style w:type="character" w:customStyle="1" w:styleId="HeaderChar">
+    <w:name w:val="Header Char"/>
+    <w:basedOn w:val="DefaultParagraphFont"/>
+    <w:link w:val="Header"/>
+    <w:uiPriority w:val="99"/>
+    <w:rsid w:val="00AC1C0D"/>
+  </w:style>
+  <w:style w:type="paragraph" w:styleId="Footer">
+    <w:name w:val="footer"/>
+    <w:basedOn w:val="Normal"/>
+    <w:link w:val="FooterChar"/>
+    <w:uiPriority w:val="99"/>
+    <w:unhideWhenUsed/>
+    <w:rsid w:val="00AC1C0D"/>
+    <w:pPr>
+      <w:tabs>
+        <w:tab w:val="center" w:pos="4513"/>
+        <w:tab w:val="right" w:pos="9026"/>
+      </w:tabs>
+      <w:spacing w:after="0" w:line="240" w:lineRule="auto"/>
+    </w:pPr>
+  </w:style>
+  <w:style w:type="character" w:customStyle="1" w:styleId="FooterChar">
+    <w:name w:val="Footer Char"/>
+    <w:basedOn w:val="DefaultParagraphFont"/>
+    <w:link w:val="Footer"/>
+    <w:uiPriority w:val="99"/>
+    <w:rsid w:val="00AC1C0D"/>
+  </w:style>
+  <w:style w:type="character" w:styleId="Hyperlink">
+    <w:name w:val="Hyperlink"/>
+    <w:basedOn w:val="DefaultParagraphFont"/>
+    <w:uiPriority w:val="99"/>
+    <w:unhideWhenUsed/>
+    <w:rsid w:val="00AC1C0D"/>
+    <w:rPr>
+      <w:color w:val="467886" w:themeColor="hyperlink"/>
+      <w:u w:val="single"/>
+    </w:rPr>
+  </w:style>
+  <w:style w:type="character" w:customStyle="1" w:styleId="UnresolvedMention">
+    <w:name w:val="Unresolved Mention"/>
+    <w:basedOn w:val="DefaultParagraphFont"/>
+    <w:uiPriority w:val="99"/>
+    <w:semiHidden/>
+    <w:unhideWhenUsed/>
+    <w:rsid w:val="00AC1C0D"/>
+    <w:rPr>
+      <w:color w:val="605E5C"/>
+      <w:shd w:val="clear" w:color="auto" w:fill="E1DFDD"/>
+    </w:rPr>
+  </w:style>
+  <w:style w:type="table" w:styleId="TableGrid">
+    <w:name w:val="Table Grid"/>
+    <w:basedOn w:val="TableNormal"/>
+    <w:uiPriority w:val="39"/>
+    <w:rsid w:val="00AC1C0D"/>
+    <w:pPr>
+      <w:spacing w:after="0" w:line="240" w:lineRule="auto"/>
+    </w:pPr>
+    <w:tblPr>
+      <w:tblBorders>
+        <w:top w:val="single" w:sz="4" w:space="0" w:color="auto"/>
+        <w:left w:val="single" w:sz="4" w:space="0" w:color="auto"/>
+        <w:bottom w:val="single" w:sz="4" w:space="0" w:color="auto"/>
+        <w:right w:val="single" w:sz="4" w:space="0" w:color="auto"/>
+        <w:insideH w:val="single" w:sz="4" w:space="0" w:color="auto"/>
+        <w:insideV w:val="single" w:sz="4" w:space="0" w:color="auto"/>
+      </w:tblBorders>
+    </w:tblPr>
+  </w:style>
+  <w:style w:type="paragraph" w:styleId="BalloonText">
+    <w:name w:val="Balloon Text"/>
+    <w:basedOn w:val="Normal"/>
+    <w:link w:val="BalloonTextChar"/>
+    <w:uiPriority w:val="99"/>
+    <w:semiHidden/>
+    <w:unhideWhenUsed/>
+    <w:rsid w:val="00665955"/>
+    <w:pPr>
+      <w:spacing w:after="0" w:line="240" w:lineRule="auto"/>
+    </w:pPr>
+    <w:rPr>
+      <w:rFonts w:ascii="Tahoma" w:hAnsi="Tahoma" w:cs="Tahoma"/>
+      <w:sz w:val="16"/>
+      <w:szCs w:val="16"/>
+    </w:rPr>
+  </w:style>
+  <w:style w:type="character" w:customStyle="1" w:styleId="BalloonTextChar">
+    <w:name w:val="Balloon Text Char"/>
+    <w:basedOn w:val="DefaultParagraphFont"/>
+    <w:link w:val="BalloonText"/>
+    <w:uiPriority w:val="99"/>
+    <w:semiHidden/>
+    <w:rsid w:val="00665955"/>
+    <w:rPr>
+      <w:rFonts w:ascii="Tahoma" w:hAnsi="Tahoma" w:cs="Tahoma"/>
+      <w:sz w:val="16"/>
+      <w:szCs w:val="16"/>
+    </w:rPr>
+  </w:style>
+  <w:style w:type="table" w:styleId="MediumShading1-Accent4">
+    <w:name w:val="Medium Shading 1 Accent 4"/>
+    <w:basedOn w:val="TableNormal"/>
+    <w:uiPriority w:val="63"/>
+    <w:rsid w:val="00665955"/>
+    <w:pPr>
+      <w:spacing w:after="0" w:line="240" w:lineRule="auto"/>
+    </w:pPr>
+    <w:tblPr>
+      <w:tblStyleRowBandSize w:val="1"/>
+      <w:tblStyleColBandSize w:val="1"/>
+      <w:tblBorders>
+        <w:top w:val="single" w:sz="8" w:space="0" w:color="39BEF1" w:themeColor="accent4" w:themeTint="BF"/>
+        <w:left w:val="single" w:sz="8" w:space="0" w:color="39BEF1" w:themeColor="accent4" w:themeTint="BF"/>
+        <w:bottom w:val="single" w:sz="8" w:space="0" w:color="39BEF1" w:themeColor="accent4" w:themeTint="BF"/>
+        <w:right w:val="single" w:sz="8" w:space="0" w:color="39BEF1" w:themeColor="accent4" w:themeTint="BF"/>
+        <w:insideH w:val="single" w:sz="8" w:space="0" w:color="39BEF1" w:themeColor="accent4" w:themeTint="BF"/>
+      </w:tblBorders>
+    </w:tblPr>
+    <w:tblStylePr w:type="firstRow">
+      <w:pPr>
+        <w:spacing w:before="0" w:after="0" w:line="240" w:lineRule="auto"/>
+      </w:pPr>
+      <w:rPr>
+        <w:b/>
+        <w:bCs/>
+        <w:color w:val="FFFFFF" w:themeColor="background1"/>
+      </w:rPr>
+      <w:tblPr/>
+      <w:tcPr>
+        <w:tcBorders>
+          <w:top w:val="single" w:sz="8" w:space="0" w:color="39BEF1" w:themeColor="accent4" w:themeTint="BF"/>
+          <w:left w:val="single" w:sz="8" w:space="0" w:color="39BEF1" w:themeColor="accent4" w:themeTint="BF"/>
+          <w:bottom w:val="single" w:sz="8" w:space="0" w:color="39BEF1" w:themeColor="accent4" w:themeTint="BF"/>
+          <w:right w:val="single" w:sz="8" w:space="0" w:color="39BEF1" w:themeColor="accent4" w:themeTint="BF"/>
+          <w:insideH w:val="nil"/>
+          <w:insideV w:val="nil"/>
+        </w:tcBorders>
+        <w:shd w:val="clear" w:color="auto" w:fill="0F9ED5" w:themeFill="accent4"/>
+      </w:tcPr>
+    </w:tblStylePr>
+    <w:tblStylePr w:type="lastRow">
+      <w:pPr>
+        <w:spacing w:before="0" w:after="0" w:line="240" w:lineRule="auto"/>
+      </w:pPr>
+      <w:rPr>
+        <w:b/>
+        <w:bCs/>
+      </w:rPr>
+      <w:tblPr/>
+      <w:tcPr>
+        <w:tcBorders>
+          <w:top w:val="double" w:sz="6" w:space="0" w:color="39BEF1" w:themeColor="accent4" w:themeTint="BF"/>
+          <w:left w:val="single" w:sz="8" w:space="0" w:color="39BEF1" w:themeColor="accent4" w:themeTint="BF"/>
+          <w:bottom w:val="single" w:sz="8" w:space="0" w:color="39BEF1" w:themeColor="accent4" w:themeTint="BF"/>
+          <w:right w:val="single" w:sz="8" w:space="0" w:color="39BEF1" w:themeColor="accent4" w:themeTint="BF"/>
+          <w:insideH w:val="nil"/>
+          <w:insideV w:val="nil"/>
+        </w:tcBorders>
+      </w:tcPr>
+    </w:tblStylePr>
+    <w:tblStylePr w:type="firstCol">
+      <w:rPr>
+        <w:b/>
+        <w:bCs/>
+      </w:rPr>
+    </w:tblStylePr>
+    <w:tblStylePr w:type="lastCol">
+      <w:rPr>
+        <w:b/>
+        <w:bCs/>
+      </w:rPr>
+    </w:tblStylePr>
+    <w:tblStylePr w:type="band1Vert">
+      <w:tblPr/>
+      <w:tcPr>
+        <w:shd w:val="clear" w:color="auto" w:fill="BDE9FA" w:themeFill="accent4" w:themeFillTint="3F"/>
+      </w:tcPr>
+    </w:tblStylePr>
+    <w:tblStylePr w:type="band1Horz">
+      <w:tblPr/>
+      <w:tcPr>
+        <w:tcBorders>
+          <w:insideH w:val="nil"/>
+          <w:insideV w:val="nil"/>
+        </w:tcBorders>
+        <w:shd w:val="clear" w:color="auto" w:fill="BDE9FA" w:themeFill="accent4" w:themeFillTint="3F"/>
+      </w:tcPr>
+    </w:tblStylePr>
+    <w:tblStylePr w:type="band2Horz">
+      <w:tblPr/>
+      <w:tcPr>
+        <w:tcBorders>
+          <w:insideH w:val="nil"/>
+          <w:insideV w:val="nil"/>
+        </w:tcBorders>
+      </w:tcPr>
+    </w:tblStylePr>
   </w:style>
 </w:styles>
 </file>
@@ -3922,7 +4687,7 @@
   <a:extraClrSchemeLst/>
   <a:extLst>
     <a:ext uri="{05A4C25C-085E-4340-85A3-A5531E510DB2}">
-      <thm15:themeFamily xmlns:thm15="http://schemas.microsoft.com/office/thememl/2012/main" name="Office Theme" id="{2E142A2C-CD16-42D6-873A-C26D2A0506FA}" vid="{1BDDFF52-6CD6-40A5-AB3C-68EB2F1E4D0A}"/>
+      <thm15:themeFamily xmlns="" xmlns:thm15="http://schemas.microsoft.com/office/thememl/2012/main" name="Office Theme" id="{2E142A2C-CD16-42D6-873A-C26D2A0506FA}" vid="{1BDDFF52-6CD6-40A5-AB3C-68EB2F1E4D0A}"/>
     </a:ext>
   </a:extLst>
 </a:theme>

</xml_diff>

<commit_message>
Spremenil slog za 2. tabelo, da bo isti kot pri 1.
</commit_message>
<xml_diff>
--- a/Fšfebr2026_odrasli.docx
+++ b/Fšfebr2026_odrasli.docx
@@ -121,6 +121,9 @@
               <w:jc w:val="center"/>
             </w:pPr>
             <w:r>
+              <w:rPr>
+                <w:b/>
+              </w:rPr>
               <w:t>Test</w:t>
             </w:r>
           </w:p>
@@ -135,6 +138,9 @@
               <w:jc w:val="center"/>
             </w:pPr>
             <w:r>
+              <w:rPr>
+                <w:b/>
+              </w:rPr>
               <w:t>ZmigajSdv</w:t>
             </w:r>
           </w:p>
@@ -149,6 +155,9 @@
               <w:jc w:val="center"/>
             </w:pPr>
             <w:r>
+              <w:rPr>
+                <w:b/>
+              </w:rPr>
               <w:t>Osrednjeslovenska</w:t>
             </w:r>
           </w:p>
@@ -163,6 +172,9 @@
               <w:jc w:val="center"/>
             </w:pPr>
             <w:r>
+              <w:rPr>
+                <w:b/>
+              </w:rPr>
               <w:t>Slovenija</w:t>
             </w:r>
           </w:p>

</xml_diff>

<commit_message>
Nastavil slog za 2. tabelo, slike grafov se zdaj ne shranjujejo na disk.
</commit_message>
<xml_diff>
--- a/Fšfebr2026_odrasli.docx
+++ b/Fšfebr2026_odrasli.docx
@@ -121,9 +121,6 @@
               <w:jc w:val="center"/>
             </w:pPr>
             <w:r>
-              <w:rPr>
-                <w:b/>
-              </w:rPr>
               <w:t>Test</w:t>
             </w:r>
           </w:p>
@@ -138,9 +135,6 @@
               <w:jc w:val="center"/>
             </w:pPr>
             <w:r>
-              <w:rPr>
-                <w:b/>
-              </w:rPr>
               <w:t>ZmigajSdv</w:t>
             </w:r>
           </w:p>
@@ -155,9 +149,6 @@
               <w:jc w:val="center"/>
             </w:pPr>
             <w:r>
-              <w:rPr>
-                <w:b/>
-              </w:rPr>
               <w:t>Osrednjeslovenska</w:t>
             </w:r>
           </w:p>
@@ -172,9 +163,6 @@
               <w:jc w:val="center"/>
             </w:pPr>
             <w:r>
-              <w:rPr>
-                <w:b/>
-              </w:rPr>
               <w:t>Slovenija</w:t>
             </w:r>
           </w:p>
@@ -940,7 +928,7 @@
       <w:r>
         <w:drawing>
           <wp:inline xmlns:a="http://schemas.openxmlformats.org/drawingml/2006/main" xmlns:pic="http://schemas.openxmlformats.org/drawingml/2006/picture">
-            <wp:extent cx="5486400" cy="3429000"/>
+            <wp:extent cx="5486400" cy="3389067"/>
             <wp:docPr id="1" name="Picture 1"/>
             <wp:cNvGraphicFramePr>
               <a:graphicFrameLocks noChangeAspect="1"/>
@@ -949,7 +937,7 @@
               <a:graphicData uri="http://schemas.openxmlformats.org/drawingml/2006/picture">
                 <pic:pic>
                   <pic:nvPicPr>
-                    <pic:cNvPr id="0" name="graf.png"/>
+                    <pic:cNvPr id="0" name="image.png"/>
                     <pic:cNvPicPr/>
                   </pic:nvPicPr>
                   <pic:blipFill>
@@ -961,7 +949,7 @@
                   <pic:spPr>
                     <a:xfrm>
                       <a:off x="0" y="0"/>
-                      <a:ext cx="5486400" cy="3429000"/>
+                      <a:ext cx="5486400" cy="3389067"/>
                     </a:xfrm>
                     <a:prstGeom prst="rect"/>
                   </pic:spPr>
@@ -2200,7 +2188,7 @@
       <w:r>
         <w:drawing>
           <wp:inline xmlns:a="http://schemas.openxmlformats.org/drawingml/2006/main" xmlns:pic="http://schemas.openxmlformats.org/drawingml/2006/picture">
-            <wp:extent cx="5486400" cy="2743200"/>
+            <wp:extent cx="5486400" cy="2717821"/>
             <wp:docPr id="2" name="Picture 2"/>
             <wp:cNvGraphicFramePr>
               <a:graphicFrameLocks noChangeAspect="1"/>
@@ -2209,7 +2197,7 @@
               <a:graphicData uri="http://schemas.openxmlformats.org/drawingml/2006/picture">
                 <pic:pic>
                   <pic:nvPicPr>
-                    <pic:cNvPr id="0" name="graf_cone.png"/>
+                    <pic:cNvPr id="0" name="image.png"/>
                     <pic:cNvPicPr/>
                   </pic:nvPicPr>
                   <pic:blipFill>
@@ -2221,7 +2209,7 @@
                   <pic:spPr>
                     <a:xfrm>
                       <a:off x="0" y="0"/>
-                      <a:ext cx="5486400" cy="2743200"/>
+                      <a:ext cx="5486400" cy="2717821"/>
                     </a:xfrm>
                     <a:prstGeom prst="rect"/>
                   </pic:spPr>

</xml_diff>